<commit_message>
added full part 1 screenshots, explanations, and answers to the doc
</commit_message>
<xml_diff>
--- a/Lab3/Lab3_LimY.docx
+++ b/Lab3/Lab3_LimY.docx
@@ -258,14 +258,6 @@
       <w:pPr>
         <w:spacing w:after="0" w:line="240" w:lineRule="auto"/>
         <w:ind w:left="720"/>
-        <w:rPr>
-          <w:rFonts w:ascii="Helvetica" w:eastAsia="DengXian Light" w:hAnsi="Helvetica" w:cs="Times New Roman"/>
-          <w:bCs/>
-          <w:kern w:val="0"/>
-          <w:sz w:val="22"/>
-          <w:szCs w:val="22"/>
-          <w14:ligatures w14:val="none"/>
-        </w:rPr>
       </w:pPr>
       <w:r>
         <w:rPr>
@@ -293,31 +285,18 @@
         <w:r>
           <w:rPr>
             <w:rStyle w:val="Hyperlink"/>
-            <w:rFonts w:ascii="Helvetica" w:eastAsia="DengXian Light" w:hAnsi="Helvetica" w:cs="Times New Roman"/>
-            <w:bCs/>
-            <w:kern w:val="0"/>
-            <w:sz w:val="22"/>
-            <w:szCs w:val="22"/>
-            <w14:ligatures w14:val="none"/>
           </w:rPr>
-          <w:t>https://github.com/MorakatLim/intro_genai/tree/master</w:t>
+          <w:t>https://github.com/MorakatLim/intro_genai/tree/master/Lab3</w:t>
         </w:r>
       </w:hyperlink>
       <w:r>
-        <w:rPr>
-          <w:rFonts w:ascii="Helvetica" w:eastAsia="DengXian Light" w:hAnsi="Helvetica" w:cs="Times New Roman"/>
-          <w:bCs/>
-          <w:kern w:val="0"/>
-          <w:sz w:val="22"/>
-          <w:szCs w:val="22"/>
-          <w14:ligatures w14:val="none"/>
-        </w:rPr>
         <w:t xml:space="preserve"> </w:t>
       </w:r>
     </w:p>
     <w:p>
       <w:pPr>
         <w:spacing w:after="0" w:line="240" w:lineRule="auto"/>
+        <w:ind w:left="720"/>
         <w:rPr>
           <w:rFonts w:ascii="Helvetica" w:eastAsia="DengXian Light" w:hAnsi="Helvetica" w:cs="Times New Roman"/>
           <w:b/>
@@ -424,42 +403,11 @@
           <w14:ligatures w14:val="none"/>
         </w:rPr>
       </w:pPr>
-      <w:r>
-        <w:rPr>
-          <w:rFonts w:ascii="Helvetica" w:eastAsia="Calibri" w:hAnsi="Helvetica" w:cs="Times New Roman"/>
-          <w:kern w:val="0"/>
-          <w:sz w:val="22"/>
-          <w:szCs w:val="22"/>
-          <w14:ligatures w14:val="none"/>
-        </w:rPr>
-        <w:t xml:space="preserve">The objective of this lab was to explore advanced model training and evaluation methods in two phases. Part 1 focuses on </w:t>
-      </w:r>
-      <w:proofErr w:type="spellStart"/>
-      <w:r>
-        <w:rPr>
-          <w:rFonts w:ascii="Helvetica" w:eastAsia="Calibri" w:hAnsi="Helvetica" w:cs="Times New Roman"/>
-          <w:kern w:val="0"/>
-          <w:sz w:val="22"/>
-          <w:szCs w:val="22"/>
-          <w14:ligatures w14:val="none"/>
-        </w:rPr>
-        <w:t>LoRA</w:t>
-      </w:r>
-      <w:proofErr w:type="spellEnd"/>
-      <w:r>
-        <w:rPr>
-          <w:rFonts w:ascii="Helvetica" w:eastAsia="Calibri" w:hAnsi="Helvetica" w:cs="Times New Roman"/>
-          <w:kern w:val="0"/>
-          <w:sz w:val="22"/>
-          <w:szCs w:val="22"/>
-          <w14:ligatures w14:val="none"/>
-        </w:rPr>
-        <w:t xml:space="preserve"> to fine-tune a pretrained model, followed by a quantitative analysis of its performance. Part 2 focuses on experimenting with Reinforcement Learning from Human Feedback (RLHF) utilizing the Proximal Policy Optimization (PPO) algorithm.</w:t>
-      </w:r>
-    </w:p>
-    <w:p>
-      <w:pPr>
-        <w:spacing w:after="0" w:line="240" w:lineRule="auto"/>
+    </w:p>
+    <w:p>
+      <w:pPr>
+        <w:spacing w:after="0" w:line="240" w:lineRule="auto"/>
+        <w:ind w:firstLine="720"/>
         <w:jc w:val="both"/>
         <w:rPr>
           <w:rFonts w:ascii="Helvetica" w:eastAsia="Calibri" w:hAnsi="Helvetica" w:cs="Times New Roman"/>
@@ -538,152 +486,6 @@
           <w14:ligatures w14:val="none"/>
         </w:rPr>
       </w:pPr>
-      <w:r>
-        <w:rPr>
-          <w:rFonts w:ascii="Helvetica" w:eastAsia="Calibri" w:hAnsi="Helvetica" w:cs="Times New Roman"/>
-          <w:kern w:val="0"/>
-          <w:sz w:val="22"/>
-          <w:szCs w:val="22"/>
-          <w14:ligatures w14:val="none"/>
-        </w:rPr>
-        <w:t xml:space="preserve">For this lab, </w:t>
-      </w:r>
-      <w:r>
-        <w:rPr>
-          <w:rFonts w:ascii="Helvetica" w:eastAsia="Calibri" w:hAnsi="Helvetica" w:cs="Times New Roman"/>
-          <w:kern w:val="0"/>
-          <w:sz w:val="22"/>
-          <w:szCs w:val="22"/>
-          <w14:ligatures w14:val="none"/>
-        </w:rPr>
-        <w:t xml:space="preserve">code changes were applied to sections with </w:t>
-      </w:r>
-      <w:r>
-        <w:rPr>
-          <w:rFonts w:ascii="Helvetica" w:eastAsia="Calibri" w:hAnsi="Helvetica" w:cs="Times New Roman"/>
-          <w:kern w:val="0"/>
-          <w:sz w:val="22"/>
-          <w:szCs w:val="22"/>
-          <w14:ligatures w14:val="none"/>
-        </w:rPr>
-        <w:t>#</w:t>
-      </w:r>
-      <w:r>
-        <w:rPr>
-          <w:rFonts w:ascii="Helvetica" w:eastAsia="Calibri" w:hAnsi="Helvetica" w:cs="Times New Roman"/>
-          <w:kern w:val="0"/>
-          <w:sz w:val="22"/>
-          <w:szCs w:val="22"/>
-          <w14:ligatures w14:val="none"/>
-        </w:rPr>
-        <w:t>TODO commented</w:t>
-      </w:r>
-      <w:r>
-        <w:rPr>
-          <w:rFonts w:ascii="Helvetica" w:eastAsia="Calibri" w:hAnsi="Helvetica" w:cs="Times New Roman"/>
-          <w:kern w:val="0"/>
-          <w:sz w:val="22"/>
-          <w:szCs w:val="22"/>
-          <w14:ligatures w14:val="none"/>
-        </w:rPr>
-        <w:t>. All .</w:t>
-      </w:r>
-      <w:proofErr w:type="spellStart"/>
-      <w:r>
-        <w:rPr>
-          <w:rFonts w:ascii="Helvetica" w:eastAsia="Calibri" w:hAnsi="Helvetica" w:cs="Times New Roman"/>
-          <w:kern w:val="0"/>
-          <w:sz w:val="22"/>
-          <w:szCs w:val="22"/>
-          <w14:ligatures w14:val="none"/>
-        </w:rPr>
-        <w:t>ipynb</w:t>
-      </w:r>
-      <w:proofErr w:type="spellEnd"/>
-      <w:r>
-        <w:rPr>
-          <w:rFonts w:ascii="Helvetica" w:eastAsia="Calibri" w:hAnsi="Helvetica" w:cs="Times New Roman"/>
-          <w:kern w:val="0"/>
-          <w:sz w:val="22"/>
-          <w:szCs w:val="22"/>
-          <w14:ligatures w14:val="none"/>
-        </w:rPr>
-        <w:t xml:space="preserve"> files for this lab were downloaded and uploaded to GitHub in the link above.</w:t>
-      </w:r>
-      <w:r>
-        <w:rPr>
-          <w:rFonts w:ascii="Helvetica" w:eastAsia="Calibri" w:hAnsi="Helvetica" w:cs="Times New Roman"/>
-          <w:kern w:val="0"/>
-          <w:sz w:val="22"/>
-          <w:szCs w:val="22"/>
-          <w14:ligatures w14:val="none"/>
-        </w:rPr>
-        <w:t xml:space="preserve"> Part 1 and Part 2 modified codes are in their respective .</w:t>
-      </w:r>
-      <w:proofErr w:type="spellStart"/>
-      <w:r>
-        <w:rPr>
-          <w:rFonts w:ascii="Helvetica" w:eastAsia="Calibri" w:hAnsi="Helvetica" w:cs="Times New Roman"/>
-          <w:kern w:val="0"/>
-          <w:sz w:val="22"/>
-          <w:szCs w:val="22"/>
-          <w14:ligatures w14:val="none"/>
-        </w:rPr>
-        <w:t>ipynb</w:t>
-      </w:r>
-      <w:proofErr w:type="spellEnd"/>
-      <w:r>
-        <w:rPr>
-          <w:rFonts w:ascii="Helvetica" w:eastAsia="Calibri" w:hAnsi="Helvetica" w:cs="Times New Roman"/>
-          <w:kern w:val="0"/>
-          <w:sz w:val="22"/>
-          <w:szCs w:val="22"/>
-          <w14:ligatures w14:val="none"/>
-        </w:rPr>
-        <w:t xml:space="preserve"> files on </w:t>
-      </w:r>
-      <w:proofErr w:type="spellStart"/>
-      <w:r>
-        <w:rPr>
-          <w:rFonts w:ascii="Helvetica" w:eastAsia="Calibri" w:hAnsi="Helvetica" w:cs="Times New Roman"/>
-          <w:kern w:val="0"/>
-          <w:sz w:val="22"/>
-          <w:szCs w:val="22"/>
-          <w14:ligatures w14:val="none"/>
-        </w:rPr>
-        <w:t>Github</w:t>
-      </w:r>
-      <w:proofErr w:type="spellEnd"/>
-      <w:r>
-        <w:rPr>
-          <w:rFonts w:ascii="Helvetica" w:eastAsia="Calibri" w:hAnsi="Helvetica" w:cs="Times New Roman"/>
-          <w:kern w:val="0"/>
-          <w:sz w:val="22"/>
-          <w:szCs w:val="22"/>
-          <w14:ligatures w14:val="none"/>
-        </w:rPr>
-        <w:t>.</w:t>
-      </w:r>
-      <w:r>
-        <w:rPr>
-          <w:rFonts w:ascii="Helvetica" w:eastAsia="Calibri" w:hAnsi="Helvetica" w:cs="Times New Roman"/>
-          <w:kern w:val="0"/>
-          <w:sz w:val="22"/>
-          <w:szCs w:val="22"/>
-          <w14:ligatures w14:val="none"/>
-        </w:rPr>
-        <w:t xml:space="preserve"> </w:t>
-      </w:r>
-      <w:r>
-        <w:rPr>
-          <w:rFonts w:ascii="Helvetica" w:eastAsia="Calibri" w:hAnsi="Helvetica" w:cs="Times New Roman"/>
-          <w:kern w:val="0"/>
-          <w:sz w:val="22"/>
-          <w:szCs w:val="22"/>
-          <w14:ligatures w14:val="none"/>
-        </w:rPr>
-        <w:t>Aside from adding code to fix issues errors, most of the codes stayed the same with little to no changes in sections that do not contain #TODO. Lines that were added under #TODO were referenced from exercises.</w:t>
-      </w:r>
     </w:p>
     <w:p>
       <w:pPr>
@@ -805,51 +607,95 @@
           <w:szCs w:val="22"/>
           <w14:ligatures w14:val="none"/>
         </w:rPr>
-        <w:t>Successfully implemented a SFT pipeline given the base code and code that I implemented for the #TODO sections. I had issues with out of memory when running the entire program, so I did some research and looked back at notes and found that using a 4-bit quantization (</w:t>
-      </w:r>
-      <w:proofErr w:type="spellStart"/>
-      <w:r>
-        <w:rPr>
-          <w:rFonts w:ascii="Helvetica" w:eastAsia="Calibri" w:hAnsi="Helvetica" w:cs="Times New Roman"/>
-          <w:kern w:val="0"/>
-          <w:sz w:val="22"/>
-          <w:szCs w:val="22"/>
-          <w14:ligatures w14:val="none"/>
-        </w:rPr>
-        <w:t>QLoRA</w:t>
-      </w:r>
-      <w:proofErr w:type="spellEnd"/>
-      <w:r>
-        <w:rPr>
-          <w:rFonts w:ascii="Helvetica" w:eastAsia="Calibri" w:hAnsi="Helvetica" w:cs="Times New Roman"/>
-          <w:kern w:val="0"/>
-          <w:sz w:val="22"/>
-          <w:szCs w:val="22"/>
-          <w14:ligatures w14:val="none"/>
-        </w:rPr>
-        <w:t xml:space="preserve">) with the </w:t>
-      </w:r>
-      <w:proofErr w:type="spellStart"/>
-      <w:r>
-        <w:rPr>
-          <w:rFonts w:ascii="Helvetica" w:eastAsia="Calibri" w:hAnsi="Helvetica" w:cs="Times New Roman"/>
-          <w:kern w:val="0"/>
-          <w:sz w:val="22"/>
-          <w:szCs w:val="22"/>
-          <w14:ligatures w14:val="none"/>
-        </w:rPr>
-        <w:t>bitsandbytes</w:t>
-      </w:r>
-      <w:proofErr w:type="spellEnd"/>
-      <w:r>
-        <w:rPr>
-          <w:rFonts w:ascii="Helvetica" w:eastAsia="Calibri" w:hAnsi="Helvetica" w:cs="Times New Roman"/>
-          <w:kern w:val="0"/>
-          <w:sz w:val="22"/>
-          <w:szCs w:val="22"/>
-          <w14:ligatures w14:val="none"/>
-        </w:rPr>
-        <w:t xml:space="preserve"> library fixes this issue. It compresses the model’s memory footprint and loads its weight in a lower precision format. Afterwards, I added the code to compute the aggregated ROUGE metrics against the references. See the GitHub for the code and full results</w:t>
+        <w:t xml:space="preserve">This part shows the differences in model behavior and importance of tuning RAG parameters. Falcon and Gemma are different where Falcon </w:t>
+      </w:r>
+      <w:proofErr w:type="gramStart"/>
+      <w:r>
+        <w:rPr>
+          <w:rFonts w:ascii="Helvetica" w:eastAsia="Calibri" w:hAnsi="Helvetica" w:cs="Times New Roman"/>
+          <w:kern w:val="0"/>
+          <w:sz w:val="22"/>
+          <w:szCs w:val="22"/>
+          <w14:ligatures w14:val="none"/>
+        </w:rPr>
+        <w:t>as</w:t>
+      </w:r>
+      <w:proofErr w:type="gramEnd"/>
+      <w:r>
+        <w:rPr>
+          <w:rFonts w:ascii="Helvetica" w:eastAsia="Calibri" w:hAnsi="Helvetica" w:cs="Times New Roman"/>
+          <w:kern w:val="0"/>
+          <w:sz w:val="22"/>
+          <w:szCs w:val="22"/>
+          <w14:ligatures w14:val="none"/>
+        </w:rPr>
+        <w:t xml:space="preserve"> </w:t>
+      </w:r>
+      <w:proofErr w:type="gramStart"/>
+      <w:r>
+        <w:rPr>
+          <w:rFonts w:ascii="Helvetica" w:eastAsia="Calibri" w:hAnsi="Helvetica" w:cs="Times New Roman"/>
+          <w:kern w:val="0"/>
+          <w:sz w:val="22"/>
+          <w:szCs w:val="22"/>
+          <w14:ligatures w14:val="none"/>
+        </w:rPr>
+        <w:t>an</w:t>
+      </w:r>
+      <w:proofErr w:type="gramEnd"/>
+      <w:r>
+        <w:rPr>
+          <w:rFonts w:ascii="Helvetica" w:eastAsia="Calibri" w:hAnsi="Helvetica" w:cs="Times New Roman"/>
+          <w:kern w:val="0"/>
+          <w:sz w:val="22"/>
+          <w:szCs w:val="22"/>
+          <w14:ligatures w14:val="none"/>
+        </w:rPr>
+        <w:t xml:space="preserve"> helpful assistant </w:t>
+      </w:r>
+      <w:proofErr w:type="gramStart"/>
+      <w:r>
+        <w:rPr>
+          <w:rFonts w:ascii="Helvetica" w:eastAsia="Calibri" w:hAnsi="Helvetica" w:cs="Times New Roman"/>
+          <w:kern w:val="0"/>
+          <w:sz w:val="22"/>
+          <w:szCs w:val="22"/>
+          <w14:ligatures w14:val="none"/>
+        </w:rPr>
+        <w:t>where as</w:t>
+      </w:r>
+      <w:proofErr w:type="gramEnd"/>
+      <w:r>
+        <w:rPr>
+          <w:rFonts w:ascii="Helvetica" w:eastAsia="Calibri" w:hAnsi="Helvetica" w:cs="Times New Roman"/>
+          <w:kern w:val="0"/>
+          <w:sz w:val="22"/>
+          <w:szCs w:val="22"/>
+          <w14:ligatures w14:val="none"/>
+        </w:rPr>
+        <w:t xml:space="preserve"> Gemma behaves like a safety assistant. Experiments </w:t>
+      </w:r>
+      <w:proofErr w:type="gramStart"/>
+      <w:r>
+        <w:rPr>
+          <w:rFonts w:ascii="Helvetica" w:eastAsia="Calibri" w:hAnsi="Helvetica" w:cs="Times New Roman"/>
+          <w:kern w:val="0"/>
+          <w:sz w:val="22"/>
+          <w:szCs w:val="22"/>
+          <w14:ligatures w14:val="none"/>
+        </w:rPr>
+        <w:t>shows</w:t>
+      </w:r>
+      <w:proofErr w:type="gramEnd"/>
+      <w:r>
+        <w:rPr>
+          <w:rFonts w:ascii="Helvetica" w:eastAsia="Calibri" w:hAnsi="Helvetica" w:cs="Times New Roman"/>
+          <w:kern w:val="0"/>
+          <w:sz w:val="22"/>
+          <w:szCs w:val="22"/>
+          <w14:ligatures w14:val="none"/>
+        </w:rPr>
+        <w:t xml:space="preserve"> that increasing parameters like Top K and Chunk size feeds the models more context for richer responses while raising the max tokens is essential to stop the models from cutting off their responses.</w:t>
       </w:r>
     </w:p>
     <w:p>
@@ -903,21 +749,19 @@
         <w:rPr>
           <w:rFonts w:ascii="Helvetica" w:hAnsi="Helvetica" w:cs="Helvetica"/>
         </w:rPr>
-        <w:t xml:space="preserve"> All settings set </w:t>
-      </w:r>
-      <w:proofErr w:type="spellStart"/>
+        <w:t xml:space="preserve"> </w:t>
+      </w:r>
       <w:r>
         <w:rPr>
           <w:rFonts w:ascii="Helvetica" w:hAnsi="Helvetica" w:cs="Helvetica"/>
         </w:rPr>
-        <w:t>to</w:t>
-      </w:r>
-      <w:proofErr w:type="spellEnd"/>
+        <w:t>Low parameters</w:t>
+      </w:r>
       <w:r>
         <w:rPr>
           <w:rFonts w:ascii="Helvetica" w:hAnsi="Helvetica" w:cs="Helvetica"/>
         </w:rPr>
-        <w:t xml:space="preserve"> low for Falcon </w:t>
+        <w:t xml:space="preserve"> for Falcon </w:t>
       </w:r>
       <w:r>
         <w:rPr>
@@ -934,42 +778,6 @@
           <w14:ligatures w14:val="none"/>
         </w:rPr>
         <w:br w:type="page"/>
-      </w:r>
-    </w:p>
-    <w:p>
-      <w:pPr>
-        <w:spacing w:after="0" w:line="240" w:lineRule="auto"/>
-        <w:jc w:val="both"/>
-        <w:rPr>
-          <w:rFonts w:ascii="Helvetica" w:eastAsia="Calibri" w:hAnsi="Helvetica" w:cs="Times New Roman"/>
-          <w:kern w:val="0"/>
-          <w:sz w:val="22"/>
-          <w:szCs w:val="22"/>
-          <w14:ligatures w14:val="none"/>
-        </w:rPr>
-      </w:pPr>
-      <w:r>
-        <w:rPr>
-          <w:rFonts w:ascii="Helvetica" w:eastAsia="Calibri" w:hAnsi="Helvetica" w:cs="Times New Roman"/>
-          <w:b/>
-          <w:bCs/>
-          <w:kern w:val="0"/>
-          <w:sz w:val="22"/>
-          <w:szCs w:val="22"/>
-          <w14:ligatures w14:val="none"/>
-        </w:rPr>
-        <w:lastRenderedPageBreak/>
-        <w:t>Screenshot</w:t>
-      </w:r>
-      <w:r>
-        <w:rPr>
-          <w:rFonts w:ascii="Helvetica" w:eastAsia="Calibri" w:hAnsi="Helvetica" w:cs="Times New Roman"/>
-          <w:kern w:val="0"/>
-          <w:sz w:val="22"/>
-          <w:szCs w:val="22"/>
-          <w14:ligatures w14:val="none"/>
-        </w:rPr>
-        <w:t xml:space="preserve"> – </w:t>
       </w:r>
     </w:p>
     <w:p>
@@ -1053,6 +861,31 @@
           <w14:ligatures w14:val="none"/>
         </w:rPr>
       </w:pPr>
+      <w:r>
+        <w:rPr>
+          <w:rFonts w:ascii="Helvetica" w:eastAsia="Calibri" w:hAnsi="Helvetica" w:cs="Times New Roman"/>
+          <w:kern w:val="0"/>
+          <w:sz w:val="22"/>
+          <w:szCs w:val="22"/>
+          <w14:ligatures w14:val="none"/>
+        </w:rPr>
+        <w:pict w14:anchorId="51232474">
+          <v:rect id="_x0000_i1025" style="width:0;height:1.5pt" o:hralign="center" o:hrstd="t" o:hr="t" fillcolor="#a0a0a0" stroked="f"/>
+        </w:pict>
+      </w:r>
+    </w:p>
+    <w:p>
+      <w:pPr>
+        <w:spacing w:after="0" w:line="240" w:lineRule="auto"/>
+        <w:jc w:val="center"/>
+        <w:rPr>
+          <w:rFonts w:ascii="Helvetica" w:eastAsia="Calibri" w:hAnsi="Helvetica" w:cs="Times New Roman"/>
+          <w:kern w:val="0"/>
+          <w:sz w:val="22"/>
+          <w:szCs w:val="22"/>
+          <w14:ligatures w14:val="none"/>
+        </w:rPr>
+      </w:pPr>
     </w:p>
     <w:p>
       <w:pPr>
@@ -1098,12 +931,18 @@
         <w:rPr>
           <w:rFonts w:ascii="Helvetica" w:hAnsi="Helvetica" w:cs="Helvetica"/>
         </w:rPr>
-        <w:t>All settings set to medium for Falcon</w:t>
+        <w:t xml:space="preserve">Medium parameters </w:t>
       </w:r>
       <w:r>
         <w:rPr>
           <w:rFonts w:ascii="Helvetica" w:hAnsi="Helvetica" w:cs="Helvetica"/>
         </w:rPr>
+        <w:t>for Falcon</w:t>
+      </w:r>
+      <w:r>
+        <w:rPr>
+          <w:rFonts w:ascii="Helvetica" w:hAnsi="Helvetica" w:cs="Helvetica"/>
+        </w:rPr>
         <w:t xml:space="preserve"> </w:t>
       </w:r>
       <w:r>
@@ -1124,52 +963,6 @@
           <w14:ligatures w14:val="none"/>
         </w:rPr>
       </w:pPr>
-    </w:p>
-    <w:p>
-      <w:pPr>
-        <w:spacing w:after="0" w:line="240" w:lineRule="auto"/>
-        <w:rPr>
-          <w:rFonts w:ascii="Helvetica" w:eastAsia="Calibri" w:hAnsi="Helvetica" w:cs="Times New Roman"/>
-          <w:kern w:val="0"/>
-          <w:sz w:val="22"/>
-          <w:szCs w:val="22"/>
-          <w14:ligatures w14:val="none"/>
-        </w:rPr>
-      </w:pPr>
-    </w:p>
-    <w:p>
-      <w:pPr>
-        <w:jc w:val="both"/>
-        <w:rPr>
-          <w:rFonts w:ascii="Helvetica" w:eastAsia="Calibri" w:hAnsi="Helvetica" w:cs="Times New Roman"/>
-          <w:kern w:val="0"/>
-          <w:sz w:val="22"/>
-          <w:szCs w:val="22"/>
-          <w14:ligatures w14:val="none"/>
-        </w:rPr>
-      </w:pPr>
-      <w:r>
-        <w:rPr>
-          <w:rFonts w:ascii="Helvetica" w:eastAsia="Calibri" w:hAnsi="Helvetica" w:cs="Times New Roman"/>
-          <w:b/>
-          <w:bCs/>
-          <w:kern w:val="0"/>
-          <w:sz w:val="22"/>
-          <w:szCs w:val="22"/>
-          <w14:ligatures w14:val="none"/>
-        </w:rPr>
-        <w:t>Screenshot</w:t>
-      </w:r>
-      <w:r>
-        <w:rPr>
-          <w:rFonts w:ascii="Helvetica" w:eastAsia="Calibri" w:hAnsi="Helvetica" w:cs="Times New Roman"/>
-          <w:kern w:val="0"/>
-          <w:sz w:val="22"/>
-          <w:szCs w:val="22"/>
-          <w14:ligatures w14:val="none"/>
-        </w:rPr>
-        <w:t xml:space="preserve"> – </w:t>
-      </w:r>
     </w:p>
     <w:p>
       <w:pPr>
@@ -1231,6 +1024,44 @@
     <w:p>
       <w:pPr>
         <w:spacing w:after="0" w:line="240" w:lineRule="auto"/>
+        <w:jc w:val="center"/>
+        <w:rPr>
+          <w:rFonts w:ascii="Helvetica" w:eastAsia="Calibri" w:hAnsi="Helvetica" w:cs="Times New Roman"/>
+          <w:kern w:val="0"/>
+          <w:sz w:val="22"/>
+          <w:szCs w:val="22"/>
+          <w14:ligatures w14:val="none"/>
+        </w:rPr>
+      </w:pPr>
+      <w:r>
+        <w:rPr>
+          <w:rFonts w:ascii="Helvetica" w:eastAsia="Calibri" w:hAnsi="Helvetica" w:cs="Times New Roman"/>
+          <w:kern w:val="0"/>
+          <w:sz w:val="22"/>
+          <w:szCs w:val="22"/>
+          <w14:ligatures w14:val="none"/>
+        </w:rPr>
+        <w:pict w14:anchorId="0AD5E563">
+          <v:rect id="_x0000_i1026" style="width:0;height:1.5pt" o:hralign="center" o:hrstd="t" o:hr="t" fillcolor="#a0a0a0" stroked="f"/>
+        </w:pict>
+      </w:r>
+    </w:p>
+    <w:p>
+      <w:pPr>
+        <w:spacing w:after="0" w:line="240" w:lineRule="auto"/>
+        <w:jc w:val="center"/>
+        <w:rPr>
+          <w:rFonts w:ascii="Helvetica" w:eastAsia="Calibri" w:hAnsi="Helvetica" w:cs="Times New Roman"/>
+          <w:kern w:val="0"/>
+          <w:sz w:val="22"/>
+          <w:szCs w:val="22"/>
+          <w14:ligatures w14:val="none"/>
+        </w:rPr>
+      </w:pPr>
+    </w:p>
+    <w:p>
+      <w:pPr>
+        <w:spacing w:after="0" w:line="240" w:lineRule="auto"/>
         <w:rPr>
           <w:rFonts w:ascii="Helvetica" w:eastAsia="Calibri" w:hAnsi="Helvetica" w:cs="Times New Roman"/>
           <w:kern w:val="0"/>
@@ -1260,29 +1091,27 @@
           <w:szCs w:val="22"/>
           <w14:ligatures w14:val="none"/>
         </w:rPr>
-        <w:t xml:space="preserve"> – All settings set </w:t>
-      </w:r>
-      <w:proofErr w:type="spellStart"/>
-      <w:r>
-        <w:rPr>
-          <w:rFonts w:ascii="Helvetica" w:eastAsia="Calibri" w:hAnsi="Helvetica" w:cs="Times New Roman"/>
-          <w:kern w:val="0"/>
-          <w:sz w:val="22"/>
-          <w:szCs w:val="22"/>
-          <w14:ligatures w14:val="none"/>
-        </w:rPr>
-        <w:t>to</w:t>
-      </w:r>
-      <w:proofErr w:type="spellEnd"/>
-      <w:r>
-        <w:rPr>
-          <w:rFonts w:ascii="Helvetica" w:eastAsia="Calibri" w:hAnsi="Helvetica" w:cs="Times New Roman"/>
-          <w:kern w:val="0"/>
-          <w:sz w:val="22"/>
-          <w:szCs w:val="22"/>
-          <w14:ligatures w14:val="none"/>
-        </w:rPr>
-        <w:t xml:space="preserve"> high for Falcon</w:t>
+        <w:t xml:space="preserve"> – </w:t>
+      </w:r>
+      <w:r>
+        <w:rPr>
+          <w:rFonts w:ascii="Helvetica" w:eastAsia="Calibri" w:hAnsi="Helvetica" w:cs="Times New Roman"/>
+          <w:kern w:val="0"/>
+          <w:sz w:val="22"/>
+          <w:szCs w:val="22"/>
+          <w14:ligatures w14:val="none"/>
+        </w:rPr>
+        <w:t>High parameters</w:t>
+      </w:r>
+      <w:r>
+        <w:rPr>
+          <w:rFonts w:ascii="Helvetica" w:eastAsia="Calibri" w:hAnsi="Helvetica" w:cs="Times New Roman"/>
+          <w:kern w:val="0"/>
+          <w:sz w:val="22"/>
+          <w:szCs w:val="22"/>
+          <w14:ligatures w14:val="none"/>
+        </w:rPr>
+        <w:t xml:space="preserve"> for Falcon</w:t>
       </w:r>
       <w:r>
         <w:rPr>
@@ -1299,52 +1128,6 @@
           <w:rFonts w:ascii="Helvetica" w:hAnsi="Helvetica" w:cs="Helvetica"/>
         </w:rPr>
         <w:t>(pre gemma code addition)</w:t>
-      </w:r>
-    </w:p>
-    <w:p>
-      <w:pPr>
-        <w:spacing w:after="0" w:line="240" w:lineRule="auto"/>
-        <w:rPr>
-          <w:rFonts w:ascii="Helvetica" w:eastAsia="Calibri" w:hAnsi="Helvetica" w:cs="Times New Roman"/>
-          <w:kern w:val="0"/>
-          <w:sz w:val="22"/>
-          <w:szCs w:val="22"/>
-          <w14:ligatures w14:val="none"/>
-        </w:rPr>
-      </w:pPr>
-    </w:p>
-    <w:p>
-      <w:pPr>
-        <w:spacing w:after="0" w:line="240" w:lineRule="auto"/>
-        <w:rPr>
-          <w:rFonts w:ascii="Helvetica" w:eastAsia="Calibri" w:hAnsi="Helvetica" w:cs="Times New Roman"/>
-          <w:kern w:val="0"/>
-          <w:sz w:val="22"/>
-          <w:szCs w:val="22"/>
-          <w14:ligatures w14:val="none"/>
-        </w:rPr>
-      </w:pPr>
-      <w:r>
-        <w:rPr>
-          <w:rFonts w:ascii="Helvetica" w:eastAsia="Calibri" w:hAnsi="Helvetica" w:cs="Times New Roman"/>
-          <w:b/>
-          <w:bCs/>
-          <w:kern w:val="0"/>
-          <w:sz w:val="22"/>
-          <w:szCs w:val="22"/>
-          <w14:ligatures w14:val="none"/>
-        </w:rPr>
-        <w:t>Screenshot</w:t>
-      </w:r>
-      <w:r>
-        <w:rPr>
-          <w:rFonts w:ascii="Helvetica" w:eastAsia="Calibri" w:hAnsi="Helvetica" w:cs="Times New Roman"/>
-          <w:kern w:val="0"/>
-          <w:sz w:val="22"/>
-          <w:szCs w:val="22"/>
-          <w14:ligatures w14:val="none"/>
-        </w:rPr>
-        <w:t xml:space="preserve"> – </w:t>
       </w:r>
     </w:p>
     <w:p>
@@ -1428,6 +1211,31 @@
           <w14:ligatures w14:val="none"/>
         </w:rPr>
       </w:pPr>
+      <w:r>
+        <w:rPr>
+          <w:rFonts w:ascii="Helvetica" w:eastAsia="Calibri" w:hAnsi="Helvetica" w:cs="Times New Roman"/>
+          <w:kern w:val="0"/>
+          <w:sz w:val="22"/>
+          <w:szCs w:val="22"/>
+          <w14:ligatures w14:val="none"/>
+        </w:rPr>
+        <w:pict w14:anchorId="5FD02AE0">
+          <v:rect id="_x0000_i1027" style="width:0;height:1.5pt" o:hralign="center" o:hrstd="t" o:hr="t" fillcolor="#a0a0a0" stroked="f"/>
+        </w:pict>
+      </w:r>
+    </w:p>
+    <w:p>
+      <w:pPr>
+        <w:spacing w:after="0" w:line="240" w:lineRule="auto"/>
+        <w:jc w:val="center"/>
+        <w:rPr>
+          <w:rFonts w:ascii="Helvetica" w:eastAsia="Calibri" w:hAnsi="Helvetica" w:cs="Times New Roman"/>
+          <w:kern w:val="0"/>
+          <w:sz w:val="22"/>
+          <w:szCs w:val="22"/>
+          <w14:ligatures w14:val="none"/>
+        </w:rPr>
+      </w:pPr>
     </w:p>
     <w:p>
       <w:pPr>
@@ -1467,44 +1275,36 @@
         <w:rPr>
           <w:rFonts w:ascii="Helvetica" w:hAnsi="Helvetica" w:cs="Helvetica"/>
         </w:rPr>
-        <w:t xml:space="preserve"> All settings set </w:t>
-      </w:r>
-      <w:proofErr w:type="spellStart"/>
+        <w:t xml:space="preserve"> Low parameters </w:t>
+      </w:r>
       <w:r>
         <w:rPr>
           <w:rFonts w:ascii="Helvetica" w:hAnsi="Helvetica" w:cs="Helvetica"/>
         </w:rPr>
-        <w:t>to</w:t>
-      </w:r>
-      <w:proofErr w:type="spellEnd"/>
+        <w:t xml:space="preserve">for </w:t>
+      </w:r>
       <w:r>
         <w:rPr>
           <w:rFonts w:ascii="Helvetica" w:hAnsi="Helvetica" w:cs="Helvetica"/>
         </w:rPr>
-        <w:t xml:space="preserve"> low for </w:t>
+        <w:t xml:space="preserve">Gemma </w:t>
       </w:r>
       <w:r>
         <w:rPr>
           <w:rFonts w:ascii="Helvetica" w:hAnsi="Helvetica" w:cs="Helvetica"/>
         </w:rPr>
-        <w:t xml:space="preserve">Gemma </w:t>
+        <w:t>(</w:t>
       </w:r>
       <w:r>
         <w:rPr>
           <w:rFonts w:ascii="Helvetica" w:hAnsi="Helvetica" w:cs="Helvetica"/>
         </w:rPr>
-        <w:t>(</w:t>
+        <w:t>post</w:t>
       </w:r>
       <w:r>
         <w:rPr>
           <w:rFonts w:ascii="Helvetica" w:hAnsi="Helvetica" w:cs="Helvetica"/>
         </w:rPr>
-        <w:t>post</w:t>
-      </w:r>
-      <w:r>
-        <w:rPr>
-          <w:rFonts w:ascii="Helvetica" w:hAnsi="Helvetica" w:cs="Helvetica"/>
-        </w:rPr>
         <w:t xml:space="preserve"> gemma code addition)</w:t>
       </w:r>
       <w:r>
@@ -1521,71 +1321,24 @@
     <w:p>
       <w:pPr>
         <w:spacing w:after="0" w:line="240" w:lineRule="auto"/>
-        <w:jc w:val="both"/>
-        <w:rPr>
-          <w:rFonts w:ascii="Helvetica" w:eastAsia="Calibri" w:hAnsi="Helvetica" w:cs="Times New Roman"/>
-          <w:kern w:val="0"/>
-          <w:sz w:val="22"/>
-          <w:szCs w:val="22"/>
-          <w14:ligatures w14:val="none"/>
-        </w:rPr>
-      </w:pPr>
-      <w:r>
-        <w:rPr>
-          <w:rFonts w:ascii="Helvetica" w:eastAsia="Calibri" w:hAnsi="Helvetica" w:cs="Times New Roman"/>
-          <w:b/>
-          <w:bCs/>
+        <w:jc w:val="center"/>
+        <w:rPr>
+          <w:rFonts w:ascii="Helvetica" w:eastAsia="Calibri" w:hAnsi="Helvetica" w:cs="Times New Roman"/>
+          <w:kern w:val="0"/>
+          <w:sz w:val="22"/>
+          <w:szCs w:val="22"/>
+          <w14:ligatures w14:val="none"/>
+        </w:rPr>
+      </w:pPr>
+      <w:r>
+        <w:rPr>
+          <w:rFonts w:ascii="Helvetica" w:eastAsia="Calibri" w:hAnsi="Helvetica" w:cs="Times New Roman"/>
           <w:kern w:val="0"/>
           <w:sz w:val="22"/>
           <w:szCs w:val="22"/>
           <w14:ligatures w14:val="none"/>
         </w:rPr>
         <w:lastRenderedPageBreak/>
-        <w:t>Screenshot</w:t>
-      </w:r>
-      <w:r>
-        <w:rPr>
-          <w:rFonts w:ascii="Helvetica" w:eastAsia="Calibri" w:hAnsi="Helvetica" w:cs="Times New Roman"/>
-          <w:kern w:val="0"/>
-          <w:sz w:val="22"/>
-          <w:szCs w:val="22"/>
-          <w14:ligatures w14:val="none"/>
-        </w:rPr>
-        <w:t xml:space="preserve"> – </w:t>
-      </w:r>
-    </w:p>
-    <w:p>
-      <w:pPr>
-        <w:spacing w:after="0" w:line="240" w:lineRule="auto"/>
-        <w:rPr>
-          <w:rFonts w:ascii="Helvetica" w:eastAsia="Calibri" w:hAnsi="Helvetica" w:cs="Times New Roman"/>
-          <w:kern w:val="0"/>
-          <w:sz w:val="22"/>
-          <w:szCs w:val="22"/>
-          <w14:ligatures w14:val="none"/>
-        </w:rPr>
-      </w:pPr>
-    </w:p>
-    <w:p>
-      <w:pPr>
-        <w:spacing w:after="0" w:line="240" w:lineRule="auto"/>
-        <w:jc w:val="center"/>
-        <w:rPr>
-          <w:rFonts w:ascii="Helvetica" w:eastAsia="Calibri" w:hAnsi="Helvetica" w:cs="Times New Roman"/>
-          <w:kern w:val="0"/>
-          <w:sz w:val="22"/>
-          <w:szCs w:val="22"/>
-          <w14:ligatures w14:val="none"/>
-        </w:rPr>
-      </w:pPr>
-      <w:r>
-        <w:rPr>
-          <w:rFonts w:ascii="Helvetica" w:eastAsia="Calibri" w:hAnsi="Helvetica" w:cs="Times New Roman"/>
-          <w:kern w:val="0"/>
-          <w:sz w:val="22"/>
-          <w:szCs w:val="22"/>
-          <w14:ligatures w14:val="none"/>
-        </w:rPr>
         <w:drawing>
           <wp:inline distT="0" distB="0" distL="0" distR="0" wp14:anchorId="00AF160C" wp14:editId="55A4752A">
             <wp:extent cx="5943600" cy="3390265"/>
@@ -1635,6 +1388,31 @@
           <w14:ligatures w14:val="none"/>
         </w:rPr>
       </w:pPr>
+      <w:r>
+        <w:rPr>
+          <w:rFonts w:ascii="Helvetica" w:eastAsia="Calibri" w:hAnsi="Helvetica" w:cs="Times New Roman"/>
+          <w:kern w:val="0"/>
+          <w:sz w:val="22"/>
+          <w:szCs w:val="22"/>
+          <w14:ligatures w14:val="none"/>
+        </w:rPr>
+        <w:pict w14:anchorId="72965FFA">
+          <v:rect id="_x0000_i1028" style="width:0;height:1.5pt" o:hralign="center" o:hrstd="t" o:hr="t" fillcolor="#a0a0a0" stroked="f"/>
+        </w:pict>
+      </w:r>
+    </w:p>
+    <w:p>
+      <w:pPr>
+        <w:spacing w:after="0" w:line="240" w:lineRule="auto"/>
+        <w:jc w:val="center"/>
+        <w:rPr>
+          <w:rFonts w:ascii="Helvetica" w:eastAsia="Calibri" w:hAnsi="Helvetica" w:cs="Times New Roman"/>
+          <w:kern w:val="0"/>
+          <w:sz w:val="22"/>
+          <w:szCs w:val="22"/>
+          <w14:ligatures w14:val="none"/>
+        </w:rPr>
+      </w:pPr>
     </w:p>
     <w:p>
       <w:pPr>
@@ -1674,54 +1452,32 @@
         <w:rPr>
           <w:rFonts w:ascii="Helvetica" w:hAnsi="Helvetica" w:cs="Helvetica"/>
         </w:rPr>
-        <w:t xml:space="preserve"> All settings set to medium for Gemma (post gemma code addition)</w:t>
-      </w:r>
-    </w:p>
-    <w:p>
-      <w:pPr>
-        <w:spacing w:after="0" w:line="240" w:lineRule="auto"/>
-        <w:rPr>
-          <w:rFonts w:ascii="Helvetica" w:eastAsia="Calibri" w:hAnsi="Helvetica" w:cs="Times New Roman"/>
-          <w:kern w:val="0"/>
-          <w:sz w:val="22"/>
-          <w:szCs w:val="22"/>
-          <w14:ligatures w14:val="none"/>
-        </w:rPr>
-      </w:pPr>
-    </w:p>
-    <w:p>
-      <w:pPr>
-        <w:jc w:val="both"/>
-        <w:rPr>
-          <w:rFonts w:ascii="Helvetica" w:eastAsia="Calibri" w:hAnsi="Helvetica" w:cs="Times New Roman"/>
-          <w:kern w:val="0"/>
-          <w:sz w:val="22"/>
-          <w:szCs w:val="22"/>
-          <w14:ligatures w14:val="none"/>
-        </w:rPr>
-      </w:pPr>
-      <w:r>
-        <w:rPr>
-          <w:rFonts w:ascii="Helvetica" w:eastAsia="Calibri" w:hAnsi="Helvetica" w:cs="Times New Roman"/>
-          <w:b/>
-          <w:bCs/>
-          <w:kern w:val="0"/>
-          <w:sz w:val="22"/>
-          <w:szCs w:val="22"/>
-          <w14:ligatures w14:val="none"/>
-        </w:rPr>
-        <w:t>Screenshot</w:t>
-      </w:r>
-      <w:r>
-        <w:rPr>
-          <w:rFonts w:ascii="Helvetica" w:eastAsia="Calibri" w:hAnsi="Helvetica" w:cs="Times New Roman"/>
-          <w:kern w:val="0"/>
-          <w:sz w:val="22"/>
-          <w:szCs w:val="22"/>
-          <w14:ligatures w14:val="none"/>
-        </w:rPr>
-        <w:t xml:space="preserve"> – </w:t>
-      </w:r>
+        <w:t xml:space="preserve"> </w:t>
+      </w:r>
+      <w:r>
+        <w:rPr>
+          <w:rFonts w:ascii="Helvetica" w:hAnsi="Helvetica" w:cs="Helvetica"/>
+        </w:rPr>
+        <w:t>Medium parameters</w:t>
+      </w:r>
+      <w:r>
+        <w:rPr>
+          <w:rFonts w:ascii="Helvetica" w:hAnsi="Helvetica" w:cs="Helvetica"/>
+        </w:rPr>
+        <w:t xml:space="preserve"> for Gemma (post gemma code addition)</w:t>
+      </w:r>
+    </w:p>
+    <w:p>
+      <w:pPr>
+        <w:spacing w:after="0" w:line="240" w:lineRule="auto"/>
+        <w:rPr>
+          <w:rFonts w:ascii="Helvetica" w:eastAsia="Calibri" w:hAnsi="Helvetica" w:cs="Times New Roman"/>
+          <w:kern w:val="0"/>
+          <w:sz w:val="22"/>
+          <w:szCs w:val="22"/>
+          <w14:ligatures w14:val="none"/>
+        </w:rPr>
+      </w:pPr>
     </w:p>
     <w:p>
       <w:pPr>
@@ -1792,6 +1548,31 @@
           <w14:ligatures w14:val="none"/>
         </w:rPr>
       </w:pPr>
+      <w:r>
+        <w:rPr>
+          <w:rFonts w:ascii="Helvetica" w:eastAsia="Calibri" w:hAnsi="Helvetica" w:cs="Times New Roman"/>
+          <w:kern w:val="0"/>
+          <w:sz w:val="22"/>
+          <w:szCs w:val="22"/>
+          <w14:ligatures w14:val="none"/>
+        </w:rPr>
+        <w:pict w14:anchorId="096552D7">
+          <v:rect id="_x0000_i1029" style="width:0;height:1.5pt" o:hralign="center" o:hrstd="t" o:hr="t" fillcolor="#a0a0a0" stroked="f"/>
+        </w:pict>
+      </w:r>
+    </w:p>
+    <w:p>
+      <w:pPr>
+        <w:spacing w:after="0" w:line="240" w:lineRule="auto"/>
+        <w:jc w:val="center"/>
+        <w:rPr>
+          <w:rFonts w:ascii="Helvetica" w:eastAsia="Calibri" w:hAnsi="Helvetica" w:cs="Times New Roman"/>
+          <w:kern w:val="0"/>
+          <w:sz w:val="22"/>
+          <w:szCs w:val="22"/>
+          <w14:ligatures w14:val="none"/>
+        </w:rPr>
+      </w:pPr>
     </w:p>
     <w:p>
       <w:pPr>
@@ -1820,20 +1601,18 @@
           <w:szCs w:val="22"/>
           <w14:ligatures w14:val="none"/>
         </w:rPr>
-        <w:t xml:space="preserve"> – All settings set </w:t>
-      </w:r>
-      <w:proofErr w:type="spellStart"/>
-      <w:r>
-        <w:rPr>
-          <w:rFonts w:ascii="Helvetica" w:eastAsia="Calibri" w:hAnsi="Helvetica" w:cs="Times New Roman"/>
-          <w:kern w:val="0"/>
-          <w:sz w:val="22"/>
-          <w:szCs w:val="22"/>
-          <w14:ligatures w14:val="none"/>
-        </w:rPr>
-        <w:t>to</w:t>
-      </w:r>
-      <w:proofErr w:type="spellEnd"/>
+        <w:t xml:space="preserve"> – </w:t>
+      </w:r>
+      <w:r>
+        <w:rPr>
+          <w:rFonts w:ascii="Helvetica" w:eastAsia="Calibri" w:hAnsi="Helvetica" w:cs="Times New Roman"/>
+          <w:kern w:val="0"/>
+          <w:sz w:val="22"/>
+          <w:szCs w:val="22"/>
+          <w14:ligatures w14:val="none"/>
+        </w:rPr>
+        <w:t>High parameters</w:t>
+      </w:r>
       <w:r>
         <w:rPr>
           <w:rFonts w:ascii="Helvetica" w:eastAsia="Calibri" w:hAnsi="Helvetica" w:cs="Times New Roman"/>
@@ -1849,52 +1628,6 @@
           <w:rFonts w:ascii="Helvetica" w:hAnsi="Helvetica" w:cs="Helvetica"/>
         </w:rPr>
         <w:t>Gemma (post gemma code addition)</w:t>
-      </w:r>
-    </w:p>
-    <w:p>
-      <w:pPr>
-        <w:spacing w:after="0" w:line="240" w:lineRule="auto"/>
-        <w:rPr>
-          <w:rFonts w:ascii="Helvetica" w:eastAsia="Calibri" w:hAnsi="Helvetica" w:cs="Times New Roman"/>
-          <w:kern w:val="0"/>
-          <w:sz w:val="22"/>
-          <w:szCs w:val="22"/>
-          <w14:ligatures w14:val="none"/>
-        </w:rPr>
-      </w:pPr>
-    </w:p>
-    <w:p>
-      <w:pPr>
-        <w:spacing w:after="0" w:line="240" w:lineRule="auto"/>
-        <w:rPr>
-          <w:rFonts w:ascii="Helvetica" w:eastAsia="Calibri" w:hAnsi="Helvetica" w:cs="Times New Roman"/>
-          <w:kern w:val="0"/>
-          <w:sz w:val="22"/>
-          <w:szCs w:val="22"/>
-          <w14:ligatures w14:val="none"/>
-        </w:rPr>
-      </w:pPr>
-      <w:r>
-        <w:rPr>
-          <w:rFonts w:ascii="Helvetica" w:eastAsia="Calibri" w:hAnsi="Helvetica" w:cs="Times New Roman"/>
-          <w:b/>
-          <w:bCs/>
-          <w:kern w:val="0"/>
-          <w:sz w:val="22"/>
-          <w:szCs w:val="22"/>
-          <w14:ligatures w14:val="none"/>
-        </w:rPr>
-        <w:t>Screenshot</w:t>
-      </w:r>
-      <w:r>
-        <w:rPr>
-          <w:rFonts w:ascii="Helvetica" w:eastAsia="Calibri" w:hAnsi="Helvetica" w:cs="Times New Roman"/>
-          <w:kern w:val="0"/>
-          <w:sz w:val="22"/>
-          <w:szCs w:val="22"/>
-          <w14:ligatures w14:val="none"/>
-        </w:rPr>
-        <w:t xml:space="preserve"> – </w:t>
       </w:r>
     </w:p>
     <w:p>
@@ -2055,7 +1788,7 @@
           <w:szCs w:val="22"/>
           <w14:ligatures w14:val="none"/>
         </w:rPr>
-        <w:t xml:space="preserve"> Successfully implemented RLHF using PPO to align the fine-tuned model against generating toxic content. TODO blocks were implemented with a slight tweak where I mapped the toxicity reward model to the GPU since I was getting a warning that it was using CPU only on the pipeline for some reason. The final quantitative results yielded a negative percentage improvement in toxicity reduction; it proved that the RLHF pipeline was functional. The negative metrics in my opinion was expected since I restricted the step count to 250 for faster training.</w:t>
+        <w:t xml:space="preserve"> </w:t>
       </w:r>
     </w:p>
     <w:p>
@@ -2104,16 +1837,6 @@
         </w:rPr>
         <w:t xml:space="preserve"> – </w:t>
       </w:r>
-      <w:r>
-        <w:rPr>
-          <w:rFonts w:ascii="Helvetica" w:eastAsia="Calibri" w:hAnsi="Helvetica" w:cs="Times New Roman"/>
-          <w:kern w:val="0"/>
-          <w:sz w:val="22"/>
-          <w:szCs w:val="22"/>
-          <w14:ligatures w14:val="none"/>
-        </w:rPr>
-        <w:t>Model Fine-Tuning</w:t>
-      </w:r>
     </w:p>
     <w:p>
       <w:pPr>
@@ -2159,29 +1882,7 @@
           <w:szCs w:val="22"/>
           <w14:ligatures w14:val="none"/>
         </w:rPr>
-        <w:t xml:space="preserve"> – 250 </w:t>
-      </w:r>
-      <w:proofErr w:type="spellStart"/>
-      <w:r>
-        <w:rPr>
-          <w:rFonts w:ascii="Helvetica" w:eastAsia="Calibri" w:hAnsi="Helvetica" w:cs="Times New Roman"/>
-          <w:kern w:val="0"/>
-          <w:sz w:val="22"/>
-          <w:szCs w:val="22"/>
-          <w14:ligatures w14:val="none"/>
-        </w:rPr>
-        <w:t>max_steps</w:t>
-      </w:r>
-      <w:proofErr w:type="spellEnd"/>
-      <w:r>
-        <w:rPr>
-          <w:rFonts w:ascii="Helvetica" w:eastAsia="Calibri" w:hAnsi="Helvetica" w:cs="Times New Roman"/>
-          <w:kern w:val="0"/>
-          <w:sz w:val="22"/>
-          <w:szCs w:val="22"/>
-          <w14:ligatures w14:val="none"/>
-        </w:rPr>
-        <w:t xml:space="preserve"> for a faster training model (downside is the training will yield a suboptimal result)</w:t>
+        <w:t xml:space="preserve"> – </w:t>
       </w:r>
     </w:p>
     <w:p>
@@ -2209,51 +1910,6 @@
           <w14:ligatures w14:val="none"/>
         </w:rPr>
       </w:pPr>
-      <w:r>
-        <w:rPr>
-          <w:rFonts w:ascii="Helvetica" w:eastAsia="Calibri" w:hAnsi="Helvetica" w:cs="Times New Roman"/>
-          <w:noProof/>
-          <w:kern w:val="0"/>
-          <w:sz w:val="22"/>
-          <w:szCs w:val="22"/>
-          <w14:ligatures w14:val="none"/>
-        </w:rPr>
-        <w:drawing>
-          <wp:inline distT="0" distB="0" distL="0" distR="0" wp14:anchorId="2585800B" wp14:editId="0D8DF559">
-            <wp:extent cx="4725059" cy="2162477"/>
-            <wp:effectExtent l="0" t="0" r="0" b="9525"/>
-            <wp:docPr id="1430589652" name="Picture 1"/>
-            <wp:cNvGraphicFramePr>
-              <a:graphicFrameLocks xmlns:a="http://schemas.openxmlformats.org/drawingml/2006/main" noChangeAspect="1"/>
-            </wp:cNvGraphicFramePr>
-            <a:graphic xmlns:a="http://schemas.openxmlformats.org/drawingml/2006/main">
-              <a:graphicData uri="http://schemas.openxmlformats.org/drawingml/2006/picture">
-                <pic:pic xmlns:pic="http://schemas.openxmlformats.org/drawingml/2006/picture">
-                  <pic:nvPicPr>
-                    <pic:cNvPr id="1430589652" name=""/>
-                    <pic:cNvPicPr/>
-                  </pic:nvPicPr>
-                  <pic:blipFill>
-                    <a:blip r:embed="rId12"/>
-                    <a:stretch>
-                      <a:fillRect/>
-                    </a:stretch>
-                  </pic:blipFill>
-                  <pic:spPr>
-                    <a:xfrm>
-                      <a:off x="0" y="0"/>
-                      <a:ext cx="4725059" cy="2162477"/>
-                    </a:xfrm>
-                    <a:prstGeom prst="rect">
-                      <a:avLst/>
-                    </a:prstGeom>
-                  </pic:spPr>
-                </pic:pic>
-              </a:graphicData>
-            </a:graphic>
-          </wp:inline>
-        </w:drawing>
-      </w:r>
     </w:p>
     <w:p>
       <w:pPr>
@@ -2312,7 +1968,7 @@
           <w:szCs w:val="22"/>
           <w14:ligatures w14:val="none"/>
         </w:rPr>
-        <w:t xml:space="preserve"> – Setup Reward Model</w:t>
+        <w:t xml:space="preserve"> – </w:t>
       </w:r>
     </w:p>
     <w:p>
@@ -2359,7 +2015,7 @@
           <w:szCs w:val="22"/>
           <w14:ligatures w14:val="none"/>
         </w:rPr>
-        <w:t xml:space="preserve"> – Shows that the TODO sections were implemented correctly</w:t>
+        <w:t xml:space="preserve"> – </w:t>
       </w:r>
     </w:p>
     <w:p>
@@ -2387,51 +2043,6 @@
           <w14:ligatures w14:val="none"/>
         </w:rPr>
       </w:pPr>
-      <w:r>
-        <w:rPr>
-          <w:rFonts w:ascii="Helvetica" w:eastAsia="Calibri" w:hAnsi="Helvetica" w:cs="Times New Roman"/>
-          <w:noProof/>
-          <w:kern w:val="0"/>
-          <w:sz w:val="22"/>
-          <w:szCs w:val="22"/>
-          <w14:ligatures w14:val="none"/>
-        </w:rPr>
-        <w:drawing>
-          <wp:inline distT="0" distB="0" distL="0" distR="0" wp14:anchorId="43F1E04E" wp14:editId="3136E4DB">
-            <wp:extent cx="1867161" cy="200053"/>
-            <wp:effectExtent l="0" t="0" r="0" b="9525"/>
-            <wp:docPr id="1726588786" name="Picture 1"/>
-            <wp:cNvGraphicFramePr>
-              <a:graphicFrameLocks xmlns:a="http://schemas.openxmlformats.org/drawingml/2006/main" noChangeAspect="1"/>
-            </wp:cNvGraphicFramePr>
-            <a:graphic xmlns:a="http://schemas.openxmlformats.org/drawingml/2006/main">
-              <a:graphicData uri="http://schemas.openxmlformats.org/drawingml/2006/picture">
-                <pic:pic xmlns:pic="http://schemas.openxmlformats.org/drawingml/2006/picture">
-                  <pic:nvPicPr>
-                    <pic:cNvPr id="1726588786" name=""/>
-                    <pic:cNvPicPr/>
-                  </pic:nvPicPr>
-                  <pic:blipFill>
-                    <a:blip r:embed="rId13"/>
-                    <a:stretch>
-                      <a:fillRect/>
-                    </a:stretch>
-                  </pic:blipFill>
-                  <pic:spPr>
-                    <a:xfrm>
-                      <a:off x="0" y="0"/>
-                      <a:ext cx="1867161" cy="200053"/>
-                    </a:xfrm>
-                    <a:prstGeom prst="rect">
-                      <a:avLst/>
-                    </a:prstGeom>
-                  </pic:spPr>
-                </pic:pic>
-              </a:graphicData>
-            </a:graphic>
-          </wp:inline>
-        </w:drawing>
-      </w:r>
     </w:p>
     <w:p>
       <w:pPr>
@@ -2480,26 +2091,6 @@
         </w:rPr>
         <w:t xml:space="preserve"> – </w:t>
       </w:r>
-      <w:r>
-        <w:rPr>
-          <w:rFonts w:ascii="Helvetica" w:eastAsia="Calibri" w:hAnsi="Helvetica" w:cs="Times New Roman"/>
-          <w:kern w:val="0"/>
-          <w:sz w:val="22"/>
-          <w:szCs w:val="22"/>
-          <w14:ligatures w14:val="none"/>
-        </w:rPr>
-        <w:t>Non-Toxic</w:t>
-      </w:r>
-      <w:r>
-        <w:rPr>
-          <w:rFonts w:ascii="Helvetica" w:eastAsia="Calibri" w:hAnsi="Helvetica" w:cs="Times New Roman"/>
-          <w:kern w:val="0"/>
-          <w:sz w:val="22"/>
-          <w:szCs w:val="22"/>
-          <w14:ligatures w14:val="none"/>
-        </w:rPr>
-        <w:t xml:space="preserve"> Text results</w:t>
-      </w:r>
     </w:p>
     <w:p>
       <w:pPr>
@@ -2547,16 +2138,6 @@
         </w:rPr>
         <w:t xml:space="preserve"> – </w:t>
       </w:r>
-      <w:r>
-        <w:rPr>
-          <w:rFonts w:ascii="Helvetica" w:eastAsia="Calibri" w:hAnsi="Helvetica" w:cs="Times New Roman"/>
-          <w:kern w:val="0"/>
-          <w:sz w:val="22"/>
-          <w:szCs w:val="22"/>
-          <w14:ligatures w14:val="none"/>
-        </w:rPr>
-        <w:t>We can see that the model identified the text as non-toxic with 99.98% probability</w:t>
-      </w:r>
     </w:p>
     <w:p>
       <w:pPr>
@@ -2583,51 +2164,6 @@
           <w14:ligatures w14:val="none"/>
         </w:rPr>
       </w:pPr>
-      <w:r>
-        <w:rPr>
-          <w:rFonts w:ascii="Helvetica" w:eastAsia="Calibri" w:hAnsi="Helvetica" w:cs="Times New Roman"/>
-          <w:noProof/>
-          <w:kern w:val="0"/>
-          <w:sz w:val="22"/>
-          <w:szCs w:val="22"/>
-          <w14:ligatures w14:val="none"/>
-        </w:rPr>
-        <w:drawing>
-          <wp:inline distT="0" distB="0" distL="0" distR="0" wp14:anchorId="5D45B95B" wp14:editId="56E4B066">
-            <wp:extent cx="5582429" cy="543001"/>
-            <wp:effectExtent l="0" t="0" r="0" b="9525"/>
-            <wp:docPr id="1804719779" name="Picture 1"/>
-            <wp:cNvGraphicFramePr>
-              <a:graphicFrameLocks xmlns:a="http://schemas.openxmlformats.org/drawingml/2006/main" noChangeAspect="1"/>
-            </wp:cNvGraphicFramePr>
-            <a:graphic xmlns:a="http://schemas.openxmlformats.org/drawingml/2006/main">
-              <a:graphicData uri="http://schemas.openxmlformats.org/drawingml/2006/picture">
-                <pic:pic xmlns:pic="http://schemas.openxmlformats.org/drawingml/2006/picture">
-                  <pic:nvPicPr>
-                    <pic:cNvPr id="1804719779" name=""/>
-                    <pic:cNvPicPr/>
-                  </pic:nvPicPr>
-                  <pic:blipFill>
-                    <a:blip r:embed="rId14"/>
-                    <a:stretch>
-                      <a:fillRect/>
-                    </a:stretch>
-                  </pic:blipFill>
-                  <pic:spPr>
-                    <a:xfrm>
-                      <a:off x="0" y="0"/>
-                      <a:ext cx="5582429" cy="543001"/>
-                    </a:xfrm>
-                    <a:prstGeom prst="rect">
-                      <a:avLst/>
-                    </a:prstGeom>
-                  </pic:spPr>
-                </pic:pic>
-              </a:graphicData>
-            </a:graphic>
-          </wp:inline>
-        </w:drawing>
-      </w:r>
     </w:p>
     <w:p>
       <w:pPr>
@@ -2701,16 +2237,6 @@
         </w:rPr>
         <w:t xml:space="preserve"> – </w:t>
       </w:r>
-      <w:r>
-        <w:rPr>
-          <w:rFonts w:ascii="Helvetica" w:eastAsia="Calibri" w:hAnsi="Helvetica" w:cs="Times New Roman"/>
-          <w:kern w:val="0"/>
-          <w:sz w:val="22"/>
-          <w:szCs w:val="22"/>
-          <w14:ligatures w14:val="none"/>
-        </w:rPr>
-        <w:t>Toxic Text results</w:t>
-      </w:r>
     </w:p>
     <w:p>
       <w:pPr>
@@ -2758,16 +2284,6 @@
         </w:rPr>
         <w:t xml:space="preserve"> – </w:t>
       </w:r>
-      <w:r>
-        <w:rPr>
-          <w:rFonts w:ascii="Helvetica" w:eastAsia="Calibri" w:hAnsi="Helvetica" w:cs="Times New Roman"/>
-          <w:kern w:val="0"/>
-          <w:sz w:val="22"/>
-          <w:szCs w:val="22"/>
-          <w14:ligatures w14:val="none"/>
-        </w:rPr>
-        <w:t>We can see that the model identified the text as toxic with a 97.45% probability</w:t>
-      </w:r>
     </w:p>
     <w:p>
       <w:pPr>
@@ -2794,51 +2310,6 @@
           <w14:ligatures w14:val="none"/>
         </w:rPr>
       </w:pPr>
-      <w:r>
-        <w:rPr>
-          <w:rFonts w:ascii="Helvetica" w:eastAsia="Calibri" w:hAnsi="Helvetica" w:cs="Times New Roman"/>
-          <w:noProof/>
-          <w:kern w:val="0"/>
-          <w:sz w:val="22"/>
-          <w:szCs w:val="22"/>
-          <w14:ligatures w14:val="none"/>
-        </w:rPr>
-        <w:drawing>
-          <wp:inline distT="0" distB="0" distL="0" distR="0" wp14:anchorId="45402E6F" wp14:editId="4A423FF3">
-            <wp:extent cx="5153744" cy="485843"/>
-            <wp:effectExtent l="0" t="0" r="0" b="9525"/>
-            <wp:docPr id="499467190" name="Picture 1"/>
-            <wp:cNvGraphicFramePr>
-              <a:graphicFrameLocks xmlns:a="http://schemas.openxmlformats.org/drawingml/2006/main" noChangeAspect="1"/>
-            </wp:cNvGraphicFramePr>
-            <a:graphic xmlns:a="http://schemas.openxmlformats.org/drawingml/2006/main">
-              <a:graphicData uri="http://schemas.openxmlformats.org/drawingml/2006/picture">
-                <pic:pic xmlns:pic="http://schemas.openxmlformats.org/drawingml/2006/picture">
-                  <pic:nvPicPr>
-                    <pic:cNvPr id="499467190" name=""/>
-                    <pic:cNvPicPr/>
-                  </pic:nvPicPr>
-                  <pic:blipFill>
-                    <a:blip r:embed="rId15"/>
-                    <a:stretch>
-                      <a:fillRect/>
-                    </a:stretch>
-                  </pic:blipFill>
-                  <pic:spPr>
-                    <a:xfrm>
-                      <a:off x="0" y="0"/>
-                      <a:ext cx="5153744" cy="485843"/>
-                    </a:xfrm>
-                    <a:prstGeom prst="rect">
-                      <a:avLst/>
-                    </a:prstGeom>
-                  </pic:spPr>
-                </pic:pic>
-              </a:graphicData>
-            </a:graphic>
-          </wp:inline>
-        </w:drawing>
-      </w:r>
     </w:p>
     <w:p>
       <w:pPr>
@@ -2886,16 +2357,6 @@
         </w:rPr>
         <w:t xml:space="preserve"> – </w:t>
       </w:r>
-      <w:r>
-        <w:rPr>
-          <w:rFonts w:ascii="Helvetica" w:eastAsia="Calibri" w:hAnsi="Helvetica" w:cs="Times New Roman"/>
-          <w:kern w:val="0"/>
-          <w:sz w:val="22"/>
-          <w:szCs w:val="22"/>
-          <w14:ligatures w14:val="none"/>
-        </w:rPr>
-        <w:t>Toxicity mean/std before detox</w:t>
-      </w:r>
     </w:p>
     <w:p>
       <w:pPr>
@@ -2943,16 +2404,6 @@
         </w:rPr>
         <w:t xml:space="preserve"> – </w:t>
       </w:r>
-      <w:r>
-        <w:rPr>
-          <w:rFonts w:ascii="Helvetica" w:eastAsia="Calibri" w:hAnsi="Helvetica" w:cs="Times New Roman"/>
-          <w:kern w:val="0"/>
-          <w:sz w:val="22"/>
-          <w:szCs w:val="22"/>
-          <w14:ligatures w14:val="none"/>
-        </w:rPr>
-        <w:t>Mean and Std shows it’s naturally polite and consistent</w:t>
-      </w:r>
     </w:p>
     <w:p>
       <w:pPr>
@@ -2979,51 +2430,6 @@
           <w14:ligatures w14:val="none"/>
         </w:rPr>
       </w:pPr>
-      <w:r>
-        <w:rPr>
-          <w:rFonts w:ascii="Helvetica" w:eastAsia="Calibri" w:hAnsi="Helvetica" w:cs="Times New Roman"/>
-          <w:noProof/>
-          <w:kern w:val="0"/>
-          <w:sz w:val="22"/>
-          <w:szCs w:val="22"/>
-          <w14:ligatures w14:val="none"/>
-        </w:rPr>
-        <w:drawing>
-          <wp:inline distT="0" distB="0" distL="0" distR="0" wp14:anchorId="21B53FCB" wp14:editId="415D1E52">
-            <wp:extent cx="5877745" cy="581106"/>
-            <wp:effectExtent l="0" t="0" r="8890" b="9525"/>
-            <wp:docPr id="160833480" name="Picture 1"/>
-            <wp:cNvGraphicFramePr>
-              <a:graphicFrameLocks xmlns:a="http://schemas.openxmlformats.org/drawingml/2006/main" noChangeAspect="1"/>
-            </wp:cNvGraphicFramePr>
-            <a:graphic xmlns:a="http://schemas.openxmlformats.org/drawingml/2006/main">
-              <a:graphicData uri="http://schemas.openxmlformats.org/drawingml/2006/picture">
-                <pic:pic xmlns:pic="http://schemas.openxmlformats.org/drawingml/2006/picture">
-                  <pic:nvPicPr>
-                    <pic:cNvPr id="160833480" name=""/>
-                    <pic:cNvPicPr/>
-                  </pic:nvPicPr>
-                  <pic:blipFill>
-                    <a:blip r:embed="rId16"/>
-                    <a:stretch>
-                      <a:fillRect/>
-                    </a:stretch>
-                  </pic:blipFill>
-                  <pic:spPr>
-                    <a:xfrm>
-                      <a:off x="0" y="0"/>
-                      <a:ext cx="5877745" cy="581106"/>
-                    </a:xfrm>
-                    <a:prstGeom prst="rect">
-                      <a:avLst/>
-                    </a:prstGeom>
-                  </pic:spPr>
-                </pic:pic>
-              </a:graphicData>
-            </a:graphic>
-          </wp:inline>
-        </w:drawing>
-      </w:r>
     </w:p>
     <w:p>
       <w:pPr>
@@ -3071,16 +2477,6 @@
         </w:rPr>
         <w:t xml:space="preserve"> – </w:t>
       </w:r>
-      <w:r>
-        <w:rPr>
-          <w:rFonts w:ascii="Helvetica" w:eastAsia="Calibri" w:hAnsi="Helvetica" w:cs="Times New Roman"/>
-          <w:kern w:val="0"/>
-          <w:sz w:val="22"/>
-          <w:szCs w:val="22"/>
-          <w14:ligatures w14:val="none"/>
-        </w:rPr>
-        <w:t>Toxicity mean/std after detox</w:t>
-      </w:r>
     </w:p>
     <w:p>
       <w:pPr>
@@ -3128,16 +2524,6 @@
         </w:rPr>
         <w:t xml:space="preserve"> – </w:t>
       </w:r>
-      <w:r>
-        <w:rPr>
-          <w:rFonts w:ascii="Helvetica" w:eastAsia="Calibri" w:hAnsi="Helvetica" w:cs="Times New Roman"/>
-          <w:kern w:val="0"/>
-          <w:sz w:val="22"/>
-          <w:szCs w:val="22"/>
-          <w14:ligatures w14:val="none"/>
-        </w:rPr>
-        <w:t>Still fairly the same as previous</w:t>
-      </w:r>
     </w:p>
     <w:p>
       <w:pPr>
@@ -3164,51 +2550,6 @@
           <w14:ligatures w14:val="none"/>
         </w:rPr>
       </w:pPr>
-      <w:r>
-        <w:rPr>
-          <w:rFonts w:ascii="Helvetica" w:eastAsia="Calibri" w:hAnsi="Helvetica" w:cs="Times New Roman"/>
-          <w:noProof/>
-          <w:kern w:val="0"/>
-          <w:sz w:val="22"/>
-          <w:szCs w:val="22"/>
-          <w14:ligatures w14:val="none"/>
-        </w:rPr>
-        <w:drawing>
-          <wp:inline distT="0" distB="0" distL="0" distR="0" wp14:anchorId="34002AB7" wp14:editId="05737691">
-            <wp:extent cx="5506218" cy="485843"/>
-            <wp:effectExtent l="0" t="0" r="0" b="9525"/>
-            <wp:docPr id="1227258875" name="Picture 1"/>
-            <wp:cNvGraphicFramePr>
-              <a:graphicFrameLocks xmlns:a="http://schemas.openxmlformats.org/drawingml/2006/main" noChangeAspect="1"/>
-            </wp:cNvGraphicFramePr>
-            <a:graphic xmlns:a="http://schemas.openxmlformats.org/drawingml/2006/main">
-              <a:graphicData uri="http://schemas.openxmlformats.org/drawingml/2006/picture">
-                <pic:pic xmlns:pic="http://schemas.openxmlformats.org/drawingml/2006/picture">
-                  <pic:nvPicPr>
-                    <pic:cNvPr id="1227258875" name=""/>
-                    <pic:cNvPicPr/>
-                  </pic:nvPicPr>
-                  <pic:blipFill>
-                    <a:blip r:embed="rId17"/>
-                    <a:stretch>
-                      <a:fillRect/>
-                    </a:stretch>
-                  </pic:blipFill>
-                  <pic:spPr>
-                    <a:xfrm>
-                      <a:off x="0" y="0"/>
-                      <a:ext cx="5506218" cy="485843"/>
-                    </a:xfrm>
-                    <a:prstGeom prst="rect">
-                      <a:avLst/>
-                    </a:prstGeom>
-                  </pic:spPr>
-                </pic:pic>
-              </a:graphicData>
-            </a:graphic>
-          </wp:inline>
-        </w:drawing>
-      </w:r>
     </w:p>
     <w:p>
       <w:pPr>
@@ -3254,7 +2595,7 @@
           <w:szCs w:val="22"/>
           <w14:ligatures w14:val="none"/>
         </w:rPr>
-        <w:t xml:space="preserve"> – Evaluation of Model Quantitatively</w:t>
+        <w:t xml:space="preserve"> – </w:t>
       </w:r>
     </w:p>
     <w:p>
@@ -3301,7 +2642,7 @@
           <w:szCs w:val="22"/>
           <w14:ligatures w14:val="none"/>
         </w:rPr>
-        <w:t xml:space="preserve"> – High negative mean and std due to low step count</w:t>
+        <w:t xml:space="preserve"> – </w:t>
       </w:r>
     </w:p>
     <w:p>
@@ -3328,51 +2669,6 @@
           <w14:ligatures w14:val="none"/>
         </w:rPr>
       </w:pPr>
-      <w:r>
-        <w:rPr>
-          <w:rFonts w:ascii="Helvetica" w:eastAsia="Calibri" w:hAnsi="Helvetica" w:cs="Times New Roman"/>
-          <w:noProof/>
-          <w:kern w:val="0"/>
-          <w:sz w:val="22"/>
-          <w:szCs w:val="22"/>
-          <w14:ligatures w14:val="none"/>
-        </w:rPr>
-        <w:drawing>
-          <wp:inline distT="0" distB="0" distL="0" distR="0" wp14:anchorId="143FD5E9" wp14:editId="6FFDF4ED">
-            <wp:extent cx="4391638" cy="485843"/>
-            <wp:effectExtent l="0" t="0" r="0" b="9525"/>
-            <wp:docPr id="1265927405" name="Picture 1"/>
-            <wp:cNvGraphicFramePr>
-              <a:graphicFrameLocks xmlns:a="http://schemas.openxmlformats.org/drawingml/2006/main" noChangeAspect="1"/>
-            </wp:cNvGraphicFramePr>
-            <a:graphic xmlns:a="http://schemas.openxmlformats.org/drawingml/2006/main">
-              <a:graphicData uri="http://schemas.openxmlformats.org/drawingml/2006/picture">
-                <pic:pic xmlns:pic="http://schemas.openxmlformats.org/drawingml/2006/picture">
-                  <pic:nvPicPr>
-                    <pic:cNvPr id="1265927405" name=""/>
-                    <pic:cNvPicPr/>
-                  </pic:nvPicPr>
-                  <pic:blipFill>
-                    <a:blip r:embed="rId18"/>
-                    <a:stretch>
-                      <a:fillRect/>
-                    </a:stretch>
-                  </pic:blipFill>
-                  <pic:spPr>
-                    <a:xfrm>
-                      <a:off x="0" y="0"/>
-                      <a:ext cx="4391638" cy="485843"/>
-                    </a:xfrm>
-                    <a:prstGeom prst="rect">
-                      <a:avLst/>
-                    </a:prstGeom>
-                  </pic:spPr>
-                </pic:pic>
-              </a:graphicData>
-            </a:graphic>
-          </wp:inline>
-        </w:drawing>
-      </w:r>
     </w:p>
     <w:p>
       <w:pPr>
@@ -3450,51 +2746,7 @@
           <w:szCs w:val="22"/>
           <w14:ligatures w14:val="none"/>
         </w:rPr>
-        <w:t xml:space="preserve">In Part 1, the primary challenges were from the kernel memory issues specifically the mismatched versions between the </w:t>
-      </w:r>
-      <w:proofErr w:type="spellStart"/>
-      <w:r>
-        <w:rPr>
-          <w:rFonts w:ascii="Helvetica" w:eastAsia="Times New Roman" w:hAnsi="Helvetica" w:cs="Helvetica"/>
-          <w:kern w:val="0"/>
-          <w:sz w:val="22"/>
-          <w:szCs w:val="22"/>
-          <w14:ligatures w14:val="none"/>
-        </w:rPr>
-        <w:t>trl</w:t>
-      </w:r>
-      <w:proofErr w:type="spellEnd"/>
-      <w:r>
-        <w:rPr>
-          <w:rFonts w:ascii="Helvetica" w:eastAsia="Times New Roman" w:hAnsi="Helvetica" w:cs="Helvetica"/>
-          <w:kern w:val="0"/>
-          <w:sz w:val="22"/>
-          <w:szCs w:val="22"/>
-          <w14:ligatures w14:val="none"/>
-        </w:rPr>
-        <w:t xml:space="preserve"> library and transformers packages which gave </w:t>
-      </w:r>
-      <w:proofErr w:type="spellStart"/>
-      <w:r>
-        <w:rPr>
-          <w:rFonts w:ascii="Helvetica" w:eastAsia="Times New Roman" w:hAnsi="Helvetica" w:cs="Helvetica"/>
-          <w:kern w:val="0"/>
-          <w:sz w:val="22"/>
-          <w:szCs w:val="22"/>
-          <w14:ligatures w14:val="none"/>
-        </w:rPr>
-        <w:t>RuntimeErrors</w:t>
-      </w:r>
-      <w:proofErr w:type="spellEnd"/>
-      <w:r>
-        <w:rPr>
-          <w:rFonts w:ascii="Helvetica" w:eastAsia="Times New Roman" w:hAnsi="Helvetica" w:cs="Helvetica"/>
-          <w:kern w:val="0"/>
-          <w:sz w:val="22"/>
-          <w:szCs w:val="22"/>
-          <w14:ligatures w14:val="none"/>
-        </w:rPr>
-        <w:t xml:space="preserve">. I solved it by modifying the pip install line at the beginning and added “transformers==4.44.2” and restarting the kernel after. During the RLHF phase, I faced issues with the reward model using CPU to evaluate the pipeline. I overwrote it by moving the PPO model’s value heads using “ppo_model.v_head.to(device)” and “ref_model.v_head.to(device)”. </w:t>
+        <w:t xml:space="preserve"> </w:t>
       </w:r>
     </w:p>
     <w:p>
@@ -3618,8 +2870,9 @@
         <w:pStyle w:val="ListParagraph"/>
         <w:numPr>
           <w:ilvl w:val="0"/>
-          <w:numId w:val="2"/>
+          <w:numId w:val="8"/>
         </w:numPr>
+        <w:spacing w:after="0" w:line="240" w:lineRule="auto"/>
         <w:jc w:val="both"/>
         <w:rPr>
           <w:rFonts w:ascii="Helvetica" w:eastAsia="Times New Roman" w:hAnsi="Helvetica" w:cs="Helvetica"/>
@@ -3639,7 +2892,7 @@
           <w:szCs w:val="22"/>
           <w14:ligatures w14:val="none"/>
         </w:rPr>
-        <w:t xml:space="preserve">The key components and hyperparameters defined in the </w:t>
+        <w:t>Based on the code, the APIs used for chunking the documents is “</w:t>
       </w:r>
       <w:proofErr w:type="spellStart"/>
       <w:r>
@@ -3651,7 +2904,7 @@
           <w:szCs w:val="22"/>
           <w14:ligatures w14:val="none"/>
         </w:rPr>
-        <w:t>LoraConfig</w:t>
+        <w:t>RecursiveCharacterTextSplitter</w:t>
       </w:r>
       <w:proofErr w:type="spellEnd"/>
       <w:r>
@@ -3663,380 +2916,85 @@
           <w:szCs w:val="22"/>
           <w14:ligatures w14:val="none"/>
         </w:rPr>
-        <w:t xml:space="preserve"> are:</w:t>
+        <w:t xml:space="preserve">” inside the </w:t>
+      </w:r>
+      <w:proofErr w:type="spellStart"/>
+      <w:r>
+        <w:rPr>
+          <w:rFonts w:ascii="Helvetica" w:eastAsia="Times New Roman" w:hAnsi="Helvetica" w:cs="Helvetica"/>
+          <w:bCs/>
+          <w:kern w:val="0"/>
+          <w:sz w:val="22"/>
+          <w:szCs w:val="22"/>
+          <w14:ligatures w14:val="none"/>
+        </w:rPr>
+        <w:t>build_vectordb</w:t>
+      </w:r>
+      <w:proofErr w:type="spellEnd"/>
+      <w:r>
+        <w:rPr>
+          <w:rFonts w:ascii="Helvetica" w:eastAsia="Times New Roman" w:hAnsi="Helvetica" w:cs="Helvetica"/>
+          <w:bCs/>
+          <w:kern w:val="0"/>
+          <w:sz w:val="22"/>
+          <w:szCs w:val="22"/>
+          <w14:ligatures w14:val="none"/>
+        </w:rPr>
+        <w:t xml:space="preserve"> method. It uses two arguments, “</w:t>
+      </w:r>
+      <w:proofErr w:type="spellStart"/>
+      <w:r>
+        <w:rPr>
+          <w:rFonts w:ascii="Helvetica" w:eastAsia="Times New Roman" w:hAnsi="Helvetica" w:cs="Helvetica"/>
+          <w:bCs/>
+          <w:kern w:val="0"/>
+          <w:sz w:val="22"/>
+          <w:szCs w:val="22"/>
+          <w14:ligatures w14:val="none"/>
+        </w:rPr>
+        <w:t>chunk_size</w:t>
+      </w:r>
+      <w:proofErr w:type="spellEnd"/>
+      <w:r>
+        <w:rPr>
+          <w:rFonts w:ascii="Helvetica" w:eastAsia="Times New Roman" w:hAnsi="Helvetica" w:cs="Helvetica"/>
+          <w:bCs/>
+          <w:kern w:val="0"/>
+          <w:sz w:val="22"/>
+          <w:szCs w:val="22"/>
+          <w14:ligatures w14:val="none"/>
+        </w:rPr>
+        <w:t>” and “</w:t>
+      </w:r>
+      <w:proofErr w:type="spellStart"/>
+      <w:r>
+        <w:rPr>
+          <w:rFonts w:ascii="Helvetica" w:eastAsia="Times New Roman" w:hAnsi="Helvetica" w:cs="Helvetica"/>
+          <w:bCs/>
+          <w:kern w:val="0"/>
+          <w:sz w:val="22"/>
+          <w:szCs w:val="22"/>
+          <w14:ligatures w14:val="none"/>
+        </w:rPr>
+        <w:t>chunk_overlap</w:t>
+      </w:r>
+      <w:proofErr w:type="spellEnd"/>
+      <w:r>
+        <w:rPr>
+          <w:rFonts w:ascii="Helvetica" w:eastAsia="Times New Roman" w:hAnsi="Helvetica" w:cs="Helvetica"/>
+          <w:bCs/>
+          <w:kern w:val="0"/>
+          <w:sz w:val="22"/>
+          <w:szCs w:val="22"/>
+          <w14:ligatures w14:val="none"/>
+        </w:rPr>
+        <w:t>”.</w:t>
       </w:r>
     </w:p>
     <w:p>
       <w:pPr>
         <w:pStyle w:val="ListParagraph"/>
-        <w:numPr>
-          <w:ilvl w:val="1"/>
-          <w:numId w:val="2"/>
-        </w:numPr>
-        <w:jc w:val="both"/>
-        <w:rPr>
-          <w:rFonts w:ascii="Helvetica" w:eastAsia="Times New Roman" w:hAnsi="Helvetica" w:cs="Helvetica"/>
-          <w:bCs/>
-          <w:kern w:val="0"/>
-          <w:sz w:val="22"/>
-          <w:szCs w:val="22"/>
-          <w14:ligatures w14:val="none"/>
-        </w:rPr>
-      </w:pPr>
-      <w:r>
-        <w:rPr>
-          <w:rFonts w:ascii="Helvetica" w:eastAsia="Times New Roman" w:hAnsi="Helvetica" w:cs="Helvetica"/>
-          <w:bCs/>
-          <w:kern w:val="0"/>
-          <w:sz w:val="22"/>
-          <w:szCs w:val="22"/>
-          <w14:ligatures w14:val="none"/>
-        </w:rPr>
-        <w:t xml:space="preserve">r (rank) – This determines the size of the matrices. It controls how much new information </w:t>
-      </w:r>
-      <w:proofErr w:type="spellStart"/>
-      <w:r>
-        <w:rPr>
-          <w:rFonts w:ascii="Helvetica" w:eastAsia="Times New Roman" w:hAnsi="Helvetica" w:cs="Helvetica"/>
-          <w:bCs/>
-          <w:kern w:val="0"/>
-          <w:sz w:val="22"/>
-          <w:szCs w:val="22"/>
-          <w14:ligatures w14:val="none"/>
-        </w:rPr>
-        <w:t>LoRA</w:t>
-      </w:r>
-      <w:proofErr w:type="spellEnd"/>
-      <w:r>
-        <w:rPr>
-          <w:rFonts w:ascii="Helvetica" w:eastAsia="Times New Roman" w:hAnsi="Helvetica" w:cs="Helvetica"/>
-          <w:bCs/>
-          <w:kern w:val="0"/>
-          <w:sz w:val="22"/>
-          <w:szCs w:val="22"/>
-          <w14:ligatures w14:val="none"/>
-        </w:rPr>
-        <w:t xml:space="preserve"> can learn.</w:t>
-      </w:r>
-    </w:p>
-    <w:p>
-      <w:pPr>
-        <w:pStyle w:val="ListParagraph"/>
-        <w:numPr>
-          <w:ilvl w:val="1"/>
-          <w:numId w:val="2"/>
-        </w:numPr>
-        <w:jc w:val="both"/>
-        <w:rPr>
-          <w:rFonts w:ascii="Helvetica" w:eastAsia="Times New Roman" w:hAnsi="Helvetica" w:cs="Helvetica"/>
-          <w:bCs/>
-          <w:kern w:val="0"/>
-          <w:sz w:val="22"/>
-          <w:szCs w:val="22"/>
-          <w14:ligatures w14:val="none"/>
-        </w:rPr>
-      </w:pPr>
-      <w:proofErr w:type="spellStart"/>
-      <w:r>
-        <w:rPr>
-          <w:rFonts w:ascii="Helvetica" w:eastAsia="Times New Roman" w:hAnsi="Helvetica" w:cs="Helvetica"/>
-          <w:bCs/>
-          <w:kern w:val="0"/>
-          <w:sz w:val="22"/>
-          <w:szCs w:val="22"/>
-          <w14:ligatures w14:val="none"/>
-        </w:rPr>
-        <w:lastRenderedPageBreak/>
-        <w:t>lora_alpha</w:t>
-      </w:r>
-      <w:proofErr w:type="spellEnd"/>
-      <w:r>
-        <w:rPr>
-          <w:rFonts w:ascii="Helvetica" w:eastAsia="Times New Roman" w:hAnsi="Helvetica" w:cs="Helvetica"/>
-          <w:bCs/>
-          <w:kern w:val="0"/>
-          <w:sz w:val="22"/>
-          <w:szCs w:val="22"/>
-          <w14:ligatures w14:val="none"/>
-        </w:rPr>
-        <w:t xml:space="preserve"> – This determines how aggressive the new </w:t>
-      </w:r>
-      <w:proofErr w:type="spellStart"/>
-      <w:r>
-        <w:rPr>
-          <w:rFonts w:ascii="Helvetica" w:eastAsia="Times New Roman" w:hAnsi="Helvetica" w:cs="Helvetica"/>
-          <w:bCs/>
-          <w:kern w:val="0"/>
-          <w:sz w:val="22"/>
-          <w:szCs w:val="22"/>
-          <w14:ligatures w14:val="none"/>
-        </w:rPr>
-        <w:t>LoRA</w:t>
-      </w:r>
-      <w:proofErr w:type="spellEnd"/>
-      <w:r>
-        <w:rPr>
-          <w:rFonts w:ascii="Helvetica" w:eastAsia="Times New Roman" w:hAnsi="Helvetica" w:cs="Helvetica"/>
-          <w:bCs/>
-          <w:kern w:val="0"/>
-          <w:sz w:val="22"/>
-          <w:szCs w:val="22"/>
-          <w14:ligatures w14:val="none"/>
-        </w:rPr>
-        <w:t xml:space="preserve"> weights influence the original base model. Higher values make the </w:t>
-      </w:r>
-      <w:proofErr w:type="spellStart"/>
-      <w:r>
-        <w:rPr>
-          <w:rFonts w:ascii="Helvetica" w:eastAsia="Times New Roman" w:hAnsi="Helvetica" w:cs="Helvetica"/>
-          <w:bCs/>
-          <w:kern w:val="0"/>
-          <w:sz w:val="22"/>
-          <w:szCs w:val="22"/>
-          <w14:ligatures w14:val="none"/>
-        </w:rPr>
-        <w:t>LoRA</w:t>
-      </w:r>
-      <w:proofErr w:type="spellEnd"/>
-      <w:r>
-        <w:rPr>
-          <w:rFonts w:ascii="Helvetica" w:eastAsia="Times New Roman" w:hAnsi="Helvetica" w:cs="Helvetica"/>
-          <w:bCs/>
-          <w:kern w:val="0"/>
-          <w:sz w:val="22"/>
-          <w:szCs w:val="22"/>
-          <w14:ligatures w14:val="none"/>
-        </w:rPr>
-        <w:t xml:space="preserve"> updates more influential.</w:t>
-      </w:r>
-    </w:p>
-    <w:p>
-      <w:pPr>
-        <w:pStyle w:val="ListParagraph"/>
-        <w:numPr>
-          <w:ilvl w:val="1"/>
-          <w:numId w:val="2"/>
-        </w:numPr>
-        <w:jc w:val="both"/>
-        <w:rPr>
-          <w:rFonts w:ascii="Helvetica" w:eastAsia="Times New Roman" w:hAnsi="Helvetica" w:cs="Helvetica"/>
-          <w:bCs/>
-          <w:kern w:val="0"/>
-          <w:sz w:val="22"/>
-          <w:szCs w:val="22"/>
-          <w14:ligatures w14:val="none"/>
-        </w:rPr>
-      </w:pPr>
-      <w:proofErr w:type="spellStart"/>
-      <w:r>
-        <w:rPr>
-          <w:rFonts w:ascii="Helvetica" w:eastAsia="Times New Roman" w:hAnsi="Helvetica" w:cs="Helvetica"/>
-          <w:bCs/>
-          <w:kern w:val="0"/>
-          <w:sz w:val="22"/>
-          <w:szCs w:val="22"/>
-          <w14:ligatures w14:val="none"/>
-        </w:rPr>
-        <w:t>target_modules</w:t>
-      </w:r>
-      <w:proofErr w:type="spellEnd"/>
-      <w:r>
-        <w:rPr>
-          <w:rFonts w:ascii="Helvetica" w:eastAsia="Times New Roman" w:hAnsi="Helvetica" w:cs="Helvetica"/>
-          <w:bCs/>
-          <w:kern w:val="0"/>
-          <w:sz w:val="22"/>
-          <w:szCs w:val="22"/>
-          <w14:ligatures w14:val="none"/>
-        </w:rPr>
-        <w:t xml:space="preserve"> – </w:t>
-      </w:r>
-      <w:r>
-        <w:rPr>
-          <w:rFonts w:ascii="Helvetica" w:eastAsia="Times New Roman" w:hAnsi="Helvetica" w:cs="Helvetica"/>
-          <w:bCs/>
-          <w:kern w:val="0"/>
-          <w:sz w:val="22"/>
-          <w:szCs w:val="22"/>
-          <w14:ligatures w14:val="none"/>
-        </w:rPr>
-        <w:t xml:space="preserve">This tells which layers too attach the </w:t>
-      </w:r>
-      <w:proofErr w:type="spellStart"/>
-      <w:r>
-        <w:rPr>
-          <w:rFonts w:ascii="Helvetica" w:eastAsia="Times New Roman" w:hAnsi="Helvetica" w:cs="Helvetica"/>
-          <w:bCs/>
-          <w:kern w:val="0"/>
-          <w:sz w:val="22"/>
-          <w:szCs w:val="22"/>
-          <w14:ligatures w14:val="none"/>
-        </w:rPr>
-        <w:t>LoRA</w:t>
-      </w:r>
-      <w:proofErr w:type="spellEnd"/>
-      <w:r>
-        <w:rPr>
-          <w:rFonts w:ascii="Helvetica" w:eastAsia="Times New Roman" w:hAnsi="Helvetica" w:cs="Helvetica"/>
-          <w:bCs/>
-          <w:kern w:val="0"/>
-          <w:sz w:val="22"/>
-          <w:szCs w:val="22"/>
-          <w14:ligatures w14:val="none"/>
-        </w:rPr>
-        <w:t xml:space="preserve"> matrices to.</w:t>
-      </w:r>
-    </w:p>
-    <w:p>
-      <w:pPr>
-        <w:pStyle w:val="ListParagraph"/>
-        <w:numPr>
-          <w:ilvl w:val="1"/>
-          <w:numId w:val="2"/>
-        </w:numPr>
-        <w:jc w:val="both"/>
-        <w:rPr>
-          <w:rFonts w:ascii="Helvetica" w:eastAsia="Times New Roman" w:hAnsi="Helvetica" w:cs="Helvetica"/>
-          <w:bCs/>
-          <w:kern w:val="0"/>
-          <w:sz w:val="22"/>
-          <w:szCs w:val="22"/>
-          <w14:ligatures w14:val="none"/>
-        </w:rPr>
-      </w:pPr>
-      <w:proofErr w:type="spellStart"/>
-      <w:r>
-        <w:rPr>
-          <w:rFonts w:ascii="Helvetica" w:eastAsia="Times New Roman" w:hAnsi="Helvetica" w:cs="Helvetica"/>
-          <w:bCs/>
-          <w:kern w:val="0"/>
-          <w:sz w:val="22"/>
-          <w:szCs w:val="22"/>
-          <w14:ligatures w14:val="none"/>
-        </w:rPr>
-        <w:t>lora_dropout</w:t>
-      </w:r>
-      <w:proofErr w:type="spellEnd"/>
-      <w:r>
-        <w:rPr>
-          <w:rFonts w:ascii="Helvetica" w:eastAsia="Times New Roman" w:hAnsi="Helvetica" w:cs="Helvetica"/>
-          <w:bCs/>
-          <w:kern w:val="0"/>
-          <w:sz w:val="22"/>
-          <w:szCs w:val="22"/>
-          <w14:ligatures w14:val="none"/>
-        </w:rPr>
-        <w:t xml:space="preserve"> – </w:t>
-      </w:r>
-      <w:r>
-        <w:rPr>
-          <w:rFonts w:ascii="Helvetica" w:eastAsia="Times New Roman" w:hAnsi="Helvetica" w:cs="Helvetica"/>
-          <w:bCs/>
-          <w:kern w:val="0"/>
-          <w:sz w:val="22"/>
-          <w:szCs w:val="22"/>
-          <w14:ligatures w14:val="none"/>
-        </w:rPr>
-        <w:t>This applies dropouts to the layers during training to prevent overfitting.</w:t>
-      </w:r>
-    </w:p>
-    <w:p>
-      <w:pPr>
-        <w:pStyle w:val="ListParagraph"/>
-        <w:numPr>
-          <w:ilvl w:val="1"/>
-          <w:numId w:val="2"/>
-        </w:numPr>
-        <w:jc w:val="both"/>
-        <w:rPr>
-          <w:rFonts w:ascii="Helvetica" w:eastAsia="Times New Roman" w:hAnsi="Helvetica" w:cs="Helvetica"/>
-          <w:bCs/>
-          <w:kern w:val="0"/>
-          <w:sz w:val="22"/>
-          <w:szCs w:val="22"/>
-          <w14:ligatures w14:val="none"/>
-        </w:rPr>
-      </w:pPr>
-      <w:r>
-        <w:rPr>
-          <w:rFonts w:ascii="Helvetica" w:eastAsia="Times New Roman" w:hAnsi="Helvetica" w:cs="Helvetica"/>
-          <w:bCs/>
-          <w:kern w:val="0"/>
-          <w:sz w:val="22"/>
-          <w:szCs w:val="22"/>
-          <w14:ligatures w14:val="none"/>
-        </w:rPr>
-        <w:t xml:space="preserve">bias – </w:t>
-      </w:r>
-      <w:r>
-        <w:rPr>
-          <w:rFonts w:ascii="Helvetica" w:eastAsia="Times New Roman" w:hAnsi="Helvetica" w:cs="Helvetica"/>
-          <w:bCs/>
-          <w:kern w:val="0"/>
-          <w:sz w:val="22"/>
-          <w:szCs w:val="22"/>
-          <w14:ligatures w14:val="none"/>
-        </w:rPr>
-        <w:t>This specifies if the bias weights should be trained or not</w:t>
-      </w:r>
-    </w:p>
-    <w:p>
-      <w:pPr>
-        <w:pStyle w:val="ListParagraph"/>
-        <w:numPr>
-          <w:ilvl w:val="1"/>
-          <w:numId w:val="2"/>
-        </w:numPr>
-        <w:jc w:val="both"/>
-        <w:rPr>
-          <w:rFonts w:ascii="Helvetica" w:eastAsia="Times New Roman" w:hAnsi="Helvetica" w:cs="Helvetica"/>
-          <w:bCs/>
-          <w:kern w:val="0"/>
-          <w:sz w:val="22"/>
-          <w:szCs w:val="22"/>
-          <w14:ligatures w14:val="none"/>
-        </w:rPr>
-      </w:pPr>
-      <w:proofErr w:type="spellStart"/>
-      <w:r>
-        <w:rPr>
-          <w:rFonts w:ascii="Helvetica" w:eastAsia="Times New Roman" w:hAnsi="Helvetica" w:cs="Helvetica"/>
-          <w:bCs/>
-          <w:kern w:val="0"/>
-          <w:sz w:val="22"/>
-          <w:szCs w:val="22"/>
-          <w14:ligatures w14:val="none"/>
-        </w:rPr>
-        <w:t>task_type</w:t>
-      </w:r>
-      <w:proofErr w:type="spellEnd"/>
-      <w:r>
-        <w:rPr>
-          <w:rFonts w:ascii="Helvetica" w:eastAsia="Times New Roman" w:hAnsi="Helvetica" w:cs="Helvetica"/>
-          <w:bCs/>
-          <w:kern w:val="0"/>
-          <w:sz w:val="22"/>
-          <w:szCs w:val="22"/>
-          <w14:ligatures w14:val="none"/>
-        </w:rPr>
-        <w:t xml:space="preserve"> – </w:t>
-      </w:r>
-      <w:r>
-        <w:rPr>
-          <w:rFonts w:ascii="Helvetica" w:eastAsia="Times New Roman" w:hAnsi="Helvetica" w:cs="Helvetica"/>
-          <w:bCs/>
-          <w:kern w:val="0"/>
-          <w:sz w:val="22"/>
-          <w:szCs w:val="22"/>
-          <w14:ligatures w14:val="none"/>
-        </w:rPr>
-        <w:t>This just defined the architecture’s goal or kind of task.</w:t>
-      </w:r>
-    </w:p>
-    <w:p>
-      <w:pPr>
-        <w:pStyle w:val="ListParagraph"/>
-        <w:ind w:left="1440"/>
+        <w:spacing w:after="0" w:line="240" w:lineRule="auto"/>
         <w:jc w:val="both"/>
         <w:rPr>
           <w:rFonts w:ascii="Helvetica" w:eastAsia="Times New Roman" w:hAnsi="Helvetica" w:cs="Helvetica"/>
@@ -4053,8 +3011,9 @@
         <w:pStyle w:val="ListParagraph"/>
         <w:numPr>
           <w:ilvl w:val="0"/>
-          <w:numId w:val="2"/>
+          <w:numId w:val="8"/>
         </w:numPr>
+        <w:spacing w:after="0" w:line="240" w:lineRule="auto"/>
         <w:jc w:val="both"/>
         <w:rPr>
           <w:rFonts w:ascii="Helvetica" w:eastAsia="Times New Roman" w:hAnsi="Helvetica" w:cs="Helvetica"/>
@@ -4074,8 +3033,9 @@
           <w:szCs w:val="22"/>
           <w14:ligatures w14:val="none"/>
         </w:rPr>
-        <w:t xml:space="preserve">ROUGE evaluates the summarization quality by measuring them comparing them with reference summary. </w:t>
-      </w:r>
+        <w:t xml:space="preserve">The </w:t>
+      </w:r>
+      <w:proofErr w:type="spellStart"/>
       <w:r>
         <w:rPr>
           <w:rFonts w:ascii="Helvetica" w:eastAsia="Times New Roman" w:hAnsi="Helvetica" w:cs="Helvetica"/>
@@ -4085,9 +3045,9 @@
           <w:szCs w:val="22"/>
           <w14:ligatures w14:val="none"/>
         </w:rPr>
-        <w:t xml:space="preserve">Based on the results above, we can see that the baseline achieved a rouge1 and rouge2 ~39.7% and ~13.6% respectively. But, after fine-tuning, rouge1 jumped to ~52.0% and rouge2 jumped to ~37.8%, similarly for </w:t>
-      </w:r>
-      <w:proofErr w:type="spellStart"/>
+        <w:t>top_k</w:t>
+      </w:r>
+      <w:proofErr w:type="spellEnd"/>
       <w:r>
         <w:rPr>
           <w:rFonts w:ascii="Helvetica" w:eastAsia="Times New Roman" w:hAnsi="Helvetica" w:cs="Helvetica"/>
@@ -4097,9 +3057,8 @@
           <w:szCs w:val="22"/>
           <w14:ligatures w14:val="none"/>
         </w:rPr>
-        <w:t>rougeL</w:t>
-      </w:r>
-      <w:proofErr w:type="spellEnd"/>
+        <w:t xml:space="preserve"> controls the number of document chunks to be retrieved from the database. So, increasing the parameter will provide the </w:t>
+      </w:r>
       <w:r>
         <w:rPr>
           <w:rFonts w:ascii="Helvetica" w:eastAsia="Times New Roman" w:hAnsi="Helvetica" w:cs="Helvetica"/>
@@ -4109,9 +3068,8 @@
           <w:szCs w:val="22"/>
           <w14:ligatures w14:val="none"/>
         </w:rPr>
-        <w:t xml:space="preserve"> and </w:t>
-      </w:r>
-      <w:proofErr w:type="spellStart"/>
+        <w:t>model with</w:t>
+      </w:r>
       <w:r>
         <w:rPr>
           <w:rFonts w:ascii="Helvetica" w:eastAsia="Times New Roman" w:hAnsi="Helvetica" w:cs="Helvetica"/>
@@ -4121,9 +3079,8 @@
           <w:szCs w:val="22"/>
           <w14:ligatures w14:val="none"/>
         </w:rPr>
-        <w:t>rougeLsum</w:t>
-      </w:r>
-      <w:proofErr w:type="spellEnd"/>
+        <w:t xml:space="preserve"> more information and allow for a more comprehensive response. </w:t>
+      </w:r>
       <w:r>
         <w:rPr>
           <w:rFonts w:ascii="Helvetica" w:eastAsia="Times New Roman" w:hAnsi="Helvetica" w:cs="Helvetica"/>
@@ -4133,13 +3090,9 @@
           <w:szCs w:val="22"/>
           <w14:ligatures w14:val="none"/>
         </w:rPr>
-        <w:t>.</w:t>
-      </w:r>
-    </w:p>
-    <w:p>
-      <w:pPr>
-        <w:pStyle w:val="ListParagraph"/>
-        <w:jc w:val="both"/>
+        <w:t>But</w:t>
+      </w:r>
+      <w:r>
         <w:rPr>
           <w:rFonts w:ascii="Helvetica" w:eastAsia="Times New Roman" w:hAnsi="Helvetica" w:cs="Helvetica"/>
           <w:bCs/>
@@ -4148,285 +3101,7 @@
           <w:szCs w:val="22"/>
           <w14:ligatures w14:val="none"/>
         </w:rPr>
-      </w:pPr>
-    </w:p>
-    <w:p>
-      <w:pPr>
-        <w:pStyle w:val="ListParagraph"/>
-        <w:numPr>
-          <w:ilvl w:val="1"/>
-          <w:numId w:val="2"/>
-        </w:numPr>
-        <w:jc w:val="both"/>
-        <w:rPr>
-          <w:rFonts w:ascii="Helvetica" w:eastAsia="Times New Roman" w:hAnsi="Helvetica" w:cs="Helvetica"/>
-          <w:bCs/>
-          <w:kern w:val="0"/>
-          <w:sz w:val="22"/>
-          <w:szCs w:val="22"/>
-          <w14:ligatures w14:val="none"/>
-        </w:rPr>
-      </w:pPr>
-      <w:r>
-        <w:rPr>
-          <w:rFonts w:ascii="Helvetica" w:eastAsia="Times New Roman" w:hAnsi="Helvetica" w:cs="Helvetica"/>
-          <w:bCs/>
-          <w:kern w:val="0"/>
-          <w:sz w:val="22"/>
-          <w:szCs w:val="22"/>
-          <w14:ligatures w14:val="none"/>
-        </w:rPr>
-        <w:t>r</w:t>
-      </w:r>
-      <w:r>
-        <w:rPr>
-          <w:rFonts w:ascii="Helvetica" w:eastAsia="Times New Roman" w:hAnsi="Helvetica" w:cs="Helvetica"/>
-          <w:bCs/>
-          <w:kern w:val="0"/>
-          <w:sz w:val="22"/>
-          <w:szCs w:val="22"/>
-          <w14:ligatures w14:val="none"/>
-        </w:rPr>
-        <w:t>ouge1 – measures the overlap of unigrams</w:t>
-      </w:r>
-    </w:p>
-    <w:p>
-      <w:pPr>
-        <w:pStyle w:val="ListParagraph"/>
-        <w:numPr>
-          <w:ilvl w:val="1"/>
-          <w:numId w:val="2"/>
-        </w:numPr>
-        <w:jc w:val="both"/>
-        <w:rPr>
-          <w:rFonts w:ascii="Helvetica" w:eastAsia="Times New Roman" w:hAnsi="Helvetica" w:cs="Helvetica"/>
-          <w:bCs/>
-          <w:kern w:val="0"/>
-          <w:sz w:val="22"/>
-          <w:szCs w:val="22"/>
-          <w14:ligatures w14:val="none"/>
-        </w:rPr>
-      </w:pPr>
-      <w:r>
-        <w:rPr>
-          <w:rFonts w:ascii="Helvetica" w:eastAsia="Times New Roman" w:hAnsi="Helvetica" w:cs="Helvetica"/>
-          <w:bCs/>
-          <w:kern w:val="0"/>
-          <w:sz w:val="22"/>
-          <w:szCs w:val="22"/>
-          <w14:ligatures w14:val="none"/>
-        </w:rPr>
-        <w:t>r</w:t>
-      </w:r>
-      <w:r>
-        <w:rPr>
-          <w:rFonts w:ascii="Helvetica" w:eastAsia="Times New Roman" w:hAnsi="Helvetica" w:cs="Helvetica"/>
-          <w:bCs/>
-          <w:kern w:val="0"/>
-          <w:sz w:val="22"/>
-          <w:szCs w:val="22"/>
-          <w14:ligatures w14:val="none"/>
-        </w:rPr>
-        <w:t>ouge2 – measures the overlap of bigrams</w:t>
-      </w:r>
-    </w:p>
-    <w:p>
-      <w:pPr>
-        <w:pStyle w:val="ListParagraph"/>
-        <w:numPr>
-          <w:ilvl w:val="1"/>
-          <w:numId w:val="2"/>
-        </w:numPr>
-        <w:jc w:val="both"/>
-        <w:rPr>
-          <w:rFonts w:ascii="Helvetica" w:eastAsia="Times New Roman" w:hAnsi="Helvetica" w:cs="Helvetica"/>
-          <w:bCs/>
-          <w:kern w:val="0"/>
-          <w:sz w:val="22"/>
-          <w:szCs w:val="22"/>
-          <w14:ligatures w14:val="none"/>
-        </w:rPr>
-      </w:pPr>
-      <w:proofErr w:type="spellStart"/>
-      <w:r>
-        <w:rPr>
-          <w:rFonts w:ascii="Helvetica" w:eastAsia="Times New Roman" w:hAnsi="Helvetica" w:cs="Helvetica"/>
-          <w:bCs/>
-          <w:kern w:val="0"/>
-          <w:sz w:val="22"/>
-          <w:szCs w:val="22"/>
-          <w14:ligatures w14:val="none"/>
-        </w:rPr>
-        <w:t>r</w:t>
-      </w:r>
-      <w:r>
-        <w:rPr>
-          <w:rFonts w:ascii="Helvetica" w:eastAsia="Times New Roman" w:hAnsi="Helvetica" w:cs="Helvetica"/>
-          <w:bCs/>
-          <w:kern w:val="0"/>
-          <w:sz w:val="22"/>
-          <w:szCs w:val="22"/>
-          <w14:ligatures w14:val="none"/>
-        </w:rPr>
-        <w:t>ougeL</w:t>
-      </w:r>
-      <w:proofErr w:type="spellEnd"/>
-      <w:r>
-        <w:rPr>
-          <w:rFonts w:ascii="Helvetica" w:eastAsia="Times New Roman" w:hAnsi="Helvetica" w:cs="Helvetica"/>
-          <w:bCs/>
-          <w:kern w:val="0"/>
-          <w:sz w:val="22"/>
-          <w:szCs w:val="22"/>
-          <w14:ligatures w14:val="none"/>
-        </w:rPr>
-        <w:t xml:space="preserve"> </w:t>
-      </w:r>
-      <w:r>
-        <w:rPr>
-          <w:rFonts w:ascii="Helvetica" w:eastAsia="Times New Roman" w:hAnsi="Helvetica" w:cs="Helvetica"/>
-          <w:bCs/>
-          <w:kern w:val="0"/>
-          <w:sz w:val="22"/>
-          <w:szCs w:val="22"/>
-          <w14:ligatures w14:val="none"/>
-        </w:rPr>
-        <w:t>–</w:t>
-      </w:r>
-      <w:r>
-        <w:rPr>
-          <w:rFonts w:ascii="Helvetica" w:eastAsia="Times New Roman" w:hAnsi="Helvetica" w:cs="Helvetica"/>
-          <w:bCs/>
-          <w:kern w:val="0"/>
-          <w:sz w:val="22"/>
-          <w:szCs w:val="22"/>
-          <w14:ligatures w14:val="none"/>
-        </w:rPr>
-        <w:t xml:space="preserve"> </w:t>
-      </w:r>
-      <w:r>
-        <w:rPr>
-          <w:rFonts w:ascii="Helvetica" w:eastAsia="Times New Roman" w:hAnsi="Helvetica" w:cs="Helvetica"/>
-          <w:bCs/>
-          <w:kern w:val="0"/>
-          <w:sz w:val="22"/>
-          <w:szCs w:val="22"/>
-          <w14:ligatures w14:val="none"/>
-        </w:rPr>
-        <w:t>measures the longest common subsequence</w:t>
-      </w:r>
-    </w:p>
-    <w:p>
-      <w:pPr>
-        <w:pStyle w:val="ListParagraph"/>
-        <w:numPr>
-          <w:ilvl w:val="1"/>
-          <w:numId w:val="2"/>
-        </w:numPr>
-        <w:jc w:val="both"/>
-        <w:rPr>
-          <w:rFonts w:ascii="Helvetica" w:eastAsia="Times New Roman" w:hAnsi="Helvetica" w:cs="Helvetica"/>
-          <w:bCs/>
-          <w:kern w:val="0"/>
-          <w:sz w:val="22"/>
-          <w:szCs w:val="22"/>
-          <w14:ligatures w14:val="none"/>
-        </w:rPr>
-      </w:pPr>
-      <w:proofErr w:type="spellStart"/>
-      <w:r>
-        <w:rPr>
-          <w:rFonts w:ascii="Helvetica" w:eastAsia="Times New Roman" w:hAnsi="Helvetica" w:cs="Helvetica"/>
-          <w:bCs/>
-          <w:kern w:val="0"/>
-          <w:sz w:val="22"/>
-          <w:szCs w:val="22"/>
-          <w14:ligatures w14:val="none"/>
-        </w:rPr>
-        <w:t>rougeLsum</w:t>
-      </w:r>
-      <w:proofErr w:type="spellEnd"/>
-      <w:r>
-        <w:rPr>
-          <w:rFonts w:ascii="Helvetica" w:eastAsia="Times New Roman" w:hAnsi="Helvetica" w:cs="Helvetica"/>
-          <w:bCs/>
-          <w:kern w:val="0"/>
-          <w:sz w:val="22"/>
-          <w:szCs w:val="22"/>
-          <w14:ligatures w14:val="none"/>
-        </w:rPr>
-        <w:t xml:space="preserve"> – similar to </w:t>
-      </w:r>
-      <w:proofErr w:type="spellStart"/>
-      <w:r>
-        <w:rPr>
-          <w:rFonts w:ascii="Helvetica" w:eastAsia="Times New Roman" w:hAnsi="Helvetica" w:cs="Helvetica"/>
-          <w:bCs/>
-          <w:kern w:val="0"/>
-          <w:sz w:val="22"/>
-          <w:szCs w:val="22"/>
-          <w14:ligatures w14:val="none"/>
-        </w:rPr>
-        <w:t>rougeL</w:t>
-      </w:r>
-      <w:proofErr w:type="spellEnd"/>
-      <w:r>
-        <w:rPr>
-          <w:rFonts w:ascii="Helvetica" w:eastAsia="Times New Roman" w:hAnsi="Helvetica" w:cs="Helvetica"/>
-          <w:bCs/>
-          <w:kern w:val="0"/>
-          <w:sz w:val="22"/>
-          <w:szCs w:val="22"/>
-          <w14:ligatures w14:val="none"/>
-        </w:rPr>
-        <w:t xml:space="preserve"> but calculates the entire summary</w:t>
-      </w:r>
-    </w:p>
-    <w:p>
-      <w:pPr>
-        <w:spacing w:after="0" w:line="240" w:lineRule="auto"/>
-        <w:jc w:val="both"/>
-        <w:rPr>
-          <w:rFonts w:ascii="Helvetica" w:eastAsia="Times New Roman" w:hAnsi="Helvetica" w:cs="Helvetica"/>
-          <w:bCs/>
-          <w:kern w:val="0"/>
-          <w:sz w:val="22"/>
-          <w:szCs w:val="22"/>
-          <w14:ligatures w14:val="none"/>
-        </w:rPr>
-      </w:pPr>
-      <w:r>
-        <w:rPr>
-          <w:rFonts w:ascii="Helvetica" w:eastAsia="Times New Roman" w:hAnsi="Helvetica" w:cs="Helvetica"/>
-          <w:bCs/>
-          <w:kern w:val="0"/>
-          <w:sz w:val="22"/>
-          <w:szCs w:val="22"/>
-          <w14:ligatures w14:val="none"/>
-        </w:rPr>
-        <w:t xml:space="preserve">Part 2 </w:t>
-      </w:r>
-      <w:r>
-        <w:rPr>
-          <w:rFonts w:ascii="Helvetica" w:eastAsia="Times New Roman" w:hAnsi="Helvetica" w:cs="Helvetica"/>
-          <w:bCs/>
-          <w:kern w:val="0"/>
-          <w:sz w:val="22"/>
-          <w:szCs w:val="22"/>
-          <w14:ligatures w14:val="none"/>
-        </w:rPr>
-        <w:t>Answers</w:t>
-      </w:r>
-      <w:r>
-        <w:rPr>
-          <w:rFonts w:ascii="Helvetica" w:eastAsia="Times New Roman" w:hAnsi="Helvetica" w:cs="Helvetica"/>
-          <w:bCs/>
-          <w:kern w:val="0"/>
-          <w:sz w:val="22"/>
-          <w:szCs w:val="22"/>
-          <w14:ligatures w14:val="none"/>
-        </w:rPr>
-        <w:t>:</w:t>
+        <w:t xml:space="preserve"> it can also lead to hallucinations because it can retrieve irrelevant information.</w:t>
       </w:r>
     </w:p>
     <w:p>
@@ -4448,36 +3123,146 @@
         <w:pStyle w:val="ListParagraph"/>
         <w:numPr>
           <w:ilvl w:val="0"/>
-          <w:numId w:val="3"/>
+          <w:numId w:val="8"/>
         </w:numPr>
+        <w:spacing w:after="0" w:line="240" w:lineRule="auto"/>
         <w:jc w:val="both"/>
         <w:rPr>
-          <w:rFonts w:ascii="Helvetica" w:eastAsia="Times New Roman" w:hAnsi="Helvetica" w:cs="Arial"/>
-          <w:bCs/>
-          <w:kern w:val="0"/>
-          <w:sz w:val="22"/>
-          <w:szCs w:val="22"/>
-          <w14:ligatures w14:val="none"/>
-        </w:rPr>
-      </w:pPr>
-      <w:r>
-        <w:rPr>
-          <w:rFonts w:ascii="Helvetica" w:eastAsia="Times New Roman" w:hAnsi="Helvetica" w:cs="Arial"/>
-          <w:bCs/>
-          <w:kern w:val="0"/>
-          <w:sz w:val="22"/>
-          <w:szCs w:val="22"/>
-          <w14:ligatures w14:val="none"/>
-        </w:rPr>
-        <w:t xml:space="preserve">Datasets are filtered by character or token length. It will drop dialogues shorter than 200 characters or longer than 1000 characters. Quality-wise, filtering out any long dialogues prevents the input from exceeding the max context window. Suitability-wise, filtering out short dialogues ensures the model isn’t trained on short words like “a, the, hi, or hello”. </w:t>
-      </w:r>
-    </w:p>
-    <w:p>
-      <w:pPr>
-        <w:pStyle w:val="ListParagraph"/>
+          <w:rFonts w:ascii="Helvetica" w:eastAsia="Times New Roman" w:hAnsi="Helvetica" w:cs="Helvetica"/>
+          <w:bCs/>
+          <w:kern w:val="0"/>
+          <w:sz w:val="22"/>
+          <w:szCs w:val="22"/>
+          <w14:ligatures w14:val="none"/>
+        </w:rPr>
+      </w:pPr>
+      <w:r>
+        <w:rPr>
+          <w:rFonts w:ascii="Helvetica" w:eastAsia="Times New Roman" w:hAnsi="Helvetica" w:cs="Helvetica"/>
+          <w:bCs/>
+          <w:kern w:val="0"/>
+          <w:sz w:val="22"/>
+          <w:szCs w:val="22"/>
+          <w14:ligatures w14:val="none"/>
+        </w:rPr>
+        <w:t xml:space="preserve">We should choose the </w:t>
+      </w:r>
+      <w:proofErr w:type="spellStart"/>
+      <w:r>
+        <w:rPr>
+          <w:rFonts w:ascii="Helvetica" w:eastAsia="Times New Roman" w:hAnsi="Helvetica" w:cs="Helvetica"/>
+          <w:bCs/>
+          <w:kern w:val="0"/>
+          <w:sz w:val="22"/>
+          <w:szCs w:val="22"/>
+          <w14:ligatures w14:val="none"/>
+        </w:rPr>
+        <w:t>PythonCodeTextSplitter</w:t>
+      </w:r>
+      <w:proofErr w:type="spellEnd"/>
+      <w:r>
+        <w:rPr>
+          <w:rFonts w:ascii="Helvetica" w:eastAsia="Times New Roman" w:hAnsi="Helvetica" w:cs="Helvetica"/>
+          <w:bCs/>
+          <w:kern w:val="0"/>
+          <w:sz w:val="22"/>
+          <w:szCs w:val="22"/>
+          <w14:ligatures w14:val="none"/>
+        </w:rPr>
+        <w:t xml:space="preserve"> for python programs. It is inherited from </w:t>
+      </w:r>
+      <w:proofErr w:type="spellStart"/>
+      <w:r>
+        <w:rPr>
+          <w:rFonts w:ascii="Helvetica" w:eastAsia="Times New Roman" w:hAnsi="Helvetica" w:cs="Helvetica"/>
+          <w:bCs/>
+          <w:kern w:val="0"/>
+          <w:sz w:val="22"/>
+          <w:szCs w:val="22"/>
+          <w14:ligatures w14:val="none"/>
+        </w:rPr>
+        <w:t>RecursiveCharacterTextSplitter</w:t>
+      </w:r>
+      <w:proofErr w:type="spellEnd"/>
+      <w:r>
+        <w:rPr>
+          <w:rFonts w:ascii="Helvetica" w:eastAsia="Times New Roman" w:hAnsi="Helvetica" w:cs="Helvetica"/>
+          <w:bCs/>
+          <w:kern w:val="0"/>
+          <w:sz w:val="22"/>
+          <w:szCs w:val="22"/>
+          <w14:ligatures w14:val="none"/>
+        </w:rPr>
+        <w:t>.</w:t>
+      </w:r>
+    </w:p>
+    <w:p>
+      <w:pPr>
+        <w:spacing w:after="0" w:line="240" w:lineRule="auto"/>
         <w:jc w:val="both"/>
         <w:rPr>
-          <w:rFonts w:ascii="Helvetica" w:eastAsia="Times New Roman" w:hAnsi="Helvetica" w:cs="Arial"/>
+          <w:rFonts w:ascii="Helvetica" w:eastAsia="Times New Roman" w:hAnsi="Helvetica" w:cs="Helvetica"/>
+          <w:bCs/>
+          <w:kern w:val="0"/>
+          <w:sz w:val="22"/>
+          <w:szCs w:val="22"/>
+          <w14:ligatures w14:val="none"/>
+        </w:rPr>
+      </w:pPr>
+    </w:p>
+    <w:p>
+      <w:pPr>
+        <w:spacing w:after="0" w:line="240" w:lineRule="auto"/>
+        <w:jc w:val="both"/>
+        <w:rPr>
+          <w:rFonts w:ascii="Helvetica" w:eastAsia="Times New Roman" w:hAnsi="Helvetica" w:cs="Helvetica"/>
+          <w:bCs/>
+          <w:kern w:val="0"/>
+          <w:sz w:val="22"/>
+          <w:szCs w:val="22"/>
+          <w14:ligatures w14:val="none"/>
+        </w:rPr>
+      </w:pPr>
+      <w:r>
+        <w:rPr>
+          <w:rFonts w:ascii="Helvetica" w:eastAsia="Times New Roman" w:hAnsi="Helvetica" w:cs="Helvetica"/>
+          <w:bCs/>
+          <w:kern w:val="0"/>
+          <w:sz w:val="22"/>
+          <w:szCs w:val="22"/>
+          <w14:ligatures w14:val="none"/>
+        </w:rPr>
+        <w:t xml:space="preserve">Part 2 </w:t>
+      </w:r>
+      <w:r>
+        <w:rPr>
+          <w:rFonts w:ascii="Helvetica" w:eastAsia="Times New Roman" w:hAnsi="Helvetica" w:cs="Helvetica"/>
+          <w:bCs/>
+          <w:kern w:val="0"/>
+          <w:sz w:val="22"/>
+          <w:szCs w:val="22"/>
+          <w14:ligatures w14:val="none"/>
+        </w:rPr>
+        <w:t>Answers</w:t>
+      </w:r>
+      <w:r>
+        <w:rPr>
+          <w:rFonts w:ascii="Helvetica" w:eastAsia="Times New Roman" w:hAnsi="Helvetica" w:cs="Helvetica"/>
+          <w:bCs/>
+          <w:kern w:val="0"/>
+          <w:sz w:val="22"/>
+          <w:szCs w:val="22"/>
+          <w14:ligatures w14:val="none"/>
+        </w:rPr>
+        <w:t>:</w:t>
+      </w:r>
+    </w:p>
+    <w:p>
+      <w:pPr>
+        <w:spacing w:after="0" w:line="240" w:lineRule="auto"/>
+        <w:jc w:val="both"/>
+        <w:rPr>
+          <w:rFonts w:ascii="Helvetica" w:eastAsia="Times New Roman" w:hAnsi="Helvetica" w:cs="Helvetica"/>
           <w:bCs/>
           <w:kern w:val="0"/>
           <w:sz w:val="22"/>
@@ -4491,107 +3276,15 @@
         <w:pStyle w:val="ListParagraph"/>
         <w:numPr>
           <w:ilvl w:val="0"/>
-          <w:numId w:val="3"/>
+          <w:numId w:val="9"/>
         </w:numPr>
-        <w:jc w:val="both"/>
+        <w:spacing w:after="0" w:line="240" w:lineRule="auto"/>
         <w:rPr>
           <w:rFonts w:ascii="Helvetica" w:eastAsia="Times New Roman" w:hAnsi="Helvetica" w:cs="Arial"/>
-          <w:bCs/>
-          <w:kern w:val="0"/>
-          <w:sz w:val="22"/>
-          <w:szCs w:val="22"/>
-          <w14:ligatures w14:val="none"/>
-        </w:rPr>
-      </w:pPr>
-      <w:r>
-        <w:rPr>
-          <w:rFonts w:ascii="Helvetica" w:eastAsia="Times New Roman" w:hAnsi="Helvetica" w:cs="Arial"/>
-          <w:bCs/>
-          <w:kern w:val="0"/>
-          <w:sz w:val="22"/>
-          <w:szCs w:val="22"/>
-          <w14:ligatures w14:val="none"/>
-        </w:rPr>
-        <w:t>The logit “not hate” is used as a reward signal by feeding it directly to the PPO algorithm.  Some advantages are that it is efficient because it optimizes for a continuous reward signal, meaning that higher “not hate” score equals better rewards and teaches the model to avoid toxicity. Some disadvantages are that it captures only one aspect of response quality. It does not check if the text is a good summary, has good grammar, or if it is a logical input at all.</w:t>
-      </w:r>
-    </w:p>
-    <w:p>
-      <w:pPr>
-        <w:pStyle w:val="ListParagraph"/>
-        <w:jc w:val="both"/>
-        <w:rPr>
-          <w:rFonts w:ascii="Helvetica" w:eastAsia="Times New Roman" w:hAnsi="Helvetica" w:cs="Arial"/>
-          <w:bCs/>
-          <w:kern w:val="0"/>
-          <w:sz w:val="22"/>
-          <w:szCs w:val="22"/>
-          <w14:ligatures w14:val="none"/>
-        </w:rPr>
-      </w:pPr>
-    </w:p>
-    <w:p>
-      <w:pPr>
-        <w:pStyle w:val="ListParagraph"/>
-        <w:numPr>
-          <w:ilvl w:val="0"/>
-          <w:numId w:val="3"/>
-        </w:numPr>
-        <w:jc w:val="both"/>
-        <w:rPr>
-          <w:rFonts w:ascii="Helvetica" w:eastAsia="Times New Roman" w:hAnsi="Helvetica" w:cs="Arial"/>
-          <w:bCs/>
-          <w:kern w:val="0"/>
-          <w:sz w:val="22"/>
-          <w:szCs w:val="22"/>
-          <w14:ligatures w14:val="none"/>
-        </w:rPr>
-      </w:pPr>
-      <w:r>
-        <w:rPr>
-          <w:rFonts w:ascii="Helvetica" w:eastAsia="Times New Roman" w:hAnsi="Helvetica" w:cs="Arial"/>
-          <w:bCs/>
-          <w:kern w:val="0"/>
-          <w:sz w:val="22"/>
-          <w:szCs w:val="22"/>
-          <w14:ligatures w14:val="none"/>
-        </w:rPr>
-        <w:t xml:space="preserve">Every time the model creates a summary, the </w:t>
-      </w:r>
-      <w:proofErr w:type="spellStart"/>
-      <w:r>
-        <w:rPr>
-          <w:rFonts w:ascii="Helvetica" w:eastAsia="Times New Roman" w:hAnsi="Helvetica" w:cs="Arial"/>
-          <w:bCs/>
-          <w:kern w:val="0"/>
-          <w:sz w:val="22"/>
-          <w:szCs w:val="22"/>
-          <w14:ligatures w14:val="none"/>
-        </w:rPr>
-        <w:t>ref_model</w:t>
-      </w:r>
-      <w:proofErr w:type="spellEnd"/>
-      <w:r>
-        <w:rPr>
-          <w:rFonts w:ascii="Helvetica" w:eastAsia="Times New Roman" w:hAnsi="Helvetica" w:cs="Arial"/>
-          <w:bCs/>
-          <w:kern w:val="0"/>
-          <w:sz w:val="22"/>
-          <w:szCs w:val="22"/>
-          <w14:ligatures w14:val="none"/>
-        </w:rPr>
-        <w:t xml:space="preserve"> also creates a summary for the same prompt. The system calculates the difference between the two outputs and if the active output is too different from the reference model, it will apply a penalty. Essentially, it forces the active model to chase the non-toxic reward. Without the reference model, </w:t>
-      </w:r>
-      <w:r>
-        <w:rPr>
-          <w:rFonts w:ascii="Helvetica" w:eastAsia="Times New Roman" w:hAnsi="Helvetica" w:cs="Arial"/>
-          <w:bCs/>
-          <w:kern w:val="0"/>
-          <w:sz w:val="22"/>
-          <w:szCs w:val="22"/>
-          <w14:ligatures w14:val="none"/>
-        </w:rPr>
-        <w:t>the active model would basically forget how to summarize dialogues and give weird outputs.</w:t>
-      </w:r>
+          <w:kern w:val="0"/>
+          <w14:ligatures w14:val="none"/>
+        </w:rPr>
+      </w:pPr>
     </w:p>
     <w:p>
       <w:pPr>
@@ -4657,79 +3350,6 @@
           <w14:ligatures w14:val="none"/>
         </w:rPr>
       </w:pPr>
-      <w:r>
-        <w:rPr>
-          <w:rFonts w:ascii="Helvetica" w:eastAsia="Times New Roman" w:hAnsi="Helvetica" w:cs="Helvetica"/>
-          <w:kern w:val="0"/>
-          <w:sz w:val="22"/>
-          <w:szCs w:val="22"/>
-          <w14:ligatures w14:val="none"/>
-        </w:rPr>
-        <w:t xml:space="preserve">This lab </w:t>
-      </w:r>
-      <w:r>
-        <w:rPr>
-          <w:rFonts w:ascii="Helvetica" w:eastAsia="Times New Roman" w:hAnsi="Helvetica" w:cs="Helvetica"/>
-          <w:kern w:val="0"/>
-          <w:sz w:val="22"/>
-          <w:szCs w:val="22"/>
-          <w14:ligatures w14:val="none"/>
-        </w:rPr>
-        <w:t xml:space="preserve">demonstrated that SFT using techniques like </w:t>
-      </w:r>
-      <w:proofErr w:type="spellStart"/>
-      <w:r>
-        <w:rPr>
-          <w:rFonts w:ascii="Helvetica" w:eastAsia="Times New Roman" w:hAnsi="Helvetica" w:cs="Helvetica"/>
-          <w:kern w:val="0"/>
-          <w:sz w:val="22"/>
-          <w:szCs w:val="22"/>
-          <w14:ligatures w14:val="none"/>
-        </w:rPr>
-        <w:t>LoRA</w:t>
-      </w:r>
-      <w:proofErr w:type="spellEnd"/>
-      <w:r>
-        <w:rPr>
-          <w:rFonts w:ascii="Helvetica" w:eastAsia="Times New Roman" w:hAnsi="Helvetica" w:cs="Helvetica"/>
-          <w:kern w:val="0"/>
-          <w:sz w:val="22"/>
-          <w:szCs w:val="22"/>
-          <w14:ligatures w14:val="none"/>
-        </w:rPr>
-        <w:t xml:space="preserve"> can rapidly improve a base model’s summarization skills as shown by the results above.</w:t>
-      </w:r>
-      <w:r>
-        <w:rPr>
-          <w:rFonts w:ascii="Helvetica" w:eastAsia="Times New Roman" w:hAnsi="Helvetica" w:cs="Helvetica"/>
-          <w:kern w:val="0"/>
-          <w:sz w:val="22"/>
-          <w:szCs w:val="22"/>
-          <w14:ligatures w14:val="none"/>
-        </w:rPr>
-        <w:t xml:space="preserve"> Using RLHF for behavioral alignment showed that the PPO </w:t>
-      </w:r>
-      <w:r>
-        <w:rPr>
-          <w:rFonts w:ascii="Helvetica" w:eastAsia="Times New Roman" w:hAnsi="Helvetica" w:cs="Helvetica"/>
-          <w:kern w:val="0"/>
-          <w:sz w:val="22"/>
-          <w:szCs w:val="22"/>
-          <w14:ligatures w14:val="none"/>
-        </w:rPr>
-        <w:t xml:space="preserve">pipeline requires us to specify between CPU and GPU usage (although this might be something I have done on my end – unsure). Another lesson learned is regarding the reference model, it is critical to keep the active model anchored to prevent forgetting during reward </w:t>
-      </w:r>
-      <w:r>
-        <w:rPr>
-          <w:rFonts w:ascii="Helvetica" w:eastAsia="Times New Roman" w:hAnsi="Helvetica" w:cs="Helvetica"/>
-          <w:kern w:val="0"/>
-          <w:sz w:val="22"/>
-          <w:szCs w:val="22"/>
-          <w14:ligatures w14:val="none"/>
-        </w:rPr>
-        <w:lastRenderedPageBreak/>
-        <w:t>optimization. My counterintuitive toxicity results proved that the model works as expected and this lab is perfect for testing these techniques but a better model would require more datasets and even more steps (instead of my 250 max steps) to yield a better result.</w:t>
-      </w:r>
     </w:p>
     <w:sectPr>
       <w:pgSz w:w="12240" w:h="15840"/>
@@ -4833,6 +3453,95 @@
     </w:lvl>
   </w:abstractNum>
   <w:abstractNum w:abstractNumId="1" w15:restartNumberingAfterBreak="0">
+    <w:nsid w:val="38055EC8"/>
+    <w:multiLevelType w:val="hybridMultilevel"/>
+    <w:tmpl w:val="E00CD76E"/>
+    <w:lvl w:ilvl="0" w:tplc="0409000F">
+      <w:start w:val="1"/>
+      <w:numFmt w:val="decimal"/>
+      <w:lvlText w:val="%1."/>
+      <w:lvlJc w:val="left"/>
+      <w:pPr>
+        <w:ind w:left="720" w:hanging="360"/>
+      </w:pPr>
+      <w:rPr>
+        <w:rFonts w:hint="default"/>
+      </w:rPr>
+    </w:lvl>
+    <w:lvl w:ilvl="1" w:tplc="04090019" w:tentative="1">
+      <w:start w:val="1"/>
+      <w:numFmt w:val="lowerLetter"/>
+      <w:lvlText w:val="%2."/>
+      <w:lvlJc w:val="left"/>
+      <w:pPr>
+        <w:ind w:left="1440" w:hanging="360"/>
+      </w:pPr>
+    </w:lvl>
+    <w:lvl w:ilvl="2" w:tplc="0409001B" w:tentative="1">
+      <w:start w:val="1"/>
+      <w:numFmt w:val="lowerRoman"/>
+      <w:lvlText w:val="%3."/>
+      <w:lvlJc w:val="right"/>
+      <w:pPr>
+        <w:ind w:left="2160" w:hanging="180"/>
+      </w:pPr>
+    </w:lvl>
+    <w:lvl w:ilvl="3" w:tplc="0409000F" w:tentative="1">
+      <w:start w:val="1"/>
+      <w:numFmt w:val="decimal"/>
+      <w:lvlText w:val="%4."/>
+      <w:lvlJc w:val="left"/>
+      <w:pPr>
+        <w:ind w:left="2880" w:hanging="360"/>
+      </w:pPr>
+    </w:lvl>
+    <w:lvl w:ilvl="4" w:tplc="04090019" w:tentative="1">
+      <w:start w:val="1"/>
+      <w:numFmt w:val="lowerLetter"/>
+      <w:lvlText w:val="%5."/>
+      <w:lvlJc w:val="left"/>
+      <w:pPr>
+        <w:ind w:left="3600" w:hanging="360"/>
+      </w:pPr>
+    </w:lvl>
+    <w:lvl w:ilvl="5" w:tplc="0409001B" w:tentative="1">
+      <w:start w:val="1"/>
+      <w:numFmt w:val="lowerRoman"/>
+      <w:lvlText w:val="%6."/>
+      <w:lvlJc w:val="right"/>
+      <w:pPr>
+        <w:ind w:left="4320" w:hanging="180"/>
+      </w:pPr>
+    </w:lvl>
+    <w:lvl w:ilvl="6" w:tplc="0409000F" w:tentative="1">
+      <w:start w:val="1"/>
+      <w:numFmt w:val="decimal"/>
+      <w:lvlText w:val="%7."/>
+      <w:lvlJc w:val="left"/>
+      <w:pPr>
+        <w:ind w:left="5040" w:hanging="360"/>
+      </w:pPr>
+    </w:lvl>
+    <w:lvl w:ilvl="7" w:tplc="04090019" w:tentative="1">
+      <w:start w:val="1"/>
+      <w:numFmt w:val="lowerLetter"/>
+      <w:lvlText w:val="%8."/>
+      <w:lvlJc w:val="left"/>
+      <w:pPr>
+        <w:ind w:left="5760" w:hanging="360"/>
+      </w:pPr>
+    </w:lvl>
+    <w:lvl w:ilvl="8" w:tplc="0409001B" w:tentative="1">
+      <w:start w:val="1"/>
+      <w:numFmt w:val="lowerRoman"/>
+      <w:lvlText w:val="%9."/>
+      <w:lvlJc w:val="right"/>
+      <w:pPr>
+        <w:ind w:left="6480" w:hanging="180"/>
+      </w:pPr>
+    </w:lvl>
+  </w:abstractNum>
+  <w:abstractNum w:abstractNumId="2" w15:restartNumberingAfterBreak="0">
     <w:nsid w:val="3C41545C"/>
     <w:multiLevelType w:val="hybridMultilevel"/>
     <w:tmpl w:val="670E0158"/>
@@ -4921,7 +3630,7 @@
       </w:pPr>
     </w:lvl>
   </w:abstractNum>
-  <w:abstractNum w:abstractNumId="2" w15:restartNumberingAfterBreak="0">
+  <w:abstractNum w:abstractNumId="3" w15:restartNumberingAfterBreak="0">
     <w:nsid w:val="40D021C9"/>
     <w:multiLevelType w:val="hybridMultilevel"/>
     <w:tmpl w:val="89F04F5C"/>
@@ -5010,7 +3719,7 @@
       </w:pPr>
     </w:lvl>
   </w:abstractNum>
-  <w:abstractNum w:abstractNumId="3" w15:restartNumberingAfterBreak="0">
+  <w:abstractNum w:abstractNumId="4" w15:restartNumberingAfterBreak="0">
     <w:nsid w:val="489426BF"/>
     <w:multiLevelType w:val="multilevel"/>
     <w:tmpl w:val="B8AE83B0"/>
@@ -5103,7 +3812,7 @@
       </w:pPr>
     </w:lvl>
   </w:abstractNum>
-  <w:abstractNum w:abstractNumId="4" w15:restartNumberingAfterBreak="0">
+  <w:abstractNum w:abstractNumId="5" w15:restartNumberingAfterBreak="0">
     <w:nsid w:val="4A543B9C"/>
     <w:multiLevelType w:val="hybridMultilevel"/>
     <w:tmpl w:val="E2265602"/>
@@ -5192,7 +3901,7 @@
       </w:pPr>
     </w:lvl>
   </w:abstractNum>
-  <w:abstractNum w:abstractNumId="5" w15:restartNumberingAfterBreak="0">
+  <w:abstractNum w:abstractNumId="6" w15:restartNumberingAfterBreak="0">
     <w:nsid w:val="62535D6F"/>
     <w:multiLevelType w:val="hybridMultilevel"/>
     <w:tmpl w:val="B888A836"/>
@@ -5281,7 +3990,7 @@
       </w:pPr>
     </w:lvl>
   </w:abstractNum>
-  <w:abstractNum w:abstractNumId="6" w15:restartNumberingAfterBreak="0">
+  <w:abstractNum w:abstractNumId="7" w15:restartNumberingAfterBreak="0">
     <w:nsid w:val="75AB7459"/>
     <w:multiLevelType w:val="hybridMultilevel"/>
     <w:tmpl w:val="B0264BC2"/>
@@ -5370,8 +4079,94 @@
       </w:pPr>
     </w:lvl>
   </w:abstractNum>
+  <w:abstractNum w:abstractNumId="8" w15:restartNumberingAfterBreak="0">
+    <w:nsid w:val="7F8D268A"/>
+    <w:multiLevelType w:val="hybridMultilevel"/>
+    <w:tmpl w:val="6D48DD66"/>
+    <w:lvl w:ilvl="0" w:tplc="0409000F">
+      <w:start w:val="1"/>
+      <w:numFmt w:val="decimal"/>
+      <w:lvlText w:val="%1."/>
+      <w:lvlJc w:val="left"/>
+      <w:pPr>
+        <w:ind w:left="720" w:hanging="360"/>
+      </w:pPr>
+    </w:lvl>
+    <w:lvl w:ilvl="1" w:tplc="04090019" w:tentative="1">
+      <w:start w:val="1"/>
+      <w:numFmt w:val="lowerLetter"/>
+      <w:lvlText w:val="%2."/>
+      <w:lvlJc w:val="left"/>
+      <w:pPr>
+        <w:ind w:left="1440" w:hanging="360"/>
+      </w:pPr>
+    </w:lvl>
+    <w:lvl w:ilvl="2" w:tplc="0409001B" w:tentative="1">
+      <w:start w:val="1"/>
+      <w:numFmt w:val="lowerRoman"/>
+      <w:lvlText w:val="%3."/>
+      <w:lvlJc w:val="right"/>
+      <w:pPr>
+        <w:ind w:left="2160" w:hanging="180"/>
+      </w:pPr>
+    </w:lvl>
+    <w:lvl w:ilvl="3" w:tplc="0409000F" w:tentative="1">
+      <w:start w:val="1"/>
+      <w:numFmt w:val="decimal"/>
+      <w:lvlText w:val="%4."/>
+      <w:lvlJc w:val="left"/>
+      <w:pPr>
+        <w:ind w:left="2880" w:hanging="360"/>
+      </w:pPr>
+    </w:lvl>
+    <w:lvl w:ilvl="4" w:tplc="04090019" w:tentative="1">
+      <w:start w:val="1"/>
+      <w:numFmt w:val="lowerLetter"/>
+      <w:lvlText w:val="%5."/>
+      <w:lvlJc w:val="left"/>
+      <w:pPr>
+        <w:ind w:left="3600" w:hanging="360"/>
+      </w:pPr>
+    </w:lvl>
+    <w:lvl w:ilvl="5" w:tplc="0409001B" w:tentative="1">
+      <w:start w:val="1"/>
+      <w:numFmt w:val="lowerRoman"/>
+      <w:lvlText w:val="%6."/>
+      <w:lvlJc w:val="right"/>
+      <w:pPr>
+        <w:ind w:left="4320" w:hanging="180"/>
+      </w:pPr>
+    </w:lvl>
+    <w:lvl w:ilvl="6" w:tplc="0409000F" w:tentative="1">
+      <w:start w:val="1"/>
+      <w:numFmt w:val="decimal"/>
+      <w:lvlText w:val="%7."/>
+      <w:lvlJc w:val="left"/>
+      <w:pPr>
+        <w:ind w:left="5040" w:hanging="360"/>
+      </w:pPr>
+    </w:lvl>
+    <w:lvl w:ilvl="7" w:tplc="04090019" w:tentative="1">
+      <w:start w:val="1"/>
+      <w:numFmt w:val="lowerLetter"/>
+      <w:lvlText w:val="%8."/>
+      <w:lvlJc w:val="left"/>
+      <w:pPr>
+        <w:ind w:left="5760" w:hanging="360"/>
+      </w:pPr>
+    </w:lvl>
+    <w:lvl w:ilvl="8" w:tplc="0409001B" w:tentative="1">
+      <w:start w:val="1"/>
+      <w:numFmt w:val="lowerRoman"/>
+      <w:lvlText w:val="%9."/>
+      <w:lvlJc w:val="right"/>
+      <w:pPr>
+        <w:ind w:left="6480" w:hanging="180"/>
+      </w:pPr>
+    </w:lvl>
+  </w:abstractNum>
   <w:num w:numId="1" w16cid:durableId="405153824">
-    <w:abstractNumId w:val="3"/>
+    <w:abstractNumId w:val="4"/>
     <w:lvlOverride w:ilvl="0"/>
     <w:lvlOverride w:ilvl="1">
       <w:startOverride w:val="1"/>
@@ -5399,22 +4194,28 @@
     </w:lvlOverride>
   </w:num>
   <w:num w:numId="2" w16cid:durableId="2104493308">
+    <w:abstractNumId w:val="7"/>
+  </w:num>
+  <w:num w:numId="3" w16cid:durableId="10954226">
+    <w:abstractNumId w:val="5"/>
+  </w:num>
+  <w:num w:numId="4" w16cid:durableId="1718774012">
     <w:abstractNumId w:val="6"/>
   </w:num>
-  <w:num w:numId="3" w16cid:durableId="10954226">
-    <w:abstractNumId w:val="4"/>
-  </w:num>
-  <w:num w:numId="4" w16cid:durableId="1718774012">
-    <w:abstractNumId w:val="5"/>
-  </w:num>
   <w:num w:numId="5" w16cid:durableId="1497264026">
-    <w:abstractNumId w:val="2"/>
+    <w:abstractNumId w:val="3"/>
   </w:num>
   <w:num w:numId="6" w16cid:durableId="425542998">
-    <w:abstractNumId w:val="1"/>
+    <w:abstractNumId w:val="2"/>
   </w:num>
   <w:num w:numId="7" w16cid:durableId="1080712042">
     <w:abstractNumId w:val="0"/>
+  </w:num>
+  <w:num w:numId="8" w16cid:durableId="1935629174">
+    <w:abstractNumId w:val="8"/>
+  </w:num>
+  <w:num w:numId="9" w16cid:durableId="1522432387">
+    <w:abstractNumId w:val="1"/>
   </w:num>
 </w:numbering>
 </file>

</xml_diff>

<commit_message>
adding initial part 3 stuff
</commit_message>
<xml_diff>
--- a/Lab3/Lab3_LimY.docx
+++ b/Lab3/Lab3_LimY.docx
@@ -609,18 +609,16 @@
         </w:rPr>
         <w:t xml:space="preserve">This part shows the differences in model behavior and importance of tuning RAG parameters. Falcon and Gemma are different where Falcon </w:t>
       </w:r>
-      <w:proofErr w:type="gramStart"/>
-      <w:r>
-        <w:rPr>
-          <w:rFonts w:ascii="Helvetica" w:eastAsia="Calibri" w:hAnsi="Helvetica" w:cs="Times New Roman"/>
-          <w:kern w:val="0"/>
-          <w:sz w:val="22"/>
-          <w:szCs w:val="22"/>
-          <w14:ligatures w14:val="none"/>
-        </w:rPr>
-        <w:t>as</w:t>
-      </w:r>
-      <w:proofErr w:type="gramEnd"/>
+      <w:r>
+        <w:rPr>
+          <w:rFonts w:ascii="Helvetica" w:eastAsia="Calibri" w:hAnsi="Helvetica" w:cs="Times New Roman"/>
+          <w:kern w:val="0"/>
+          <w:sz w:val="22"/>
+          <w:szCs w:val="22"/>
+          <w14:ligatures w14:val="none"/>
+        </w:rPr>
+        <w:t>is</w:t>
+      </w:r>
       <w:r>
         <w:rPr>
           <w:rFonts w:ascii="Helvetica" w:eastAsia="Calibri" w:hAnsi="Helvetica" w:cs="Times New Roman"/>
@@ -631,18 +629,16 @@
         </w:rPr>
         <w:t xml:space="preserve"> </w:t>
       </w:r>
-      <w:proofErr w:type="gramStart"/>
-      <w:r>
-        <w:rPr>
-          <w:rFonts w:ascii="Helvetica" w:eastAsia="Calibri" w:hAnsi="Helvetica" w:cs="Times New Roman"/>
-          <w:kern w:val="0"/>
-          <w:sz w:val="22"/>
-          <w:szCs w:val="22"/>
-          <w14:ligatures w14:val="none"/>
-        </w:rPr>
-        <w:t>an</w:t>
-      </w:r>
-      <w:proofErr w:type="gramEnd"/>
+      <w:r>
+        <w:rPr>
+          <w:rFonts w:ascii="Helvetica" w:eastAsia="Calibri" w:hAnsi="Helvetica" w:cs="Times New Roman"/>
+          <w:kern w:val="0"/>
+          <w:sz w:val="22"/>
+          <w:szCs w:val="22"/>
+          <w14:ligatures w14:val="none"/>
+        </w:rPr>
+        <w:t>a</w:t>
+      </w:r>
       <w:r>
         <w:rPr>
           <w:rFonts w:ascii="Helvetica" w:eastAsia="Calibri" w:hAnsi="Helvetica" w:cs="Times New Roman"/>
@@ -653,18 +649,16 @@
         </w:rPr>
         <w:t xml:space="preserve"> helpful assistant </w:t>
       </w:r>
-      <w:proofErr w:type="gramStart"/>
-      <w:r>
-        <w:rPr>
-          <w:rFonts w:ascii="Helvetica" w:eastAsia="Calibri" w:hAnsi="Helvetica" w:cs="Times New Roman"/>
-          <w:kern w:val="0"/>
-          <w:sz w:val="22"/>
-          <w:szCs w:val="22"/>
-          <w14:ligatures w14:val="none"/>
-        </w:rPr>
-        <w:t>where as</w:t>
-      </w:r>
-      <w:proofErr w:type="gramEnd"/>
+      <w:r>
+        <w:rPr>
+          <w:rFonts w:ascii="Helvetica" w:eastAsia="Calibri" w:hAnsi="Helvetica" w:cs="Times New Roman"/>
+          <w:kern w:val="0"/>
+          <w:sz w:val="22"/>
+          <w:szCs w:val="22"/>
+          <w14:ligatures w14:val="none"/>
+        </w:rPr>
+        <w:t>whereas</w:t>
+      </w:r>
       <w:r>
         <w:rPr>
           <w:rFonts w:ascii="Helvetica" w:eastAsia="Calibri" w:hAnsi="Helvetica" w:cs="Times New Roman"/>
@@ -675,18 +669,16 @@
         </w:rPr>
         <w:t xml:space="preserve"> Gemma behaves like a safety assistant. Experiments </w:t>
       </w:r>
-      <w:proofErr w:type="gramStart"/>
-      <w:r>
-        <w:rPr>
-          <w:rFonts w:ascii="Helvetica" w:eastAsia="Calibri" w:hAnsi="Helvetica" w:cs="Times New Roman"/>
-          <w:kern w:val="0"/>
-          <w:sz w:val="22"/>
-          <w:szCs w:val="22"/>
-          <w14:ligatures w14:val="none"/>
-        </w:rPr>
-        <w:t>shows</w:t>
-      </w:r>
-      <w:proofErr w:type="gramEnd"/>
+      <w:r>
+        <w:rPr>
+          <w:rFonts w:ascii="Helvetica" w:eastAsia="Calibri" w:hAnsi="Helvetica" w:cs="Times New Roman"/>
+          <w:kern w:val="0"/>
+          <w:sz w:val="22"/>
+          <w:szCs w:val="22"/>
+          <w14:ligatures w14:val="none"/>
+        </w:rPr>
+        <w:t>show</w:t>
+      </w:r>
       <w:r>
         <w:rPr>
           <w:rFonts w:ascii="Helvetica" w:eastAsia="Calibri" w:hAnsi="Helvetica" w:cs="Times New Roman"/>
@@ -1837,6 +1829,16 @@
         </w:rPr>
         <w:t xml:space="preserve"> – </w:t>
       </w:r>
+      <w:r>
+        <w:rPr>
+          <w:rFonts w:ascii="Helvetica" w:eastAsia="Calibri" w:hAnsi="Helvetica" w:cs="Times New Roman"/>
+          <w:kern w:val="0"/>
+          <w:sz w:val="22"/>
+          <w:szCs w:val="22"/>
+          <w14:ligatures w14:val="none"/>
+        </w:rPr>
+        <w:t>Query 1</w:t>
+      </w:r>
     </w:p>
     <w:p>
       <w:pPr>
@@ -1854,53 +1856,6 @@
     <w:p>
       <w:pPr>
         <w:spacing w:after="0" w:line="240" w:lineRule="auto"/>
-        <w:jc w:val="both"/>
-        <w:rPr>
-          <w:rFonts w:ascii="Helvetica" w:eastAsia="Calibri" w:hAnsi="Helvetica" w:cs="Times New Roman"/>
-          <w:kern w:val="0"/>
-          <w:sz w:val="22"/>
-          <w:szCs w:val="22"/>
-          <w14:ligatures w14:val="none"/>
-        </w:rPr>
-      </w:pPr>
-      <w:r>
-        <w:rPr>
-          <w:rFonts w:ascii="Helvetica" w:eastAsia="Calibri" w:hAnsi="Helvetica" w:cs="Times New Roman"/>
-          <w:b/>
-          <w:kern w:val="0"/>
-          <w:sz w:val="22"/>
-          <w:szCs w:val="22"/>
-          <w14:ligatures w14:val="none"/>
-        </w:rPr>
-        <w:t>Screenshot</w:t>
-      </w:r>
-      <w:r>
-        <w:rPr>
-          <w:rFonts w:ascii="Helvetica" w:eastAsia="Calibri" w:hAnsi="Helvetica" w:cs="Times New Roman"/>
-          <w:kern w:val="0"/>
-          <w:sz w:val="22"/>
-          <w:szCs w:val="22"/>
-          <w14:ligatures w14:val="none"/>
-        </w:rPr>
-        <w:t xml:space="preserve"> – </w:t>
-      </w:r>
-    </w:p>
-    <w:p>
-      <w:pPr>
-        <w:spacing w:after="0" w:line="240" w:lineRule="auto"/>
-        <w:jc w:val="both"/>
-        <w:rPr>
-          <w:rFonts w:ascii="Helvetica" w:eastAsia="Calibri" w:hAnsi="Helvetica" w:cs="Times New Roman"/>
-          <w:kern w:val="0"/>
-          <w:sz w:val="22"/>
-          <w:szCs w:val="22"/>
-          <w14:ligatures w14:val="none"/>
-        </w:rPr>
-      </w:pPr>
-    </w:p>
-    <w:p>
-      <w:pPr>
-        <w:spacing w:after="0" w:line="240" w:lineRule="auto"/>
         <w:jc w:val="center"/>
         <w:rPr>
           <w:rFonts w:ascii="Helvetica" w:eastAsia="Calibri" w:hAnsi="Helvetica" w:cs="Times New Roman"/>
@@ -1910,6 +1865,50 @@
           <w14:ligatures w14:val="none"/>
         </w:rPr>
       </w:pPr>
+      <w:r>
+        <w:rPr>
+          <w:rFonts w:ascii="Helvetica" w:eastAsia="Calibri" w:hAnsi="Helvetica" w:cs="Times New Roman"/>
+          <w:kern w:val="0"/>
+          <w:sz w:val="22"/>
+          <w:szCs w:val="22"/>
+          <w14:ligatures w14:val="none"/>
+        </w:rPr>
+        <w:drawing>
+          <wp:inline distT="0" distB="0" distL="0" distR="0" wp14:anchorId="7AF75B14" wp14:editId="7BA7519D">
+            <wp:extent cx="5943600" cy="986155"/>
+            <wp:effectExtent l="0" t="0" r="0" b="4445"/>
+            <wp:docPr id="736333875" name="Picture 1"/>
+            <wp:cNvGraphicFramePr>
+              <a:graphicFrameLocks xmlns:a="http://schemas.openxmlformats.org/drawingml/2006/main" noChangeAspect="1"/>
+            </wp:cNvGraphicFramePr>
+            <a:graphic xmlns:a="http://schemas.openxmlformats.org/drawingml/2006/main">
+              <a:graphicData uri="http://schemas.openxmlformats.org/drawingml/2006/picture">
+                <pic:pic xmlns:pic="http://schemas.openxmlformats.org/drawingml/2006/picture">
+                  <pic:nvPicPr>
+                    <pic:cNvPr id="736333875" name=""/>
+                    <pic:cNvPicPr/>
+                  </pic:nvPicPr>
+                  <pic:blipFill>
+                    <a:blip r:embed="rId12"/>
+                    <a:stretch>
+                      <a:fillRect/>
+                    </a:stretch>
+                  </pic:blipFill>
+                  <pic:spPr>
+                    <a:xfrm>
+                      <a:off x="0" y="0"/>
+                      <a:ext cx="5943600" cy="986155"/>
+                    </a:xfrm>
+                    <a:prstGeom prst="rect">
+                      <a:avLst/>
+                    </a:prstGeom>
+                  </pic:spPr>
+                </pic:pic>
+              </a:graphicData>
+            </a:graphic>
+          </wp:inline>
+        </w:drawing>
+      </w:r>
     </w:p>
     <w:p>
       <w:pPr>
@@ -1970,6 +1969,16 @@
         </w:rPr>
         <w:t xml:space="preserve"> – </w:t>
       </w:r>
+      <w:r>
+        <w:rPr>
+          <w:rFonts w:ascii="Helvetica" w:eastAsia="Calibri" w:hAnsi="Helvetica" w:cs="Times New Roman"/>
+          <w:kern w:val="0"/>
+          <w:sz w:val="22"/>
+          <w:szCs w:val="22"/>
+          <w14:ligatures w14:val="none"/>
+        </w:rPr>
+        <w:t>Query 2</w:t>
+      </w:r>
     </w:p>
     <w:p>
       <w:pPr>
@@ -1987,53 +1996,6 @@
     <w:p>
       <w:pPr>
         <w:spacing w:after="0" w:line="240" w:lineRule="auto"/>
-        <w:jc w:val="both"/>
-        <w:rPr>
-          <w:rFonts w:ascii="Helvetica" w:eastAsia="Calibri" w:hAnsi="Helvetica" w:cs="Times New Roman"/>
-          <w:kern w:val="0"/>
-          <w:sz w:val="22"/>
-          <w:szCs w:val="22"/>
-          <w14:ligatures w14:val="none"/>
-        </w:rPr>
-      </w:pPr>
-      <w:r>
-        <w:rPr>
-          <w:rFonts w:ascii="Helvetica" w:eastAsia="Calibri" w:hAnsi="Helvetica" w:cs="Times New Roman"/>
-          <w:b/>
-          <w:kern w:val="0"/>
-          <w:sz w:val="22"/>
-          <w:szCs w:val="22"/>
-          <w14:ligatures w14:val="none"/>
-        </w:rPr>
-        <w:t>Screenshot</w:t>
-      </w:r>
-      <w:r>
-        <w:rPr>
-          <w:rFonts w:ascii="Helvetica" w:eastAsia="Calibri" w:hAnsi="Helvetica" w:cs="Times New Roman"/>
-          <w:kern w:val="0"/>
-          <w:sz w:val="22"/>
-          <w:szCs w:val="22"/>
-          <w14:ligatures w14:val="none"/>
-        </w:rPr>
-        <w:t xml:space="preserve"> – </w:t>
-      </w:r>
-    </w:p>
-    <w:p>
-      <w:pPr>
-        <w:spacing w:after="0" w:line="240" w:lineRule="auto"/>
-        <w:jc w:val="both"/>
-        <w:rPr>
-          <w:rFonts w:ascii="Helvetica" w:eastAsia="Calibri" w:hAnsi="Helvetica" w:cs="Times New Roman"/>
-          <w:kern w:val="0"/>
-          <w:sz w:val="22"/>
-          <w:szCs w:val="22"/>
-          <w14:ligatures w14:val="none"/>
-        </w:rPr>
-      </w:pPr>
-    </w:p>
-    <w:p>
-      <w:pPr>
-        <w:spacing w:after="0" w:line="240" w:lineRule="auto"/>
         <w:jc w:val="center"/>
         <w:rPr>
           <w:rFonts w:ascii="Helvetica" w:eastAsia="Calibri" w:hAnsi="Helvetica" w:cs="Times New Roman"/>
@@ -2043,6 +2005,50 @@
           <w14:ligatures w14:val="none"/>
         </w:rPr>
       </w:pPr>
+      <w:r>
+        <w:rPr>
+          <w:rFonts w:ascii="Helvetica" w:eastAsia="Calibri" w:hAnsi="Helvetica" w:cs="Times New Roman"/>
+          <w:kern w:val="0"/>
+          <w:sz w:val="22"/>
+          <w:szCs w:val="22"/>
+          <w14:ligatures w14:val="none"/>
+        </w:rPr>
+        <w:drawing>
+          <wp:inline distT="0" distB="0" distL="0" distR="0" wp14:anchorId="514B479F" wp14:editId="5E917819">
+            <wp:extent cx="5943600" cy="4165600"/>
+            <wp:effectExtent l="0" t="0" r="0" b="6350"/>
+            <wp:docPr id="1186122759" name="Picture 1"/>
+            <wp:cNvGraphicFramePr>
+              <a:graphicFrameLocks xmlns:a="http://schemas.openxmlformats.org/drawingml/2006/main" noChangeAspect="1"/>
+            </wp:cNvGraphicFramePr>
+            <a:graphic xmlns:a="http://schemas.openxmlformats.org/drawingml/2006/main">
+              <a:graphicData uri="http://schemas.openxmlformats.org/drawingml/2006/picture">
+                <pic:pic xmlns:pic="http://schemas.openxmlformats.org/drawingml/2006/picture">
+                  <pic:nvPicPr>
+                    <pic:cNvPr id="1186122759" name=""/>
+                    <pic:cNvPicPr/>
+                  </pic:nvPicPr>
+                  <pic:blipFill>
+                    <a:blip r:embed="rId13"/>
+                    <a:stretch>
+                      <a:fillRect/>
+                    </a:stretch>
+                  </pic:blipFill>
+                  <pic:spPr>
+                    <a:xfrm>
+                      <a:off x="0" y="0"/>
+                      <a:ext cx="5943600" cy="4165600"/>
+                    </a:xfrm>
+                    <a:prstGeom prst="rect">
+                      <a:avLst/>
+                    </a:prstGeom>
+                  </pic:spPr>
+                </pic:pic>
+              </a:graphicData>
+            </a:graphic>
+          </wp:inline>
+        </w:drawing>
+      </w:r>
     </w:p>
     <w:p>
       <w:pPr>
@@ -2091,6 +2097,16 @@
         </w:rPr>
         <w:t xml:space="preserve"> – </w:t>
       </w:r>
+      <w:r>
+        <w:rPr>
+          <w:rFonts w:ascii="Helvetica" w:eastAsia="Calibri" w:hAnsi="Helvetica" w:cs="Times New Roman"/>
+          <w:kern w:val="0"/>
+          <w:sz w:val="22"/>
+          <w:szCs w:val="22"/>
+          <w14:ligatures w14:val="none"/>
+        </w:rPr>
+        <w:t>Query 3</w:t>
+      </w:r>
     </w:p>
     <w:p>
       <w:pPr>
@@ -2108,53 +2124,6 @@
     <w:p>
       <w:pPr>
         <w:spacing w:after="0" w:line="240" w:lineRule="auto"/>
-        <w:jc w:val="both"/>
-        <w:rPr>
-          <w:rFonts w:ascii="Helvetica" w:eastAsia="Calibri" w:hAnsi="Helvetica" w:cs="Times New Roman"/>
-          <w:kern w:val="0"/>
-          <w:sz w:val="22"/>
-          <w:szCs w:val="22"/>
-          <w14:ligatures w14:val="none"/>
-        </w:rPr>
-      </w:pPr>
-      <w:r>
-        <w:rPr>
-          <w:rFonts w:ascii="Helvetica" w:eastAsia="Calibri" w:hAnsi="Helvetica" w:cs="Times New Roman"/>
-          <w:b/>
-          <w:kern w:val="0"/>
-          <w:sz w:val="22"/>
-          <w:szCs w:val="22"/>
-          <w14:ligatures w14:val="none"/>
-        </w:rPr>
-        <w:t>Screenshot</w:t>
-      </w:r>
-      <w:r>
-        <w:rPr>
-          <w:rFonts w:ascii="Helvetica" w:eastAsia="Calibri" w:hAnsi="Helvetica" w:cs="Times New Roman"/>
-          <w:kern w:val="0"/>
-          <w:sz w:val="22"/>
-          <w:szCs w:val="22"/>
-          <w14:ligatures w14:val="none"/>
-        </w:rPr>
-        <w:t xml:space="preserve"> – </w:t>
-      </w:r>
-    </w:p>
-    <w:p>
-      <w:pPr>
-        <w:spacing w:after="0" w:line="240" w:lineRule="auto"/>
-        <w:jc w:val="both"/>
-        <w:rPr>
-          <w:rFonts w:ascii="Helvetica" w:eastAsia="Calibri" w:hAnsi="Helvetica" w:cs="Times New Roman"/>
-          <w:kern w:val="0"/>
-          <w:sz w:val="22"/>
-          <w:szCs w:val="22"/>
-          <w14:ligatures w14:val="none"/>
-        </w:rPr>
-      </w:pPr>
-    </w:p>
-    <w:p>
-      <w:pPr>
-        <w:spacing w:after="0" w:line="240" w:lineRule="auto"/>
         <w:jc w:val="center"/>
         <w:rPr>
           <w:rFonts w:ascii="Helvetica" w:eastAsia="Calibri" w:hAnsi="Helvetica" w:cs="Times New Roman"/>
@@ -2164,485 +2133,50 @@
           <w14:ligatures w14:val="none"/>
         </w:rPr>
       </w:pPr>
-    </w:p>
-    <w:p>
-      <w:pPr>
-        <w:spacing w:after="0" w:line="240" w:lineRule="auto"/>
-        <w:rPr>
-          <w:rFonts w:ascii="Helvetica" w:eastAsia="Calibri" w:hAnsi="Helvetica" w:cs="Times New Roman"/>
-          <w:kern w:val="0"/>
-          <w:sz w:val="22"/>
-          <w:szCs w:val="22"/>
-          <w14:ligatures w14:val="none"/>
-        </w:rPr>
-      </w:pPr>
-    </w:p>
-    <w:p>
-      <w:pPr>
-        <w:rPr>
-          <w:rFonts w:ascii="Helvetica" w:eastAsia="Calibri" w:hAnsi="Helvetica" w:cs="Times New Roman"/>
-          <w:b/>
-          <w:bCs/>
-          <w:kern w:val="0"/>
-          <w:sz w:val="22"/>
-          <w:szCs w:val="22"/>
-          <w14:ligatures w14:val="none"/>
-        </w:rPr>
-      </w:pPr>
-      <w:r>
-        <w:rPr>
-          <w:rFonts w:ascii="Helvetica" w:eastAsia="Calibri" w:hAnsi="Helvetica" w:cs="Times New Roman"/>
-          <w:b/>
-          <w:bCs/>
-          <w:kern w:val="0"/>
-          <w:sz w:val="22"/>
-          <w:szCs w:val="22"/>
-          <w14:ligatures w14:val="none"/>
-        </w:rPr>
-        <w:br w:type="page"/>
-      </w:r>
-    </w:p>
-    <w:p>
-      <w:pPr>
-        <w:spacing w:after="0" w:line="240" w:lineRule="auto"/>
-        <w:jc w:val="both"/>
-        <w:rPr>
-          <w:rFonts w:ascii="Helvetica" w:eastAsia="Calibri" w:hAnsi="Helvetica" w:cs="Times New Roman"/>
-          <w:kern w:val="0"/>
-          <w:sz w:val="22"/>
-          <w:szCs w:val="22"/>
-          <w14:ligatures w14:val="none"/>
-        </w:rPr>
-      </w:pPr>
-      <w:r>
-        <w:rPr>
-          <w:rFonts w:ascii="Helvetica" w:eastAsia="Calibri" w:hAnsi="Helvetica" w:cs="Times New Roman"/>
-          <w:b/>
-          <w:bCs/>
+      <w:r>
+        <w:rPr>
+          <w:rFonts w:ascii="Helvetica" w:eastAsia="Calibri" w:hAnsi="Helvetica" w:cs="Times New Roman"/>
           <w:kern w:val="0"/>
           <w:sz w:val="22"/>
           <w:szCs w:val="22"/>
           <w14:ligatures w14:val="none"/>
         </w:rPr>
         <w:lastRenderedPageBreak/>
-        <w:t>Description</w:t>
-      </w:r>
-      <w:r>
-        <w:rPr>
-          <w:rFonts w:ascii="Helvetica" w:eastAsia="Calibri" w:hAnsi="Helvetica" w:cs="Times New Roman"/>
-          <w:kern w:val="0"/>
-          <w:sz w:val="22"/>
-          <w:szCs w:val="22"/>
-          <w14:ligatures w14:val="none"/>
-        </w:rPr>
-        <w:t xml:space="preserve"> – </w:t>
-      </w:r>
-    </w:p>
-    <w:p>
-      <w:pPr>
-        <w:spacing w:after="0" w:line="240" w:lineRule="auto"/>
-        <w:jc w:val="both"/>
-        <w:rPr>
-          <w:rFonts w:ascii="Helvetica" w:eastAsia="Calibri" w:hAnsi="Helvetica" w:cs="Times New Roman"/>
-          <w:kern w:val="0"/>
-          <w:sz w:val="22"/>
-          <w:szCs w:val="22"/>
-          <w14:ligatures w14:val="none"/>
-        </w:rPr>
-      </w:pPr>
-    </w:p>
-    <w:p>
-      <w:pPr>
-        <w:spacing w:after="0" w:line="240" w:lineRule="auto"/>
-        <w:jc w:val="both"/>
-        <w:rPr>
-          <w:rFonts w:ascii="Helvetica" w:eastAsia="Calibri" w:hAnsi="Helvetica" w:cs="Times New Roman"/>
-          <w:kern w:val="0"/>
-          <w:sz w:val="22"/>
-          <w:szCs w:val="22"/>
-          <w14:ligatures w14:val="none"/>
-        </w:rPr>
-      </w:pPr>
-      <w:r>
-        <w:rPr>
-          <w:rFonts w:ascii="Helvetica" w:eastAsia="Calibri" w:hAnsi="Helvetica" w:cs="Times New Roman"/>
-          <w:b/>
-          <w:kern w:val="0"/>
-          <w:sz w:val="22"/>
-          <w:szCs w:val="22"/>
-          <w14:ligatures w14:val="none"/>
-        </w:rPr>
-        <w:t>Screenshot</w:t>
-      </w:r>
-      <w:r>
-        <w:rPr>
-          <w:rFonts w:ascii="Helvetica" w:eastAsia="Calibri" w:hAnsi="Helvetica" w:cs="Times New Roman"/>
-          <w:kern w:val="0"/>
-          <w:sz w:val="22"/>
-          <w:szCs w:val="22"/>
-          <w14:ligatures w14:val="none"/>
-        </w:rPr>
-        <w:t xml:space="preserve"> – </w:t>
-      </w:r>
-    </w:p>
-    <w:p>
-      <w:pPr>
-        <w:spacing w:after="0" w:line="240" w:lineRule="auto"/>
-        <w:jc w:val="both"/>
-        <w:rPr>
-          <w:rFonts w:ascii="Helvetica" w:eastAsia="Calibri" w:hAnsi="Helvetica" w:cs="Times New Roman"/>
-          <w:kern w:val="0"/>
-          <w:sz w:val="22"/>
-          <w:szCs w:val="22"/>
-          <w14:ligatures w14:val="none"/>
-        </w:rPr>
-      </w:pPr>
-    </w:p>
-    <w:p>
-      <w:pPr>
-        <w:spacing w:after="0" w:line="240" w:lineRule="auto"/>
-        <w:jc w:val="center"/>
-        <w:rPr>
-          <w:rFonts w:ascii="Helvetica" w:eastAsia="Calibri" w:hAnsi="Helvetica" w:cs="Times New Roman"/>
-          <w:kern w:val="0"/>
-          <w:sz w:val="22"/>
-          <w:szCs w:val="22"/>
-          <w14:ligatures w14:val="none"/>
-        </w:rPr>
-      </w:pPr>
-    </w:p>
-    <w:p>
-      <w:pPr>
-        <w:spacing w:after="0" w:line="240" w:lineRule="auto"/>
-        <w:rPr>
-          <w:rFonts w:ascii="Helvetica" w:eastAsia="Calibri" w:hAnsi="Helvetica" w:cs="Times New Roman"/>
-          <w:kern w:val="0"/>
-          <w:sz w:val="22"/>
-          <w:szCs w:val="22"/>
-          <w14:ligatures w14:val="none"/>
-        </w:rPr>
-      </w:pPr>
-    </w:p>
-    <w:p>
-      <w:pPr>
-        <w:spacing w:after="0" w:line="240" w:lineRule="auto"/>
-        <w:jc w:val="both"/>
-        <w:rPr>
-          <w:rFonts w:ascii="Helvetica" w:eastAsia="Calibri" w:hAnsi="Helvetica" w:cs="Times New Roman"/>
-          <w:kern w:val="0"/>
-          <w:sz w:val="22"/>
-          <w:szCs w:val="22"/>
-          <w14:ligatures w14:val="none"/>
-        </w:rPr>
-      </w:pPr>
-      <w:r>
-        <w:rPr>
-          <w:rFonts w:ascii="Helvetica" w:eastAsia="Calibri" w:hAnsi="Helvetica" w:cs="Times New Roman"/>
-          <w:b/>
-          <w:bCs/>
-          <w:kern w:val="0"/>
-          <w:sz w:val="22"/>
-          <w:szCs w:val="22"/>
-          <w14:ligatures w14:val="none"/>
-        </w:rPr>
-        <w:t>Description</w:t>
-      </w:r>
-      <w:r>
-        <w:rPr>
-          <w:rFonts w:ascii="Helvetica" w:eastAsia="Calibri" w:hAnsi="Helvetica" w:cs="Times New Roman"/>
-          <w:kern w:val="0"/>
-          <w:sz w:val="22"/>
-          <w:szCs w:val="22"/>
-          <w14:ligatures w14:val="none"/>
-        </w:rPr>
-        <w:t xml:space="preserve"> – </w:t>
-      </w:r>
-    </w:p>
-    <w:p>
-      <w:pPr>
-        <w:spacing w:after="0" w:line="240" w:lineRule="auto"/>
-        <w:jc w:val="both"/>
-        <w:rPr>
-          <w:rFonts w:ascii="Helvetica" w:eastAsia="Calibri" w:hAnsi="Helvetica" w:cs="Times New Roman"/>
-          <w:kern w:val="0"/>
-          <w:sz w:val="22"/>
-          <w:szCs w:val="22"/>
-          <w14:ligatures w14:val="none"/>
-        </w:rPr>
-      </w:pPr>
-    </w:p>
-    <w:p>
-      <w:pPr>
-        <w:spacing w:after="0" w:line="240" w:lineRule="auto"/>
-        <w:jc w:val="both"/>
-        <w:rPr>
-          <w:rFonts w:ascii="Helvetica" w:eastAsia="Calibri" w:hAnsi="Helvetica" w:cs="Times New Roman"/>
-          <w:kern w:val="0"/>
-          <w:sz w:val="22"/>
-          <w:szCs w:val="22"/>
-          <w14:ligatures w14:val="none"/>
-        </w:rPr>
-      </w:pPr>
-      <w:r>
-        <w:rPr>
-          <w:rFonts w:ascii="Helvetica" w:eastAsia="Calibri" w:hAnsi="Helvetica" w:cs="Times New Roman"/>
-          <w:b/>
-          <w:kern w:val="0"/>
-          <w:sz w:val="22"/>
-          <w:szCs w:val="22"/>
-          <w14:ligatures w14:val="none"/>
-        </w:rPr>
-        <w:t>Screenshot</w:t>
-      </w:r>
-      <w:r>
-        <w:rPr>
-          <w:rFonts w:ascii="Helvetica" w:eastAsia="Calibri" w:hAnsi="Helvetica" w:cs="Times New Roman"/>
-          <w:kern w:val="0"/>
-          <w:sz w:val="22"/>
-          <w:szCs w:val="22"/>
-          <w14:ligatures w14:val="none"/>
-        </w:rPr>
-        <w:t xml:space="preserve"> – </w:t>
-      </w:r>
-    </w:p>
-    <w:p>
-      <w:pPr>
-        <w:spacing w:after="0" w:line="240" w:lineRule="auto"/>
-        <w:jc w:val="both"/>
-        <w:rPr>
-          <w:rFonts w:ascii="Helvetica" w:eastAsia="Calibri" w:hAnsi="Helvetica" w:cs="Times New Roman"/>
-          <w:kern w:val="0"/>
-          <w:sz w:val="22"/>
-          <w:szCs w:val="22"/>
-          <w14:ligatures w14:val="none"/>
-        </w:rPr>
-      </w:pPr>
-    </w:p>
-    <w:p>
-      <w:pPr>
-        <w:spacing w:after="0" w:line="240" w:lineRule="auto"/>
-        <w:jc w:val="center"/>
-        <w:rPr>
-          <w:rFonts w:ascii="Helvetica" w:eastAsia="Calibri" w:hAnsi="Helvetica" w:cs="Times New Roman"/>
-          <w:kern w:val="0"/>
-          <w:sz w:val="22"/>
-          <w:szCs w:val="22"/>
-          <w14:ligatures w14:val="none"/>
-        </w:rPr>
-      </w:pPr>
-    </w:p>
-    <w:p>
-      <w:pPr>
-        <w:spacing w:after="0" w:line="240" w:lineRule="auto"/>
-        <w:rPr>
-          <w:rFonts w:ascii="Helvetica" w:eastAsia="Calibri" w:hAnsi="Helvetica" w:cs="Times New Roman"/>
-          <w:kern w:val="0"/>
-          <w:sz w:val="22"/>
-          <w:szCs w:val="22"/>
-          <w14:ligatures w14:val="none"/>
-        </w:rPr>
-      </w:pPr>
-    </w:p>
-    <w:p>
-      <w:pPr>
-        <w:spacing w:after="0" w:line="240" w:lineRule="auto"/>
-        <w:jc w:val="both"/>
-        <w:rPr>
-          <w:rFonts w:ascii="Helvetica" w:eastAsia="Calibri" w:hAnsi="Helvetica" w:cs="Times New Roman"/>
-          <w:kern w:val="0"/>
-          <w:sz w:val="22"/>
-          <w:szCs w:val="22"/>
-          <w14:ligatures w14:val="none"/>
-        </w:rPr>
-      </w:pPr>
-      <w:r>
-        <w:rPr>
-          <w:rFonts w:ascii="Helvetica" w:eastAsia="Calibri" w:hAnsi="Helvetica" w:cs="Times New Roman"/>
-          <w:b/>
-          <w:bCs/>
-          <w:kern w:val="0"/>
-          <w:sz w:val="22"/>
-          <w:szCs w:val="22"/>
-          <w14:ligatures w14:val="none"/>
-        </w:rPr>
-        <w:t>Description</w:t>
-      </w:r>
-      <w:r>
-        <w:rPr>
-          <w:rFonts w:ascii="Helvetica" w:eastAsia="Calibri" w:hAnsi="Helvetica" w:cs="Times New Roman"/>
-          <w:kern w:val="0"/>
-          <w:sz w:val="22"/>
-          <w:szCs w:val="22"/>
-          <w14:ligatures w14:val="none"/>
-        </w:rPr>
-        <w:t xml:space="preserve"> – </w:t>
-      </w:r>
-    </w:p>
-    <w:p>
-      <w:pPr>
-        <w:spacing w:after="0" w:line="240" w:lineRule="auto"/>
-        <w:jc w:val="both"/>
-        <w:rPr>
-          <w:rFonts w:ascii="Helvetica" w:eastAsia="Calibri" w:hAnsi="Helvetica" w:cs="Times New Roman"/>
-          <w:kern w:val="0"/>
-          <w:sz w:val="22"/>
-          <w:szCs w:val="22"/>
-          <w14:ligatures w14:val="none"/>
-        </w:rPr>
-      </w:pPr>
-    </w:p>
-    <w:p>
-      <w:pPr>
-        <w:spacing w:after="0" w:line="240" w:lineRule="auto"/>
-        <w:jc w:val="both"/>
-        <w:rPr>
-          <w:rFonts w:ascii="Helvetica" w:eastAsia="Calibri" w:hAnsi="Helvetica" w:cs="Times New Roman"/>
-          <w:kern w:val="0"/>
-          <w:sz w:val="22"/>
-          <w:szCs w:val="22"/>
-          <w14:ligatures w14:val="none"/>
-        </w:rPr>
-      </w:pPr>
-      <w:r>
-        <w:rPr>
-          <w:rFonts w:ascii="Helvetica" w:eastAsia="Calibri" w:hAnsi="Helvetica" w:cs="Times New Roman"/>
-          <w:b/>
-          <w:kern w:val="0"/>
-          <w:sz w:val="22"/>
-          <w:szCs w:val="22"/>
-          <w14:ligatures w14:val="none"/>
-        </w:rPr>
-        <w:t>Screenshot</w:t>
-      </w:r>
-      <w:r>
-        <w:rPr>
-          <w:rFonts w:ascii="Helvetica" w:eastAsia="Calibri" w:hAnsi="Helvetica" w:cs="Times New Roman"/>
-          <w:kern w:val="0"/>
-          <w:sz w:val="22"/>
-          <w:szCs w:val="22"/>
-          <w14:ligatures w14:val="none"/>
-        </w:rPr>
-        <w:t xml:space="preserve"> – </w:t>
-      </w:r>
-    </w:p>
-    <w:p>
-      <w:pPr>
-        <w:spacing w:after="0" w:line="240" w:lineRule="auto"/>
-        <w:jc w:val="both"/>
-        <w:rPr>
-          <w:rFonts w:ascii="Helvetica" w:eastAsia="Calibri" w:hAnsi="Helvetica" w:cs="Times New Roman"/>
-          <w:kern w:val="0"/>
-          <w:sz w:val="22"/>
-          <w:szCs w:val="22"/>
-          <w14:ligatures w14:val="none"/>
-        </w:rPr>
-      </w:pPr>
-    </w:p>
-    <w:p>
-      <w:pPr>
-        <w:spacing w:after="0" w:line="240" w:lineRule="auto"/>
-        <w:jc w:val="center"/>
-        <w:rPr>
-          <w:rFonts w:ascii="Helvetica" w:eastAsia="Calibri" w:hAnsi="Helvetica" w:cs="Times New Roman"/>
-          <w:kern w:val="0"/>
-          <w:sz w:val="22"/>
-          <w:szCs w:val="22"/>
-          <w14:ligatures w14:val="none"/>
-        </w:rPr>
-      </w:pPr>
-    </w:p>
-    <w:p>
-      <w:pPr>
-        <w:spacing w:after="0" w:line="240" w:lineRule="auto"/>
-        <w:rPr>
-          <w:rFonts w:ascii="Helvetica" w:eastAsia="Calibri" w:hAnsi="Helvetica" w:cs="Times New Roman"/>
-          <w:kern w:val="0"/>
-          <w:sz w:val="22"/>
-          <w:szCs w:val="22"/>
-          <w14:ligatures w14:val="none"/>
-        </w:rPr>
-      </w:pPr>
-    </w:p>
-    <w:p>
-      <w:pPr>
-        <w:spacing w:after="0" w:line="240" w:lineRule="auto"/>
-        <w:jc w:val="both"/>
-        <w:rPr>
-          <w:rFonts w:ascii="Helvetica" w:eastAsia="Calibri" w:hAnsi="Helvetica" w:cs="Times New Roman"/>
-          <w:kern w:val="0"/>
-          <w:sz w:val="22"/>
-          <w:szCs w:val="22"/>
-          <w14:ligatures w14:val="none"/>
-        </w:rPr>
-      </w:pPr>
-      <w:r>
-        <w:rPr>
-          <w:rFonts w:ascii="Helvetica" w:eastAsia="Calibri" w:hAnsi="Helvetica" w:cs="Times New Roman"/>
-          <w:b/>
-          <w:bCs/>
-          <w:kern w:val="0"/>
-          <w:sz w:val="22"/>
-          <w:szCs w:val="22"/>
-          <w14:ligatures w14:val="none"/>
-        </w:rPr>
-        <w:t>Description</w:t>
-      </w:r>
-      <w:r>
-        <w:rPr>
-          <w:rFonts w:ascii="Helvetica" w:eastAsia="Calibri" w:hAnsi="Helvetica" w:cs="Times New Roman"/>
-          <w:kern w:val="0"/>
-          <w:sz w:val="22"/>
-          <w:szCs w:val="22"/>
-          <w14:ligatures w14:val="none"/>
-        </w:rPr>
-        <w:t xml:space="preserve"> – </w:t>
-      </w:r>
-    </w:p>
-    <w:p>
-      <w:pPr>
-        <w:spacing w:after="0" w:line="240" w:lineRule="auto"/>
-        <w:jc w:val="both"/>
-        <w:rPr>
-          <w:rFonts w:ascii="Helvetica" w:eastAsia="Calibri" w:hAnsi="Helvetica" w:cs="Times New Roman"/>
-          <w:kern w:val="0"/>
-          <w:sz w:val="22"/>
-          <w:szCs w:val="22"/>
-          <w14:ligatures w14:val="none"/>
-        </w:rPr>
-      </w:pPr>
-    </w:p>
-    <w:p>
-      <w:pPr>
-        <w:spacing w:after="0" w:line="240" w:lineRule="auto"/>
-        <w:jc w:val="both"/>
-        <w:rPr>
-          <w:rFonts w:ascii="Helvetica" w:eastAsia="Calibri" w:hAnsi="Helvetica" w:cs="Times New Roman"/>
-          <w:kern w:val="0"/>
-          <w:sz w:val="22"/>
-          <w:szCs w:val="22"/>
-          <w14:ligatures w14:val="none"/>
-        </w:rPr>
-      </w:pPr>
-      <w:r>
-        <w:rPr>
-          <w:rFonts w:ascii="Helvetica" w:eastAsia="Calibri" w:hAnsi="Helvetica" w:cs="Times New Roman"/>
-          <w:b/>
-          <w:kern w:val="0"/>
-          <w:sz w:val="22"/>
-          <w:szCs w:val="22"/>
-          <w14:ligatures w14:val="none"/>
-        </w:rPr>
-        <w:t>Screenshot</w:t>
-      </w:r>
-      <w:r>
-        <w:rPr>
-          <w:rFonts w:ascii="Helvetica" w:eastAsia="Calibri" w:hAnsi="Helvetica" w:cs="Times New Roman"/>
-          <w:kern w:val="0"/>
-          <w:sz w:val="22"/>
-          <w:szCs w:val="22"/>
-          <w14:ligatures w14:val="none"/>
-        </w:rPr>
-        <w:t xml:space="preserve"> – </w:t>
+        <w:drawing>
+          <wp:inline distT="0" distB="0" distL="0" distR="0" wp14:anchorId="7CC11991" wp14:editId="7821FA8F">
+            <wp:extent cx="5943600" cy="1329055"/>
+            <wp:effectExtent l="0" t="0" r="0" b="4445"/>
+            <wp:docPr id="1258220955" name="Picture 1"/>
+            <wp:cNvGraphicFramePr>
+              <a:graphicFrameLocks xmlns:a="http://schemas.openxmlformats.org/drawingml/2006/main" noChangeAspect="1"/>
+            </wp:cNvGraphicFramePr>
+            <a:graphic xmlns:a="http://schemas.openxmlformats.org/drawingml/2006/main">
+              <a:graphicData uri="http://schemas.openxmlformats.org/drawingml/2006/picture">
+                <pic:pic xmlns:pic="http://schemas.openxmlformats.org/drawingml/2006/picture">
+                  <pic:nvPicPr>
+                    <pic:cNvPr id="1258220955" name=""/>
+                    <pic:cNvPicPr/>
+                  </pic:nvPicPr>
+                  <pic:blipFill>
+                    <a:blip r:embed="rId14"/>
+                    <a:stretch>
+                      <a:fillRect/>
+                    </a:stretch>
+                  </pic:blipFill>
+                  <pic:spPr>
+                    <a:xfrm>
+                      <a:off x="0" y="0"/>
+                      <a:ext cx="5943600" cy="1329055"/>
+                    </a:xfrm>
+                    <a:prstGeom prst="rect">
+                      <a:avLst/>
+                    </a:prstGeom>
+                  </pic:spPr>
+                </pic:pic>
+              </a:graphicData>
+            </a:graphic>
+          </wp:inline>
+        </w:drawing>
       </w:r>
     </w:p>
     <w:p>
@@ -2892,103 +2426,7 @@
           <w:szCs w:val="22"/>
           <w14:ligatures w14:val="none"/>
         </w:rPr>
-        <w:t>Based on the code, the APIs used for chunking the documents is “</w:t>
-      </w:r>
-      <w:proofErr w:type="spellStart"/>
-      <w:r>
-        <w:rPr>
-          <w:rFonts w:ascii="Helvetica" w:eastAsia="Times New Roman" w:hAnsi="Helvetica" w:cs="Helvetica"/>
-          <w:bCs/>
-          <w:kern w:val="0"/>
-          <w:sz w:val="22"/>
-          <w:szCs w:val="22"/>
-          <w14:ligatures w14:val="none"/>
-        </w:rPr>
-        <w:t>RecursiveCharacterTextSplitter</w:t>
-      </w:r>
-      <w:proofErr w:type="spellEnd"/>
-      <w:r>
-        <w:rPr>
-          <w:rFonts w:ascii="Helvetica" w:eastAsia="Times New Roman" w:hAnsi="Helvetica" w:cs="Helvetica"/>
-          <w:bCs/>
-          <w:kern w:val="0"/>
-          <w:sz w:val="22"/>
-          <w:szCs w:val="22"/>
-          <w14:ligatures w14:val="none"/>
-        </w:rPr>
-        <w:t xml:space="preserve">” inside the </w:t>
-      </w:r>
-      <w:proofErr w:type="spellStart"/>
-      <w:r>
-        <w:rPr>
-          <w:rFonts w:ascii="Helvetica" w:eastAsia="Times New Roman" w:hAnsi="Helvetica" w:cs="Helvetica"/>
-          <w:bCs/>
-          <w:kern w:val="0"/>
-          <w:sz w:val="22"/>
-          <w:szCs w:val="22"/>
-          <w14:ligatures w14:val="none"/>
-        </w:rPr>
-        <w:t>build_vectordb</w:t>
-      </w:r>
-      <w:proofErr w:type="spellEnd"/>
-      <w:r>
-        <w:rPr>
-          <w:rFonts w:ascii="Helvetica" w:eastAsia="Times New Roman" w:hAnsi="Helvetica" w:cs="Helvetica"/>
-          <w:bCs/>
-          <w:kern w:val="0"/>
-          <w:sz w:val="22"/>
-          <w:szCs w:val="22"/>
-          <w14:ligatures w14:val="none"/>
-        </w:rPr>
-        <w:t xml:space="preserve"> method. It uses two arguments, “</w:t>
-      </w:r>
-      <w:proofErr w:type="spellStart"/>
-      <w:r>
-        <w:rPr>
-          <w:rFonts w:ascii="Helvetica" w:eastAsia="Times New Roman" w:hAnsi="Helvetica" w:cs="Helvetica"/>
-          <w:bCs/>
-          <w:kern w:val="0"/>
-          <w:sz w:val="22"/>
-          <w:szCs w:val="22"/>
-          <w14:ligatures w14:val="none"/>
-        </w:rPr>
-        <w:t>chunk_size</w:t>
-      </w:r>
-      <w:proofErr w:type="spellEnd"/>
-      <w:r>
-        <w:rPr>
-          <w:rFonts w:ascii="Helvetica" w:eastAsia="Times New Roman" w:hAnsi="Helvetica" w:cs="Helvetica"/>
-          <w:bCs/>
-          <w:kern w:val="0"/>
-          <w:sz w:val="22"/>
-          <w:szCs w:val="22"/>
-          <w14:ligatures w14:val="none"/>
-        </w:rPr>
-        <w:t>” and “</w:t>
-      </w:r>
-      <w:proofErr w:type="spellStart"/>
-      <w:r>
-        <w:rPr>
-          <w:rFonts w:ascii="Helvetica" w:eastAsia="Times New Roman" w:hAnsi="Helvetica" w:cs="Helvetica"/>
-          <w:bCs/>
-          <w:kern w:val="0"/>
-          <w:sz w:val="22"/>
-          <w:szCs w:val="22"/>
-          <w14:ligatures w14:val="none"/>
-        </w:rPr>
-        <w:t>chunk_overlap</w:t>
-      </w:r>
-      <w:proofErr w:type="spellEnd"/>
-      <w:r>
-        <w:rPr>
-          <w:rFonts w:ascii="Helvetica" w:eastAsia="Times New Roman" w:hAnsi="Helvetica" w:cs="Helvetica"/>
-          <w:bCs/>
-          <w:kern w:val="0"/>
-          <w:sz w:val="22"/>
-          <w:szCs w:val="22"/>
-          <w14:ligatures w14:val="none"/>
-        </w:rPr>
-        <w:t>”.</w:t>
+        <w:t>Based on the code, the APIs used for chunking the documents is “RecursiveCharacterTextSplitter” inside the build_vectordb method. It uses two arguments, “chunk_size” and “chunk_overlap”.</w:t>
       </w:r>
     </w:p>
     <w:p>
@@ -3033,31 +2471,7 @@
           <w:szCs w:val="22"/>
           <w14:ligatures w14:val="none"/>
         </w:rPr>
-        <w:t xml:space="preserve">The </w:t>
-      </w:r>
-      <w:proofErr w:type="spellStart"/>
-      <w:r>
-        <w:rPr>
-          <w:rFonts w:ascii="Helvetica" w:eastAsia="Times New Roman" w:hAnsi="Helvetica" w:cs="Helvetica"/>
-          <w:bCs/>
-          <w:kern w:val="0"/>
-          <w:sz w:val="22"/>
-          <w:szCs w:val="22"/>
-          <w14:ligatures w14:val="none"/>
-        </w:rPr>
-        <w:t>top_k</w:t>
-      </w:r>
-      <w:proofErr w:type="spellEnd"/>
-      <w:r>
-        <w:rPr>
-          <w:rFonts w:ascii="Helvetica" w:eastAsia="Times New Roman" w:hAnsi="Helvetica" w:cs="Helvetica"/>
-          <w:bCs/>
-          <w:kern w:val="0"/>
-          <w:sz w:val="22"/>
-          <w:szCs w:val="22"/>
-          <w14:ligatures w14:val="none"/>
-        </w:rPr>
-        <w:t xml:space="preserve"> controls the number of document chunks to be retrieved from the database. So, increasing the parameter will provide the </w:t>
+        <w:t xml:space="preserve">The top_k controls the number of document chunks to be retrieved from the database. So, increasing the parameter will provide the </w:t>
       </w:r>
       <w:r>
         <w:rPr>
@@ -3145,55 +2559,7 @@
           <w:szCs w:val="22"/>
           <w14:ligatures w14:val="none"/>
         </w:rPr>
-        <w:t xml:space="preserve">We should choose the </w:t>
-      </w:r>
-      <w:proofErr w:type="spellStart"/>
-      <w:r>
-        <w:rPr>
-          <w:rFonts w:ascii="Helvetica" w:eastAsia="Times New Roman" w:hAnsi="Helvetica" w:cs="Helvetica"/>
-          <w:bCs/>
-          <w:kern w:val="0"/>
-          <w:sz w:val="22"/>
-          <w:szCs w:val="22"/>
-          <w14:ligatures w14:val="none"/>
-        </w:rPr>
-        <w:t>PythonCodeTextSplitter</w:t>
-      </w:r>
-      <w:proofErr w:type="spellEnd"/>
-      <w:r>
-        <w:rPr>
-          <w:rFonts w:ascii="Helvetica" w:eastAsia="Times New Roman" w:hAnsi="Helvetica" w:cs="Helvetica"/>
-          <w:bCs/>
-          <w:kern w:val="0"/>
-          <w:sz w:val="22"/>
-          <w:szCs w:val="22"/>
-          <w14:ligatures w14:val="none"/>
-        </w:rPr>
-        <w:t xml:space="preserve"> for python programs. It is inherited from </w:t>
-      </w:r>
-      <w:proofErr w:type="spellStart"/>
-      <w:r>
-        <w:rPr>
-          <w:rFonts w:ascii="Helvetica" w:eastAsia="Times New Roman" w:hAnsi="Helvetica" w:cs="Helvetica"/>
-          <w:bCs/>
-          <w:kern w:val="0"/>
-          <w:sz w:val="22"/>
-          <w:szCs w:val="22"/>
-          <w14:ligatures w14:val="none"/>
-        </w:rPr>
-        <w:t>RecursiveCharacterTextSplitter</w:t>
-      </w:r>
-      <w:proofErr w:type="spellEnd"/>
-      <w:r>
-        <w:rPr>
-          <w:rFonts w:ascii="Helvetica" w:eastAsia="Times New Roman" w:hAnsi="Helvetica" w:cs="Helvetica"/>
-          <w:bCs/>
-          <w:kern w:val="0"/>
-          <w:sz w:val="22"/>
-          <w:szCs w:val="22"/>
-          <w14:ligatures w14:val="none"/>
-        </w:rPr>
-        <w:t>.</w:t>
+        <w:t>We should choose the PythonCodeTextSplitter for python programs. It is inherited from RecursiveCharacterTextSplitter.</w:t>
       </w:r>
     </w:p>
     <w:p>

</xml_diff>

<commit_message>
adding final doc for lab 3
</commit_message>
<xml_diff>
--- a/Lab3/Lab3_LimY.docx
+++ b/Lab3/Lab3_LimY.docx
@@ -403,6 +403,16 @@
           <w14:ligatures w14:val="none"/>
         </w:rPr>
       </w:pPr>
+      <w:r>
+        <w:rPr>
+          <w:rFonts w:ascii="Helvetica" w:eastAsia="Calibri" w:hAnsi="Helvetica" w:cs="Times New Roman"/>
+          <w:kern w:val="0"/>
+          <w:sz w:val="22"/>
+          <w:szCs w:val="22"/>
+          <w14:ligatures w14:val="none"/>
+        </w:rPr>
+        <w:t>The objective of this lab was to practice the usage of Retrieval Augmented Generation (RAG) and to understand as well as experiment with an AI agent using LangChain.</w:t>
+      </w:r>
     </w:p>
     <w:p>
       <w:pPr>
@@ -486,6 +496,26 @@
           <w14:ligatures w14:val="none"/>
         </w:rPr>
       </w:pPr>
+      <w:r>
+        <w:rPr>
+          <w:rFonts w:ascii="Helvetica" w:eastAsia="Calibri" w:hAnsi="Helvetica" w:cs="Times New Roman"/>
+          <w:kern w:val="0"/>
+          <w:sz w:val="22"/>
+          <w:szCs w:val="22"/>
+          <w14:ligatures w14:val="none"/>
+        </w:rPr>
+        <w:t>For this lab, code changes were applied to sections required to implement requirements set by the lab. In part 1 of the lab, I only made changes to add a new model (gemma) to the code, so the user is able to select and modify parameters for both Falcon and Gemma. In part 2 of the lab, I added code under TODO sections to implement the new RAG tool and LangChain APIs to provide answers to the queries using the AI agent.</w:t>
+      </w:r>
+      <w:r>
+        <w:rPr>
+          <w:rFonts w:ascii="Helvetica" w:eastAsia="Calibri" w:hAnsi="Helvetica" w:cs="Times New Roman"/>
+          <w:kern w:val="0"/>
+          <w:sz w:val="22"/>
+          <w:szCs w:val="22"/>
+          <w14:ligatures w14:val="none"/>
+        </w:rPr>
+        <w:t xml:space="preserve"> Not much changed from the original code other than new code and modifying lines of codes to debug and get the models to work correctly.</w:t>
+      </w:r>
     </w:p>
     <w:p>
       <w:pPr>
@@ -1782,6 +1812,16 @@
         </w:rPr>
         <w:t xml:space="preserve"> </w:t>
       </w:r>
+      <w:r>
+        <w:rPr>
+          <w:rFonts w:ascii="Helvetica" w:eastAsia="Calibri" w:hAnsi="Helvetica" w:cs="Times New Roman"/>
+          <w:kern w:val="0"/>
+          <w:sz w:val="22"/>
+          <w:szCs w:val="22"/>
+          <w14:ligatures w14:val="none"/>
+        </w:rPr>
+        <w:t>Shown below are the results to the three queries in part 2 of the lab. Given the correct implementation of the TODO codes in this part, the results below show the agent retrieving data and passing the value into a calculator tool and queried the DeepSeek-R1 research paper to extract the model limitations.</w:t>
+      </w:r>
     </w:p>
     <w:p>
       <w:pPr>
@@ -2262,7 +2302,7 @@
     <w:p>
       <w:pPr>
         <w:spacing w:after="0" w:line="276" w:lineRule="auto"/>
-        <w:ind w:firstLine="360"/>
+        <w:ind w:left="360" w:firstLine="360"/>
         <w:jc w:val="both"/>
         <w:rPr>
           <w:rFonts w:ascii="Helvetica" w:eastAsia="Times New Roman" w:hAnsi="Helvetica" w:cs="Helvetica"/>
@@ -2280,7 +2320,7 @@
           <w:szCs w:val="22"/>
           <w14:ligatures w14:val="none"/>
         </w:rPr>
-        <w:t xml:space="preserve"> </w:t>
+        <w:t>A few problems occurred in part 1 of this lab where I was trying to implement gemma into the code. The problem was if you ran the code using Falcon first, Gemma would not work and vice versa. So, I added the inference method with an if/else statement to see if either one was loaded in first, if so, bundle the system instructions directly into the user prompt. Another problem in part 1 was similar in that I added a previous_model tracking variable to tell the model to reload the tokenizer whenever the model is swapped. This might be a elementary implementation but it works as it is. Part 2 had problems with HuggingFaceEmbeddings where it provided an “AccelerateError”. The fix was to add this line “model_kwargs={‘device’: ‘cpu’}” and tell the code where to run. Another problem was the create_agent function causing an error it should not have caused since it was the newer version of what I used in the code. Essentially, the fix was to revert back to the older version of create_agent, which was “create_react_agent”.</w:t>
       </w:r>
     </w:p>
     <w:p>
@@ -2651,6 +2691,106 @@
           <w14:ligatures w14:val="none"/>
         </w:rPr>
       </w:pPr>
+      <w:r>
+        <w:rPr>
+          <w:rFonts w:ascii="Helvetica" w:eastAsia="Times New Roman" w:hAnsi="Helvetica" w:cs="Arial"/>
+          <w:kern w:val="0"/>
+          <w14:ligatures w14:val="none"/>
+        </w:rPr>
+        <w:t>Chat models for LangChain tools are just a type of language model that communicates using a message interface versus just text strings. We the ChatOpenAI model in our example because it is used to connect to jetstream’s custom server.</w:t>
+      </w:r>
+    </w:p>
+    <w:p>
+      <w:pPr>
+        <w:pStyle w:val="ListParagraph"/>
+        <w:spacing w:after="0" w:line="240" w:lineRule="auto"/>
+        <w:rPr>
+          <w:rFonts w:ascii="Helvetica" w:eastAsia="Times New Roman" w:hAnsi="Helvetica" w:cs="Arial"/>
+          <w:kern w:val="0"/>
+          <w14:ligatures w14:val="none"/>
+        </w:rPr>
+      </w:pPr>
+      <w:r>
+        <w:rPr>
+          <w:rFonts w:ascii="Helvetica" w:eastAsia="Times New Roman" w:hAnsi="Helvetica" w:cs="Arial"/>
+          <w:kern w:val="0"/>
+          <w14:ligatures w14:val="none"/>
+        </w:rPr>
+        <w:lastRenderedPageBreak/>
+        <w:t xml:space="preserve"> </w:t>
+      </w:r>
+    </w:p>
+    <w:p>
+      <w:pPr>
+        <w:pStyle w:val="ListParagraph"/>
+        <w:numPr>
+          <w:ilvl w:val="0"/>
+          <w:numId w:val="9"/>
+        </w:numPr>
+        <w:spacing w:after="0" w:line="240" w:lineRule="auto"/>
+        <w:rPr>
+          <w:rFonts w:ascii="Helvetica" w:eastAsia="Times New Roman" w:hAnsi="Helvetica" w:cs="Arial"/>
+          <w:kern w:val="0"/>
+          <w14:ligatures w14:val="none"/>
+        </w:rPr>
+      </w:pPr>
+      <w:r>
+        <w:rPr>
+          <w:rFonts w:ascii="Helvetica" w:eastAsia="Times New Roman" w:hAnsi="Helvetica" w:cs="Arial"/>
+          <w:kern w:val="0"/>
+          <w14:ligatures w14:val="none"/>
+        </w:rPr>
+        <w:t>Wikipedia_tool acts as the general knowledge for the agent. Calculator is used to compute mathematical expressions. Magic_function just takes an integer and adds 2 to it. Query_deepseek_r1_paper retrieves the information from a pdf regarding deepseek-r1 model.</w:t>
+      </w:r>
+      <w:r>
+        <w:rPr>
+          <w:rFonts w:ascii="Helvetica" w:eastAsia="Times New Roman" w:hAnsi="Helvetica" w:cs="Arial"/>
+          <w:kern w:val="0"/>
+          <w14:ligatures w14:val="none"/>
+        </w:rPr>
+        <w:t xml:space="preserve"> If Wikipedia_tool were to be removed, the agent would fail query 1 and 2 because the agent needs to look up the facts related to those queries in Wikipedia</w:t>
+      </w:r>
+      <w:r>
+        <w:rPr>
+          <w:rFonts w:ascii="Helvetica" w:eastAsia="Times New Roman" w:hAnsi="Helvetica" w:cs="Arial"/>
+          <w:kern w:val="0"/>
+          <w14:ligatures w14:val="none"/>
+        </w:rPr>
+        <w:t xml:space="preserve"> along with its usage of magic_function. It would basically either hallucinate or say it can’t search.</w:t>
+      </w:r>
+    </w:p>
+    <w:p>
+      <w:pPr>
+        <w:pStyle w:val="ListParagraph"/>
+        <w:rPr>
+          <w:rFonts w:ascii="Helvetica" w:eastAsia="Times New Roman" w:hAnsi="Helvetica" w:cs="Arial"/>
+          <w:kern w:val="0"/>
+          <w14:ligatures w14:val="none"/>
+        </w:rPr>
+      </w:pPr>
+    </w:p>
+    <w:p>
+      <w:pPr>
+        <w:pStyle w:val="ListParagraph"/>
+        <w:numPr>
+          <w:ilvl w:val="0"/>
+          <w:numId w:val="9"/>
+        </w:numPr>
+        <w:spacing w:after="0" w:line="240" w:lineRule="auto"/>
+        <w:rPr>
+          <w:rFonts w:ascii="Helvetica" w:eastAsia="Times New Roman" w:hAnsi="Helvetica" w:cs="Arial"/>
+          <w:kern w:val="0"/>
+          <w14:ligatures w14:val="none"/>
+        </w:rPr>
+      </w:pPr>
+      <w:r>
+        <w:rPr>
+          <w:rFonts w:ascii="Helvetica" w:eastAsia="Times New Roman" w:hAnsi="Helvetica" w:cs="Arial"/>
+          <w:kern w:val="0"/>
+          <w14:ligatures w14:val="none"/>
+        </w:rPr>
+        <w:t>Essential steps would be to initialize the model, get all of the tools needed for the model, create and initialize the agent, and execute the agent.</w:t>
+      </w:r>
     </w:p>
     <w:p>
       <w:pPr>
@@ -2702,6 +2842,26 @@
           <w14:ligatures w14:val="none"/>
         </w:rPr>
       </w:pPr>
+    </w:p>
+    <w:p>
+      <w:pPr>
+        <w:spacing w:after="0" w:line="240" w:lineRule="auto"/>
+        <w:ind w:left="360" w:firstLine="360"/>
+        <w:jc w:val="both"/>
+        <w:rPr>
+          <w:rFonts w:ascii="Helvetica" w:eastAsia="Times New Roman" w:hAnsi="Helvetica" w:cs="Helvetica"/>
+          <w:kern w:val="0"/>
+          <w14:ligatures w14:val="none"/>
+        </w:rPr>
+      </w:pPr>
+      <w:r>
+        <w:rPr>
+          <w:rFonts w:ascii="Helvetica" w:eastAsia="Times New Roman" w:hAnsi="Helvetica" w:cs="Helvetica"/>
+          <w:kern w:val="0"/>
+          <w14:ligatures w14:val="none"/>
+        </w:rPr>
+        <w:t>There was a lot of information in this lab to analyze and learn about. Some core things I learned were how to balance Top K and Chunk Sizes, different model behaviors and nuances, and how to develop AI in general. In summary, I believe LLMs are not that great at exact math and or updated niche facts, so by adding a ReAct agent, the LLM will have access to up to date information and different calculation tools.</w:t>
+      </w:r>
     </w:p>
     <w:p>
       <w:pPr>

</xml_diff>